<commit_message>
docs: improve Glyph design
</commit_message>
<xml_diff>
--- a/GDD.docx
+++ b/GDD.docx
@@ -1126,8 +1126,6 @@
             <w:jc w:val="center"/>
             <w:textAlignment w:val="auto"/>
           </w:pPr>
-          <w:bookmarkStart w:id="50" w:name="_GoBack"/>
-          <w:bookmarkEnd w:id="50"/>
           <w:r>
             <w:rPr>
               <w:rFonts w:ascii="宋体" w:hAnsi="宋体" w:eastAsia="宋体"/>
@@ -1156,7 +1154,7 @@
             <w:fldChar w:fldCharType="begin"/>
           </w:r>
           <w:r>
-            <w:instrText xml:space="preserve"> HYPERLINK \l _Toc8194 </w:instrText>
+            <w:instrText xml:space="preserve"> HYPERLINK \l _Toc8529 </w:instrText>
           </w:r>
           <w:r>
             <w:fldChar w:fldCharType="separate"/>
@@ -1176,7 +1174,7 @@
             <w:fldChar w:fldCharType="begin"/>
           </w:r>
           <w:r>
-            <w:instrText xml:space="preserve"> PAGEREF _Toc8194 \h </w:instrText>
+            <w:instrText xml:space="preserve"> PAGEREF _Toc8529 \h </w:instrText>
           </w:r>
           <w:r>
             <w:fldChar w:fldCharType="separate"/>
@@ -1202,7 +1200,7 @@
             <w:fldChar w:fldCharType="begin"/>
           </w:r>
           <w:r>
-            <w:instrText xml:space="preserve"> HYPERLINK \l _Toc25150 </w:instrText>
+            <w:instrText xml:space="preserve"> HYPERLINK \l _Toc6707 </w:instrText>
           </w:r>
           <w:r>
             <w:fldChar w:fldCharType="separate"/>
@@ -1239,7 +1237,7 @@
             <w:fldChar w:fldCharType="begin"/>
           </w:r>
           <w:r>
-            <w:instrText xml:space="preserve"> PAGEREF _Toc25150 \h </w:instrText>
+            <w:instrText xml:space="preserve"> PAGEREF _Toc6707 \h </w:instrText>
           </w:r>
           <w:r>
             <w:fldChar w:fldCharType="separate"/>
@@ -1265,7 +1263,7 @@
             <w:fldChar w:fldCharType="begin"/>
           </w:r>
           <w:r>
-            <w:instrText xml:space="preserve"> HYPERLINK \l _Toc26034 </w:instrText>
+            <w:instrText xml:space="preserve"> HYPERLINK \l _Toc17343 </w:instrText>
           </w:r>
           <w:r>
             <w:fldChar w:fldCharType="separate"/>
@@ -1302,7 +1300,7 @@
             <w:fldChar w:fldCharType="begin"/>
           </w:r>
           <w:r>
-            <w:instrText xml:space="preserve"> PAGEREF _Toc26034 \h </w:instrText>
+            <w:instrText xml:space="preserve"> PAGEREF _Toc17343 \h </w:instrText>
           </w:r>
           <w:r>
             <w:fldChar w:fldCharType="separate"/>
@@ -1328,7 +1326,7 @@
             <w:fldChar w:fldCharType="begin"/>
           </w:r>
           <w:r>
-            <w:instrText xml:space="preserve"> HYPERLINK \l _Toc22095 </w:instrText>
+            <w:instrText xml:space="preserve"> HYPERLINK \l _Toc15795 </w:instrText>
           </w:r>
           <w:r>
             <w:fldChar w:fldCharType="separate"/>
@@ -1365,7 +1363,7 @@
             <w:fldChar w:fldCharType="begin"/>
           </w:r>
           <w:r>
-            <w:instrText xml:space="preserve"> PAGEREF _Toc22095 \h </w:instrText>
+            <w:instrText xml:space="preserve"> PAGEREF _Toc15795 \h </w:instrText>
           </w:r>
           <w:r>
             <w:fldChar w:fldCharType="separate"/>
@@ -1391,7 +1389,7 @@
             <w:fldChar w:fldCharType="begin"/>
           </w:r>
           <w:r>
-            <w:instrText xml:space="preserve"> HYPERLINK \l _Toc18237 </w:instrText>
+            <w:instrText xml:space="preserve"> HYPERLINK \l _Toc4738 </w:instrText>
           </w:r>
           <w:r>
             <w:fldChar w:fldCharType="separate"/>
@@ -1420,7 +1418,7 @@
             <w:fldChar w:fldCharType="begin"/>
           </w:r>
           <w:r>
-            <w:instrText xml:space="preserve"> PAGEREF _Toc18237 \h </w:instrText>
+            <w:instrText xml:space="preserve"> PAGEREF _Toc4738 \h </w:instrText>
           </w:r>
           <w:r>
             <w:fldChar w:fldCharType="separate"/>
@@ -1446,7 +1444,7 @@
             <w:fldChar w:fldCharType="begin"/>
           </w:r>
           <w:r>
-            <w:instrText xml:space="preserve"> HYPERLINK \l _Toc20756 </w:instrText>
+            <w:instrText xml:space="preserve"> HYPERLINK \l _Toc6338 </w:instrText>
           </w:r>
           <w:r>
             <w:fldChar w:fldCharType="separate"/>
@@ -1475,7 +1473,7 @@
             <w:fldChar w:fldCharType="begin"/>
           </w:r>
           <w:r>
-            <w:instrText xml:space="preserve"> PAGEREF _Toc20756 \h </w:instrText>
+            <w:instrText xml:space="preserve"> PAGEREF _Toc6338 \h </w:instrText>
           </w:r>
           <w:r>
             <w:fldChar w:fldCharType="separate"/>
@@ -1501,7 +1499,7 @@
             <w:fldChar w:fldCharType="begin"/>
           </w:r>
           <w:r>
-            <w:instrText xml:space="preserve"> HYPERLINK \l _Toc28378 </w:instrText>
+            <w:instrText xml:space="preserve"> HYPERLINK \l _Toc20970 </w:instrText>
           </w:r>
           <w:r>
             <w:fldChar w:fldCharType="separate"/>
@@ -1522,7 +1520,7 @@
             <w:fldChar w:fldCharType="begin"/>
           </w:r>
           <w:r>
-            <w:instrText xml:space="preserve"> PAGEREF _Toc28378 \h </w:instrText>
+            <w:instrText xml:space="preserve"> PAGEREF _Toc20970 \h </w:instrText>
           </w:r>
           <w:r>
             <w:fldChar w:fldCharType="separate"/>
@@ -1548,7 +1546,7 @@
             <w:fldChar w:fldCharType="begin"/>
           </w:r>
           <w:r>
-            <w:instrText xml:space="preserve"> HYPERLINK \l _Toc12318 </w:instrText>
+            <w:instrText xml:space="preserve"> HYPERLINK \l _Toc29931 </w:instrText>
           </w:r>
           <w:r>
             <w:fldChar w:fldCharType="separate"/>
@@ -1594,7 +1592,7 @@
             <w:fldChar w:fldCharType="begin"/>
           </w:r>
           <w:r>
-            <w:instrText xml:space="preserve"> PAGEREF _Toc12318 \h </w:instrText>
+            <w:instrText xml:space="preserve"> PAGEREF _Toc29931 \h </w:instrText>
           </w:r>
           <w:r>
             <w:fldChar w:fldCharType="separate"/>
@@ -1620,7 +1618,7 @@
             <w:fldChar w:fldCharType="begin"/>
           </w:r>
           <w:r>
-            <w:instrText xml:space="preserve"> HYPERLINK \l _Toc30523 </w:instrText>
+            <w:instrText xml:space="preserve"> HYPERLINK \l _Toc18917 </w:instrText>
           </w:r>
           <w:r>
             <w:fldChar w:fldCharType="separate"/>
@@ -1666,7 +1664,7 @@
             <w:fldChar w:fldCharType="begin"/>
           </w:r>
           <w:r>
-            <w:instrText xml:space="preserve"> PAGEREF _Toc30523 \h </w:instrText>
+            <w:instrText xml:space="preserve"> PAGEREF _Toc18917 \h </w:instrText>
           </w:r>
           <w:r>
             <w:fldChar w:fldCharType="separate"/>
@@ -1692,7 +1690,7 @@
             <w:fldChar w:fldCharType="begin"/>
           </w:r>
           <w:r>
-            <w:instrText xml:space="preserve"> HYPERLINK \l _Toc12564 </w:instrText>
+            <w:instrText xml:space="preserve"> HYPERLINK \l _Toc21681 </w:instrText>
           </w:r>
           <w:r>
             <w:fldChar w:fldCharType="separate"/>
@@ -1738,13 +1736,13 @@
             <w:fldChar w:fldCharType="begin"/>
           </w:r>
           <w:r>
-            <w:instrText xml:space="preserve"> PAGEREF _Toc12564 \h </w:instrText>
+            <w:instrText xml:space="preserve"> PAGEREF _Toc21681 \h </w:instrText>
           </w:r>
           <w:r>
             <w:fldChar w:fldCharType="separate"/>
           </w:r>
           <w:r>
-            <w:t>2</w:t>
+            <w:t>3</w:t>
           </w:r>
           <w:r>
             <w:fldChar w:fldCharType="end"/>
@@ -1764,7 +1762,7 @@
             <w:fldChar w:fldCharType="begin"/>
           </w:r>
           <w:r>
-            <w:instrText xml:space="preserve"> HYPERLINK \l _Toc1582 </w:instrText>
+            <w:instrText xml:space="preserve"> HYPERLINK \l _Toc3093 </w:instrText>
           </w:r>
           <w:r>
             <w:fldChar w:fldCharType="separate"/>
@@ -1810,13 +1808,13 @@
             <w:fldChar w:fldCharType="begin"/>
           </w:r>
           <w:r>
-            <w:instrText xml:space="preserve"> PAGEREF _Toc1582 \h </w:instrText>
+            <w:instrText xml:space="preserve"> PAGEREF _Toc3093 \h </w:instrText>
           </w:r>
           <w:r>
             <w:fldChar w:fldCharType="separate"/>
           </w:r>
           <w:r>
-            <w:t>2</w:t>
+            <w:t>3</w:t>
           </w:r>
           <w:r>
             <w:fldChar w:fldCharType="end"/>
@@ -1836,7 +1834,7 @@
             <w:fldChar w:fldCharType="begin"/>
           </w:r>
           <w:r>
-            <w:instrText xml:space="preserve"> HYPERLINK \l _Toc11871 </w:instrText>
+            <w:instrText xml:space="preserve"> HYPERLINK \l _Toc16323 </w:instrText>
           </w:r>
           <w:r>
             <w:fldChar w:fldCharType="separate"/>
@@ -1882,7 +1880,7 @@
             <w:fldChar w:fldCharType="begin"/>
           </w:r>
           <w:r>
-            <w:instrText xml:space="preserve"> PAGEREF _Toc11871 \h </w:instrText>
+            <w:instrText xml:space="preserve"> PAGEREF _Toc16323 \h </w:instrText>
           </w:r>
           <w:r>
             <w:fldChar w:fldCharType="separate"/>
@@ -1908,7 +1906,7 @@
             <w:fldChar w:fldCharType="begin"/>
           </w:r>
           <w:r>
-            <w:instrText xml:space="preserve"> HYPERLINK \l _Toc28923 </w:instrText>
+            <w:instrText xml:space="preserve"> HYPERLINK \l _Toc13204 </w:instrText>
           </w:r>
           <w:r>
             <w:fldChar w:fldCharType="separate"/>
@@ -1932,7 +1930,7 @@
             <w:fldChar w:fldCharType="begin"/>
           </w:r>
           <w:r>
-            <w:instrText xml:space="preserve"> PAGEREF _Toc28923 \h </w:instrText>
+            <w:instrText xml:space="preserve"> PAGEREF _Toc13204 \h </w:instrText>
           </w:r>
           <w:r>
             <w:fldChar w:fldCharType="separate"/>
@@ -1958,7 +1956,7 @@
             <w:fldChar w:fldCharType="begin"/>
           </w:r>
           <w:r>
-            <w:instrText xml:space="preserve"> HYPERLINK \l _Toc8845 </w:instrText>
+            <w:instrText xml:space="preserve"> HYPERLINK \l _Toc5698 </w:instrText>
           </w:r>
           <w:r>
             <w:fldChar w:fldCharType="separate"/>
@@ -1982,7 +1980,7 @@
             <w:fldChar w:fldCharType="begin"/>
           </w:r>
           <w:r>
-            <w:instrText xml:space="preserve"> PAGEREF _Toc8845 \h </w:instrText>
+            <w:instrText xml:space="preserve"> PAGEREF _Toc5698 \h </w:instrText>
           </w:r>
           <w:r>
             <w:fldChar w:fldCharType="separate"/>
@@ -2008,7 +2006,7 @@
             <w:fldChar w:fldCharType="begin"/>
           </w:r>
           <w:r>
-            <w:instrText xml:space="preserve"> HYPERLINK \l _Toc24790 </w:instrText>
+            <w:instrText xml:space="preserve"> HYPERLINK \l _Toc13256 </w:instrText>
           </w:r>
           <w:r>
             <w:fldChar w:fldCharType="separate"/>
@@ -2032,7 +2030,7 @@
             <w:fldChar w:fldCharType="begin"/>
           </w:r>
           <w:r>
-            <w:instrText xml:space="preserve"> PAGEREF _Toc24790 \h </w:instrText>
+            <w:instrText xml:space="preserve"> PAGEREF _Toc13256 \h </w:instrText>
           </w:r>
           <w:r>
             <w:fldChar w:fldCharType="separate"/>
@@ -2058,7 +2056,7 @@
             <w:fldChar w:fldCharType="begin"/>
           </w:r>
           <w:r>
-            <w:instrText xml:space="preserve"> HYPERLINK \l _Toc12145 </w:instrText>
+            <w:instrText xml:space="preserve"> HYPERLINK \l _Toc19120 </w:instrText>
           </w:r>
           <w:r>
             <w:fldChar w:fldCharType="separate"/>
@@ -2082,7 +2080,7 @@
             <w:fldChar w:fldCharType="begin"/>
           </w:r>
           <w:r>
-            <w:instrText xml:space="preserve"> PAGEREF _Toc12145 \h </w:instrText>
+            <w:instrText xml:space="preserve"> PAGEREF _Toc19120 \h </w:instrText>
           </w:r>
           <w:r>
             <w:fldChar w:fldCharType="separate"/>
@@ -2108,7 +2106,7 @@
             <w:fldChar w:fldCharType="begin"/>
           </w:r>
           <w:r>
-            <w:instrText xml:space="preserve"> HYPERLINK \l _Toc24557 </w:instrText>
+            <w:instrText xml:space="preserve"> HYPERLINK \l _Toc14079 </w:instrText>
           </w:r>
           <w:r>
             <w:fldChar w:fldCharType="separate"/>
@@ -2154,7 +2152,7 @@
             <w:fldChar w:fldCharType="begin"/>
           </w:r>
           <w:r>
-            <w:instrText xml:space="preserve"> PAGEREF _Toc24557 \h </w:instrText>
+            <w:instrText xml:space="preserve"> PAGEREF _Toc14079 \h </w:instrText>
           </w:r>
           <w:r>
             <w:fldChar w:fldCharType="separate"/>
@@ -2180,7 +2178,7 @@
             <w:fldChar w:fldCharType="begin"/>
           </w:r>
           <w:r>
-            <w:instrText xml:space="preserve"> HYPERLINK \l _Toc3970 </w:instrText>
+            <w:instrText xml:space="preserve"> HYPERLINK \l _Toc8372 </w:instrText>
           </w:r>
           <w:r>
             <w:fldChar w:fldCharType="separate"/>
@@ -2203,7 +2201,7 @@
             <w:fldChar w:fldCharType="begin"/>
           </w:r>
           <w:r>
-            <w:instrText xml:space="preserve"> PAGEREF _Toc3970 \h </w:instrText>
+            <w:instrText xml:space="preserve"> PAGEREF _Toc8372 \h </w:instrText>
           </w:r>
           <w:r>
             <w:fldChar w:fldCharType="separate"/>
@@ -2229,7 +2227,7 @@
             <w:fldChar w:fldCharType="begin"/>
           </w:r>
           <w:r>
-            <w:instrText xml:space="preserve"> HYPERLINK \l _Toc15318 </w:instrText>
+            <w:instrText xml:space="preserve"> HYPERLINK \l _Toc21150 </w:instrText>
           </w:r>
           <w:r>
             <w:fldChar w:fldCharType="separate"/>
@@ -2275,13 +2273,13 @@
             <w:fldChar w:fldCharType="begin"/>
           </w:r>
           <w:r>
-            <w:instrText xml:space="preserve"> PAGEREF _Toc15318 \h </w:instrText>
+            <w:instrText xml:space="preserve"> PAGEREF _Toc21150 \h </w:instrText>
           </w:r>
           <w:r>
             <w:fldChar w:fldCharType="separate"/>
           </w:r>
           <w:r>
-            <w:t>4</w:t>
+            <w:t>5</w:t>
           </w:r>
           <w:r>
             <w:fldChar w:fldCharType="end"/>
@@ -2301,7 +2299,7 @@
             <w:fldChar w:fldCharType="begin"/>
           </w:r>
           <w:r>
-            <w:instrText xml:space="preserve"> HYPERLINK \l _Toc19219 </w:instrText>
+            <w:instrText xml:space="preserve"> HYPERLINK \l _Toc16113 </w:instrText>
           </w:r>
           <w:r>
             <w:fldChar w:fldCharType="separate"/>
@@ -2347,7 +2345,7 @@
             <w:fldChar w:fldCharType="begin"/>
           </w:r>
           <w:r>
-            <w:instrText xml:space="preserve"> PAGEREF _Toc19219 \h </w:instrText>
+            <w:instrText xml:space="preserve"> PAGEREF _Toc16113 \h </w:instrText>
           </w:r>
           <w:r>
             <w:fldChar w:fldCharType="separate"/>
@@ -2373,7 +2371,7 @@
             <w:fldChar w:fldCharType="begin"/>
           </w:r>
           <w:r>
-            <w:instrText xml:space="preserve"> HYPERLINK \l _Toc20578 </w:instrText>
+            <w:instrText xml:space="preserve"> HYPERLINK \l _Toc17970 </w:instrText>
           </w:r>
           <w:r>
             <w:fldChar w:fldCharType="separate"/>
@@ -2419,13 +2417,13 @@
             <w:fldChar w:fldCharType="begin"/>
           </w:r>
           <w:r>
-            <w:instrText xml:space="preserve"> PAGEREF _Toc20578 \h </w:instrText>
+            <w:instrText xml:space="preserve"> PAGEREF _Toc17970 \h </w:instrText>
           </w:r>
           <w:r>
             <w:fldChar w:fldCharType="separate"/>
           </w:r>
           <w:r>
-            <w:t>5</w:t>
+            <w:t>6</w:t>
           </w:r>
           <w:r>
             <w:fldChar w:fldCharType="end"/>
@@ -2445,7 +2443,7 @@
             <w:fldChar w:fldCharType="begin"/>
           </w:r>
           <w:r>
-            <w:instrText xml:space="preserve"> HYPERLINK \l _Toc6224 </w:instrText>
+            <w:instrText xml:space="preserve"> HYPERLINK \l _Toc5231 </w:instrText>
           </w:r>
           <w:r>
             <w:fldChar w:fldCharType="separate"/>
@@ -2491,7 +2489,7 @@
             <w:fldChar w:fldCharType="begin"/>
           </w:r>
           <w:r>
-            <w:instrText xml:space="preserve"> PAGEREF _Toc6224 \h </w:instrText>
+            <w:instrText xml:space="preserve"> PAGEREF _Toc5231 \h </w:instrText>
           </w:r>
           <w:r>
             <w:fldChar w:fldCharType="separate"/>
@@ -2517,7 +2515,7 @@
             <w:fldChar w:fldCharType="begin"/>
           </w:r>
           <w:r>
-            <w:instrText xml:space="preserve"> HYPERLINK \l _Toc9767 </w:instrText>
+            <w:instrText xml:space="preserve"> HYPERLINK \l _Toc25510 </w:instrText>
           </w:r>
           <w:r>
             <w:fldChar w:fldCharType="separate"/>
@@ -2540,7 +2538,7 @@
             <w:fldChar w:fldCharType="begin"/>
           </w:r>
           <w:r>
-            <w:instrText xml:space="preserve"> PAGEREF _Toc9767 \h </w:instrText>
+            <w:instrText xml:space="preserve"> PAGEREF _Toc25510 \h </w:instrText>
           </w:r>
           <w:r>
             <w:fldChar w:fldCharType="separate"/>
@@ -2566,7 +2564,7 @@
             <w:fldChar w:fldCharType="begin"/>
           </w:r>
           <w:r>
-            <w:instrText xml:space="preserve"> HYPERLINK \l _Toc17450 </w:instrText>
+            <w:instrText xml:space="preserve"> HYPERLINK \l _Toc22121 </w:instrText>
           </w:r>
           <w:r>
             <w:fldChar w:fldCharType="separate"/>
@@ -2612,7 +2610,7 @@
             <w:fldChar w:fldCharType="begin"/>
           </w:r>
           <w:r>
-            <w:instrText xml:space="preserve"> PAGEREF _Toc17450 \h </w:instrText>
+            <w:instrText xml:space="preserve"> PAGEREF _Toc22121 \h </w:instrText>
           </w:r>
           <w:r>
             <w:fldChar w:fldCharType="separate"/>
@@ -2638,7 +2636,7 @@
             <w:fldChar w:fldCharType="begin"/>
           </w:r>
           <w:r>
-            <w:instrText xml:space="preserve"> HYPERLINK \l _Toc27200 </w:instrText>
+            <w:instrText xml:space="preserve"> HYPERLINK \l _Toc29275 </w:instrText>
           </w:r>
           <w:r>
             <w:fldChar w:fldCharType="separate"/>
@@ -2684,13 +2682,13 @@
             <w:fldChar w:fldCharType="begin"/>
           </w:r>
           <w:r>
-            <w:instrText xml:space="preserve"> PAGEREF _Toc27200 \h </w:instrText>
+            <w:instrText xml:space="preserve"> PAGEREF _Toc29275 \h </w:instrText>
           </w:r>
           <w:r>
             <w:fldChar w:fldCharType="separate"/>
           </w:r>
           <w:r>
-            <w:t>6</w:t>
+            <w:t>7</w:t>
           </w:r>
           <w:r>
             <w:fldChar w:fldCharType="end"/>
@@ -2710,7 +2708,7 @@
             <w:fldChar w:fldCharType="begin"/>
           </w:r>
           <w:r>
-            <w:instrText xml:space="preserve"> HYPERLINK \l _Toc13202 </w:instrText>
+            <w:instrText xml:space="preserve"> HYPERLINK \l _Toc16771 </w:instrText>
           </w:r>
           <w:r>
             <w:fldChar w:fldCharType="separate"/>
@@ -2756,7 +2754,7 @@
             <w:fldChar w:fldCharType="begin"/>
           </w:r>
           <w:r>
-            <w:instrText xml:space="preserve"> PAGEREF _Toc13202 \h </w:instrText>
+            <w:instrText xml:space="preserve"> PAGEREF _Toc16771 \h </w:instrText>
           </w:r>
           <w:r>
             <w:fldChar w:fldCharType="separate"/>
@@ -2782,7 +2780,7 @@
             <w:fldChar w:fldCharType="begin"/>
           </w:r>
           <w:r>
-            <w:instrText xml:space="preserve"> HYPERLINK \l _Toc12556 </w:instrText>
+            <w:instrText xml:space="preserve"> HYPERLINK \l _Toc11272 </w:instrText>
           </w:r>
           <w:r>
             <w:fldChar w:fldCharType="separate"/>
@@ -2805,7 +2803,7 @@
             <w:fldChar w:fldCharType="begin"/>
           </w:r>
           <w:r>
-            <w:instrText xml:space="preserve"> PAGEREF _Toc12556 \h </w:instrText>
+            <w:instrText xml:space="preserve"> PAGEREF _Toc11272 \h </w:instrText>
           </w:r>
           <w:r>
             <w:fldChar w:fldCharType="separate"/>
@@ -2831,7 +2829,7 @@
             <w:fldChar w:fldCharType="begin"/>
           </w:r>
           <w:r>
-            <w:instrText xml:space="preserve"> HYPERLINK \l _Toc18366 </w:instrText>
+            <w:instrText xml:space="preserve"> HYPERLINK \l _Toc25006 </w:instrText>
           </w:r>
           <w:r>
             <w:fldChar w:fldCharType="separate"/>
@@ -2877,7 +2875,7 @@
             <w:fldChar w:fldCharType="begin"/>
           </w:r>
           <w:r>
-            <w:instrText xml:space="preserve"> PAGEREF _Toc18366 \h </w:instrText>
+            <w:instrText xml:space="preserve"> PAGEREF _Toc25006 \h </w:instrText>
           </w:r>
           <w:r>
             <w:fldChar w:fldCharType="separate"/>
@@ -2903,7 +2901,7 @@
             <w:fldChar w:fldCharType="begin"/>
           </w:r>
           <w:r>
-            <w:instrText xml:space="preserve"> HYPERLINK \l _Toc17402 </w:instrText>
+            <w:instrText xml:space="preserve"> HYPERLINK \l _Toc10630 </w:instrText>
           </w:r>
           <w:r>
             <w:fldChar w:fldCharType="separate"/>
@@ -2949,7 +2947,7 @@
             <w:fldChar w:fldCharType="begin"/>
           </w:r>
           <w:r>
-            <w:instrText xml:space="preserve"> PAGEREF _Toc17402 \h </w:instrText>
+            <w:instrText xml:space="preserve"> PAGEREF _Toc10630 \h </w:instrText>
           </w:r>
           <w:r>
             <w:fldChar w:fldCharType="separate"/>
@@ -2975,7 +2973,7 @@
             <w:fldChar w:fldCharType="begin"/>
           </w:r>
           <w:r>
-            <w:instrText xml:space="preserve"> HYPERLINK \l _Toc1346 </w:instrText>
+            <w:instrText xml:space="preserve"> HYPERLINK \l _Toc32336 </w:instrText>
           </w:r>
           <w:r>
             <w:fldChar w:fldCharType="separate"/>
@@ -3021,13 +3019,13 @@
             <w:fldChar w:fldCharType="begin"/>
           </w:r>
           <w:r>
-            <w:instrText xml:space="preserve"> PAGEREF _Toc1346 \h </w:instrText>
+            <w:instrText xml:space="preserve"> PAGEREF _Toc32336 \h </w:instrText>
           </w:r>
           <w:r>
             <w:fldChar w:fldCharType="separate"/>
           </w:r>
           <w:r>
-            <w:t>8</w:t>
+            <w:t>9</w:t>
           </w:r>
           <w:r>
             <w:fldChar w:fldCharType="end"/>
@@ -3047,7 +3045,7 @@
             <w:fldChar w:fldCharType="begin"/>
           </w:r>
           <w:r>
-            <w:instrText xml:space="preserve"> HYPERLINK \l _Toc31395 </w:instrText>
+            <w:instrText xml:space="preserve"> HYPERLINK \l _Toc1772 </w:instrText>
           </w:r>
           <w:r>
             <w:fldChar w:fldCharType="separate"/>
@@ -3116,13 +3114,13 @@
             <w:fldChar w:fldCharType="begin"/>
           </w:r>
           <w:r>
-            <w:instrText xml:space="preserve"> PAGEREF _Toc31395 \h </w:instrText>
+            <w:instrText xml:space="preserve"> PAGEREF _Toc1772 \h </w:instrText>
           </w:r>
           <w:r>
             <w:fldChar w:fldCharType="separate"/>
           </w:r>
           <w:r>
-            <w:t>8</w:t>
+            <w:t>9</w:t>
           </w:r>
           <w:r>
             <w:fldChar w:fldCharType="end"/>
@@ -3142,7 +3140,7 @@
             <w:fldChar w:fldCharType="begin"/>
           </w:r>
           <w:r>
-            <w:instrText xml:space="preserve"> HYPERLINK \l _Toc7493 </w:instrText>
+            <w:instrText xml:space="preserve"> HYPERLINK \l _Toc29790 </w:instrText>
           </w:r>
           <w:r>
             <w:fldChar w:fldCharType="separate"/>
@@ -3200,7 +3198,7 @@
             <w:fldChar w:fldCharType="begin"/>
           </w:r>
           <w:r>
-            <w:instrText xml:space="preserve"> PAGEREF _Toc7493 \h </w:instrText>
+            <w:instrText xml:space="preserve"> PAGEREF _Toc29790 \h </w:instrText>
           </w:r>
           <w:r>
             <w:fldChar w:fldCharType="separate"/>
@@ -3226,7 +3224,7 @@
             <w:fldChar w:fldCharType="begin"/>
           </w:r>
           <w:r>
-            <w:instrText xml:space="preserve"> HYPERLINK \l _Toc25023 </w:instrText>
+            <w:instrText xml:space="preserve"> HYPERLINK \l _Toc428 </w:instrText>
           </w:r>
           <w:r>
             <w:fldChar w:fldCharType="separate"/>
@@ -3272,7 +3270,7 @@
             <w:fldChar w:fldCharType="begin"/>
           </w:r>
           <w:r>
-            <w:instrText xml:space="preserve"> PAGEREF _Toc25023 \h </w:instrText>
+            <w:instrText xml:space="preserve"> PAGEREF _Toc428 \h </w:instrText>
           </w:r>
           <w:r>
             <w:fldChar w:fldCharType="separate"/>
@@ -3298,7 +3296,7 @@
             <w:fldChar w:fldCharType="begin"/>
           </w:r>
           <w:r>
-            <w:instrText xml:space="preserve"> HYPERLINK \l _Toc12577 </w:instrText>
+            <w:instrText xml:space="preserve"> HYPERLINK \l _Toc22150 </w:instrText>
           </w:r>
           <w:r>
             <w:fldChar w:fldCharType="separate"/>
@@ -3349,7 +3347,7 @@
             <w:fldChar w:fldCharType="begin"/>
           </w:r>
           <w:r>
-            <w:instrText xml:space="preserve"> PAGEREF _Toc12577 \h </w:instrText>
+            <w:instrText xml:space="preserve"> PAGEREF _Toc22150 \h </w:instrText>
           </w:r>
           <w:r>
             <w:fldChar w:fldCharType="separate"/>
@@ -3375,7 +3373,7 @@
             <w:fldChar w:fldCharType="begin"/>
           </w:r>
           <w:r>
-            <w:instrText xml:space="preserve"> HYPERLINK \l _Toc18106 </w:instrText>
+            <w:instrText xml:space="preserve"> HYPERLINK \l _Toc10391 </w:instrText>
           </w:r>
           <w:r>
             <w:fldChar w:fldCharType="separate"/>
@@ -3433,7 +3431,7 @@
             <w:fldChar w:fldCharType="begin"/>
           </w:r>
           <w:r>
-            <w:instrText xml:space="preserve"> PAGEREF _Toc18106 \h </w:instrText>
+            <w:instrText xml:space="preserve"> PAGEREF _Toc10391 \h </w:instrText>
           </w:r>
           <w:r>
             <w:fldChar w:fldCharType="separate"/>
@@ -3459,7 +3457,7 @@
             <w:fldChar w:fldCharType="begin"/>
           </w:r>
           <w:r>
-            <w:instrText xml:space="preserve"> HYPERLINK \l _Toc11300 </w:instrText>
+            <w:instrText xml:space="preserve"> HYPERLINK \l _Toc11186 </w:instrText>
           </w:r>
           <w:r>
             <w:fldChar w:fldCharType="separate"/>
@@ -3517,7 +3515,7 @@
             <w:fldChar w:fldCharType="begin"/>
           </w:r>
           <w:r>
-            <w:instrText xml:space="preserve"> PAGEREF _Toc11300 \h </w:instrText>
+            <w:instrText xml:space="preserve"> PAGEREF _Toc11186 \h </w:instrText>
           </w:r>
           <w:r>
             <w:fldChar w:fldCharType="separate"/>
@@ -3543,7 +3541,7 @@
             <w:fldChar w:fldCharType="begin"/>
           </w:r>
           <w:r>
-            <w:instrText xml:space="preserve"> HYPERLINK \l _Toc13554 </w:instrText>
+            <w:instrText xml:space="preserve"> HYPERLINK \l _Toc13548 </w:instrText>
           </w:r>
           <w:r>
             <w:fldChar w:fldCharType="separate"/>
@@ -3566,13 +3564,13 @@
             <w:fldChar w:fldCharType="begin"/>
           </w:r>
           <w:r>
-            <w:instrText xml:space="preserve"> PAGEREF _Toc13554 \h </w:instrText>
+            <w:instrText xml:space="preserve"> PAGEREF _Toc13548 \h </w:instrText>
           </w:r>
           <w:r>
             <w:fldChar w:fldCharType="separate"/>
           </w:r>
           <w:r>
-            <w:t>9</w:t>
+            <w:t>10</w:t>
           </w:r>
           <w:r>
             <w:fldChar w:fldCharType="end"/>
@@ -3592,7 +3590,7 @@
             <w:fldChar w:fldCharType="begin"/>
           </w:r>
           <w:r>
-            <w:instrText xml:space="preserve"> HYPERLINK \l _Toc11352 </w:instrText>
+            <w:instrText xml:space="preserve"> HYPERLINK \l _Toc9809 </w:instrText>
           </w:r>
           <w:r>
             <w:fldChar w:fldCharType="separate"/>
@@ -3638,13 +3636,13 @@
             <w:fldChar w:fldCharType="begin"/>
           </w:r>
           <w:r>
-            <w:instrText xml:space="preserve"> PAGEREF _Toc11352 \h </w:instrText>
+            <w:instrText xml:space="preserve"> PAGEREF _Toc9809 \h </w:instrText>
           </w:r>
           <w:r>
             <w:fldChar w:fldCharType="separate"/>
           </w:r>
           <w:r>
-            <w:t>9</w:t>
+            <w:t>10</w:t>
           </w:r>
           <w:r>
             <w:fldChar w:fldCharType="end"/>
@@ -3664,7 +3662,7 @@
             <w:fldChar w:fldCharType="begin"/>
           </w:r>
           <w:r>
-            <w:instrText xml:space="preserve"> HYPERLINK \l _Toc6629 </w:instrText>
+            <w:instrText xml:space="preserve"> HYPERLINK \l _Toc7383 </w:instrText>
           </w:r>
           <w:r>
             <w:fldChar w:fldCharType="separate"/>
@@ -3710,7 +3708,7 @@
             <w:fldChar w:fldCharType="begin"/>
           </w:r>
           <w:r>
-            <w:instrText xml:space="preserve"> PAGEREF _Toc6629 \h </w:instrText>
+            <w:instrText xml:space="preserve"> PAGEREF _Toc7383 \h </w:instrText>
           </w:r>
           <w:r>
             <w:fldChar w:fldCharType="separate"/>
@@ -3736,7 +3734,7 @@
             <w:fldChar w:fldCharType="begin"/>
           </w:r>
           <w:r>
-            <w:instrText xml:space="preserve"> HYPERLINK \l _Toc31347 </w:instrText>
+            <w:instrText xml:space="preserve"> HYPERLINK \l _Toc17237 </w:instrText>
           </w:r>
           <w:r>
             <w:fldChar w:fldCharType="separate"/>
@@ -3759,13 +3757,13 @@
             <w:fldChar w:fldCharType="begin"/>
           </w:r>
           <w:r>
-            <w:instrText xml:space="preserve"> PAGEREF _Toc31347 \h </w:instrText>
+            <w:instrText xml:space="preserve"> PAGEREF _Toc17237 \h </w:instrText>
           </w:r>
           <w:r>
             <w:fldChar w:fldCharType="separate"/>
           </w:r>
           <w:r>
-            <w:t>10</w:t>
+            <w:t>11</w:t>
           </w:r>
           <w:r>
             <w:fldChar w:fldCharType="end"/>
@@ -3785,7 +3783,7 @@
             <w:fldChar w:fldCharType="begin"/>
           </w:r>
           <w:r>
-            <w:instrText xml:space="preserve"> HYPERLINK \l _Toc12251 </w:instrText>
+            <w:instrText xml:space="preserve"> HYPERLINK \l _Toc13080 </w:instrText>
           </w:r>
           <w:r>
             <w:fldChar w:fldCharType="separate"/>
@@ -3831,13 +3829,13 @@
             <w:fldChar w:fldCharType="begin"/>
           </w:r>
           <w:r>
-            <w:instrText xml:space="preserve"> PAGEREF _Toc12251 \h </w:instrText>
+            <w:instrText xml:space="preserve"> PAGEREF _Toc13080 \h </w:instrText>
           </w:r>
           <w:r>
             <w:fldChar w:fldCharType="separate"/>
           </w:r>
           <w:r>
-            <w:t>10</w:t>
+            <w:t>11</w:t>
           </w:r>
           <w:r>
             <w:fldChar w:fldCharType="end"/>
@@ -3857,7 +3855,7 @@
             <w:fldChar w:fldCharType="begin"/>
           </w:r>
           <w:r>
-            <w:instrText xml:space="preserve"> HYPERLINK \l _Toc21087 </w:instrText>
+            <w:instrText xml:space="preserve"> HYPERLINK \l _Toc30157 </w:instrText>
           </w:r>
           <w:r>
             <w:fldChar w:fldCharType="separate"/>
@@ -3903,7 +3901,7 @@
             <w:fldChar w:fldCharType="begin"/>
           </w:r>
           <w:r>
-            <w:instrText xml:space="preserve"> PAGEREF _Toc21087 \h </w:instrText>
+            <w:instrText xml:space="preserve"> PAGEREF _Toc30157 \h </w:instrText>
           </w:r>
           <w:r>
             <w:fldChar w:fldCharType="separate"/>
@@ -3929,7 +3927,7 @@
             <w:fldChar w:fldCharType="begin"/>
           </w:r>
           <w:r>
-            <w:instrText xml:space="preserve"> HYPERLINK \l _Toc2765 </w:instrText>
+            <w:instrText xml:space="preserve"> HYPERLINK \l _Toc1186 </w:instrText>
           </w:r>
           <w:r>
             <w:fldChar w:fldCharType="separate"/>
@@ -3952,13 +3950,13 @@
             <w:fldChar w:fldCharType="begin"/>
           </w:r>
           <w:r>
-            <w:instrText xml:space="preserve"> PAGEREF _Toc2765 \h </w:instrText>
+            <w:instrText xml:space="preserve"> PAGEREF _Toc1186 \h </w:instrText>
           </w:r>
           <w:r>
             <w:fldChar w:fldCharType="separate"/>
           </w:r>
           <w:r>
-            <w:t>11</w:t>
+            <w:t>12</w:t>
           </w:r>
           <w:r>
             <w:fldChar w:fldCharType="end"/>
@@ -3978,7 +3976,7 @@
             <w:fldChar w:fldCharType="begin"/>
           </w:r>
           <w:r>
-            <w:instrText xml:space="preserve"> HYPERLINK \l _Toc2304 </w:instrText>
+            <w:instrText xml:space="preserve"> HYPERLINK \l _Toc27766 </w:instrText>
           </w:r>
           <w:r>
             <w:fldChar w:fldCharType="separate"/>
@@ -4024,13 +4022,13 @@
             <w:fldChar w:fldCharType="begin"/>
           </w:r>
           <w:r>
-            <w:instrText xml:space="preserve"> PAGEREF _Toc2304 \h </w:instrText>
+            <w:instrText xml:space="preserve"> PAGEREF _Toc27766 \h </w:instrText>
           </w:r>
           <w:r>
             <w:fldChar w:fldCharType="separate"/>
           </w:r>
           <w:r>
-            <w:t>11</w:t>
+            <w:t>12</w:t>
           </w:r>
           <w:r>
             <w:fldChar w:fldCharType="end"/>
@@ -4050,7 +4048,7 @@
             <w:fldChar w:fldCharType="begin"/>
           </w:r>
           <w:r>
-            <w:instrText xml:space="preserve"> HYPERLINK \l _Toc16796 </w:instrText>
+            <w:instrText xml:space="preserve"> HYPERLINK \l _Toc27763 </w:instrText>
           </w:r>
           <w:r>
             <w:fldChar w:fldCharType="separate"/>
@@ -4108,7 +4106,7 @@
             <w:fldChar w:fldCharType="begin"/>
           </w:r>
           <w:r>
-            <w:instrText xml:space="preserve"> PAGEREF _Toc16796 \h </w:instrText>
+            <w:instrText xml:space="preserve"> PAGEREF _Toc27763 \h </w:instrText>
           </w:r>
           <w:r>
             <w:fldChar w:fldCharType="separate"/>
@@ -4134,7 +4132,7 @@
             <w:fldChar w:fldCharType="begin"/>
           </w:r>
           <w:r>
-            <w:instrText xml:space="preserve"> HYPERLINK \l _Toc16670 </w:instrText>
+            <w:instrText xml:space="preserve"> HYPERLINK \l _Toc10432 </w:instrText>
           </w:r>
           <w:r>
             <w:fldChar w:fldCharType="separate"/>
@@ -4228,7 +4226,7 @@
             <w:fldChar w:fldCharType="begin"/>
           </w:r>
           <w:r>
-            <w:instrText xml:space="preserve"> PAGEREF _Toc16670 \h </w:instrText>
+            <w:instrText xml:space="preserve"> PAGEREF _Toc10432 \h </w:instrText>
           </w:r>
           <w:r>
             <w:fldChar w:fldCharType="separate"/>
@@ -4254,7 +4252,7 @@
             <w:fldChar w:fldCharType="begin"/>
           </w:r>
           <w:r>
-            <w:instrText xml:space="preserve"> HYPERLINK \l _Toc15819 </w:instrText>
+            <w:instrText xml:space="preserve"> HYPERLINK \l _Toc22266 </w:instrText>
           </w:r>
           <w:r>
             <w:fldChar w:fldCharType="separate"/>
@@ -4336,7 +4334,7 @@
             <w:fldChar w:fldCharType="begin"/>
           </w:r>
           <w:r>
-            <w:instrText xml:space="preserve"> PAGEREF _Toc15819 \h </w:instrText>
+            <w:instrText xml:space="preserve"> PAGEREF _Toc22266 \h </w:instrText>
           </w:r>
           <w:r>
             <w:fldChar w:fldCharType="separate"/>
@@ -4362,7 +4360,7 @@
             <w:fldChar w:fldCharType="begin"/>
           </w:r>
           <w:r>
-            <w:instrText xml:space="preserve"> HYPERLINK \l _Toc12439 </w:instrText>
+            <w:instrText xml:space="preserve"> HYPERLINK \l _Toc6940 </w:instrText>
           </w:r>
           <w:r>
             <w:fldChar w:fldCharType="separate"/>
@@ -4444,13 +4442,13 @@
             <w:fldChar w:fldCharType="begin"/>
           </w:r>
           <w:r>
-            <w:instrText xml:space="preserve"> PAGEREF _Toc12439 \h </w:instrText>
+            <w:instrText xml:space="preserve"> PAGEREF _Toc6940 \h </w:instrText>
           </w:r>
           <w:r>
             <w:fldChar w:fldCharType="separate"/>
           </w:r>
           <w:r>
-            <w:t>12</w:t>
+            <w:t>13</w:t>
           </w:r>
           <w:r>
             <w:fldChar w:fldCharType="end"/>
@@ -4470,7 +4468,7 @@
             <w:fldChar w:fldCharType="begin"/>
           </w:r>
           <w:r>
-            <w:instrText xml:space="preserve"> HYPERLINK \l _Toc20070 </w:instrText>
+            <w:instrText xml:space="preserve"> HYPERLINK \l _Toc14777 </w:instrText>
           </w:r>
           <w:r>
             <w:fldChar w:fldCharType="separate"/>
@@ -4493,13 +4491,13 @@
             <w:fldChar w:fldCharType="begin"/>
           </w:r>
           <w:r>
-            <w:instrText xml:space="preserve"> PAGEREF _Toc20070 \h </w:instrText>
+            <w:instrText xml:space="preserve"> PAGEREF _Toc14777 \h </w:instrText>
           </w:r>
           <w:r>
             <w:fldChar w:fldCharType="separate"/>
           </w:r>
           <w:r>
-            <w:t>12</w:t>
+            <w:t>13</w:t>
           </w:r>
           <w:r>
             <w:fldChar w:fldCharType="end"/>
@@ -4519,7 +4517,7 @@
             <w:fldChar w:fldCharType="begin"/>
           </w:r>
           <w:r>
-            <w:instrText xml:space="preserve"> HYPERLINK \l _Toc16466 </w:instrText>
+            <w:instrText xml:space="preserve"> HYPERLINK \l _Toc22152 </w:instrText>
           </w:r>
           <w:r>
             <w:fldChar w:fldCharType="separate"/>
@@ -4542,7 +4540,56 @@
             <w:fldChar w:fldCharType="begin"/>
           </w:r>
           <w:r>
-            <w:instrText xml:space="preserve"> PAGEREF _Toc16466 \h </w:instrText>
+            <w:instrText xml:space="preserve"> PAGEREF _Toc22152 \h </w:instrText>
+          </w:r>
+          <w:r>
+            <w:fldChar w:fldCharType="separate"/>
+          </w:r>
+          <w:r>
+            <w:t>13</w:t>
+          </w:r>
+          <w:r>
+            <w:fldChar w:fldCharType="end"/>
+          </w:r>
+          <w:r>
+            <w:fldChar w:fldCharType="end"/>
+          </w:r>
+        </w:p>
+        <w:p>
+          <w:pPr>
+            <w:pStyle w:val="6"/>
+            <w:tabs>
+              <w:tab w:val="right" w:leader="dot" w:pos="8306"/>
+            </w:tabs>
+          </w:pPr>
+          <w:r>
+            <w:fldChar w:fldCharType="begin"/>
+          </w:r>
+          <w:r>
+            <w:instrText xml:space="preserve"> HYPERLINK \l _Toc10515 </w:instrText>
+          </w:r>
+          <w:r>
+            <w:fldChar w:fldCharType="separate"/>
+          </w:r>
+          <w:r>
+            <w:rPr>
+              <w:rFonts w:hint="default" w:ascii="Times New Roman" w:hAnsi="Times New Roman" w:eastAsia="宋体" w:cs="Times New Roman"/>
+              <w:bCs/>
+              <w:caps w:val="0"/>
+              <w:spacing w:val="0"/>
+              <w:szCs w:val="24"/>
+              <w:lang w:val="en-US"/>
+            </w:rPr>
+            <w:t>8.2.6.变位影响本位的三层优先级设计</w:t>
+          </w:r>
+          <w:r>
+            <w:tab/>
+          </w:r>
+          <w:r>
+            <w:fldChar w:fldCharType="begin"/>
+          </w:r>
+          <w:r>
+            <w:instrText xml:space="preserve"> PAGEREF _Toc10515 \h </w:instrText>
           </w:r>
           <w:r>
             <w:fldChar w:fldCharType="separate"/>
@@ -4730,7 +4777,7 @@
           <w:szCs w:val="30"/>
         </w:rPr>
       </w:pPr>
-      <w:bookmarkStart w:id="0" w:name="_Toc8194"/>
+      <w:bookmarkStart w:id="0" w:name="_Toc8529"/>
       <w:r>
         <w:rPr>
           <w:rFonts w:hint="default" w:ascii="Times New Roman" w:hAnsi="Times New Roman" w:eastAsia="宋体" w:cs="Times New Roman"/>
@@ -4769,7 +4816,7 @@
           <w:szCs w:val="28"/>
         </w:rPr>
       </w:pPr>
-      <w:bookmarkStart w:id="1" w:name="_Toc25150"/>
+      <w:bookmarkStart w:id="1" w:name="_Toc6707"/>
       <w:r>
         <w:rPr>
           <w:rFonts w:hint="default" w:ascii="Times New Roman" w:hAnsi="Times New Roman" w:eastAsia="宋体" w:cs="Times New Roman"/>
@@ -4887,7 +4934,7 @@
           <w:szCs w:val="28"/>
         </w:rPr>
       </w:pPr>
-      <w:bookmarkStart w:id="2" w:name="_Toc26034"/>
+      <w:bookmarkStart w:id="2" w:name="_Toc17343"/>
       <w:r>
         <w:rPr>
           <w:rFonts w:hint="default" w:ascii="Times New Roman" w:hAnsi="Times New Roman" w:eastAsia="宋体" w:cs="Times New Roman"/>
@@ -5011,7 +5058,7 @@
           <w:szCs w:val="28"/>
         </w:rPr>
       </w:pPr>
-      <w:bookmarkStart w:id="3" w:name="_Toc22095"/>
+      <w:bookmarkStart w:id="3" w:name="_Toc15795"/>
       <w:r>
         <w:rPr>
           <w:rFonts w:hint="default" w:ascii="Times New Roman" w:hAnsi="Times New Roman" w:eastAsia="宋体" w:cs="Times New Roman"/>
@@ -5083,12 +5130,6 @@
             <w:insideV w:val="single" w:color="000000" w:sz="4" w:space="0"/>
           </w:tblBorders>
           <w:shd w:val="clear" w:color="auto" w:fill="FFFFFF"/>
-          <w:tblCellMar>
-            <w:top w:w="15" w:type="dxa"/>
-            <w:left w:w="15" w:type="dxa"/>
-            <w:bottom w:w="15" w:type="dxa"/>
-            <w:right w:w="15" w:type="dxa"/>
-          </w:tblCellMar>
         </w:tblPrEx>
         <w:trPr>
           <w:tblHeader/>
@@ -5299,7 +5340,6 @@
             <w:insideH w:val="single" w:color="000000" w:sz="4" w:space="0"/>
             <w:insideV w:val="single" w:color="000000" w:sz="4" w:space="0"/>
           </w:tblBorders>
-          <w:shd w:val="clear" w:color="auto" w:fill="FFFFFF"/>
           <w:tblCellMar>
             <w:top w:w="15" w:type="dxa"/>
             <w:left w:w="15" w:type="dxa"/>
@@ -5727,7 +5767,6 @@
             <w:insideH w:val="single" w:color="000000" w:sz="4" w:space="0"/>
             <w:insideV w:val="single" w:color="000000" w:sz="4" w:space="0"/>
           </w:tblBorders>
-          <w:shd w:val="clear" w:color="auto" w:fill="FFFFFF"/>
           <w:tblCellMar>
             <w:top w:w="15" w:type="dxa"/>
             <w:left w:w="15" w:type="dxa"/>
@@ -5941,7 +5980,6 @@
             <w:insideH w:val="single" w:color="000000" w:sz="4" w:space="0"/>
             <w:insideV w:val="single" w:color="000000" w:sz="4" w:space="0"/>
           </w:tblBorders>
-          <w:shd w:val="clear" w:color="auto" w:fill="FFFFFF"/>
           <w:tblCellMar>
             <w:top w:w="15" w:type="dxa"/>
             <w:left w:w="15" w:type="dxa"/>
@@ -6155,7 +6193,6 @@
             <w:insideH w:val="single" w:color="000000" w:sz="4" w:space="0"/>
             <w:insideV w:val="single" w:color="000000" w:sz="4" w:space="0"/>
           </w:tblBorders>
-          <w:shd w:val="clear" w:color="auto" w:fill="FFFFFF"/>
           <w:tblCellMar>
             <w:top w:w="15" w:type="dxa"/>
             <w:left w:w="15" w:type="dxa"/>
@@ -6369,7 +6406,6 @@
             <w:insideH w:val="single" w:color="000000" w:sz="4" w:space="0"/>
             <w:insideV w:val="single" w:color="000000" w:sz="4" w:space="0"/>
           </w:tblBorders>
-          <w:shd w:val="clear" w:color="auto" w:fill="FFFFFF"/>
           <w:tblCellMar>
             <w:top w:w="15" w:type="dxa"/>
             <w:left w:w="15" w:type="dxa"/>
@@ -6890,7 +6926,7 @@
           <w:szCs w:val="30"/>
         </w:rPr>
       </w:pPr>
-      <w:bookmarkStart w:id="4" w:name="_Toc18237"/>
+      <w:bookmarkStart w:id="4" w:name="_Toc4738"/>
       <w:r>
         <w:rPr>
           <w:rFonts w:hint="default" w:ascii="Times New Roman" w:hAnsi="Times New Roman" w:eastAsia="宋体" w:cs="Times New Roman"/>
@@ -6945,7 +6981,7 @@
           <w:szCs w:val="28"/>
         </w:rPr>
       </w:pPr>
-      <w:bookmarkStart w:id="5" w:name="_Toc20756"/>
+      <w:bookmarkStart w:id="5" w:name="_Toc6338"/>
       <w:r>
         <w:rPr>
           <w:rFonts w:hint="default" w:ascii="Times New Roman" w:hAnsi="Times New Roman" w:eastAsia="宋体" w:cs="Times New Roman"/>
@@ -7069,7 +7105,7 @@
           <w:lang w:val="en-US" w:eastAsia="zh-CN"/>
         </w:rPr>
       </w:pPr>
-      <w:bookmarkStart w:id="6" w:name="_Toc28378"/>
+      <w:bookmarkStart w:id="6" w:name="_Toc20970"/>
       <w:r>
         <w:rPr>
           <w:rFonts w:hint="default" w:ascii="Times New Roman" w:hAnsi="Times New Roman" w:eastAsia="宋体" w:cs="Times New Roman"/>
@@ -7116,7 +7152,7 @@
           <w:szCs w:val="24"/>
         </w:rPr>
       </w:pPr>
-      <w:bookmarkStart w:id="7" w:name="_Toc12318"/>
+      <w:bookmarkStart w:id="7" w:name="_Toc29931"/>
       <w:r>
         <w:rPr>
           <w:rFonts w:hint="default" w:ascii="Times New Roman" w:hAnsi="Times New Roman" w:eastAsia="宋体" w:cs="Times New Roman"/>
@@ -7207,7 +7243,199 @@
           <w:szCs w:val="24"/>
           <w:shd w:val="clear" w:fill="FFFFFF"/>
         </w:rPr>
-        <w:t>刻印是构筑的基础单元。每枚刻印是一个独立的蓝图类，同时包含本位和变位两套行为逻辑。本位（Base）是技能的核心行为骨架，界定“做什么”，在关键生命周期节点发出事件。每枚刻印为三个功能槽（普攻/技能/位移）各设计一套本位逻辑，分别对应不同的释放方式和数值强度。变位（Variant）是技能的修饰行为模块，接收本位发出的事件，检测触发条件后执行响应逻辑。变位逻辑只做一套，通用于三个功能槽，通过在事件响应中判断当前功能槽类型来区分处理。</w:t>
+        <w:t>刻印是构筑的基础单元。每枚刻印是一个独立的蓝图类，同时包含本位和变位两套行为逻辑。本位（Base）是技能的核心行为骨架，界定“做什么”，在关键生命周期节点发出事件。每枚刻印为三个功能槽（普攻/技能/位移）各设计一套本位逻辑，分别对应不同的释放方式和数值强度。变位（Variant）是技能的修饰行为模块，接收本位发出的事件，检测触发条件后执行响应逻辑。变位对本位的影响遵循三层优先级：</w:t>
+      </w:r>
+    </w:p>
+    <w:p>
+      <w:pPr>
+        <w:pStyle w:val="12"/>
+        <w:keepNext w:val="0"/>
+        <w:keepLines w:val="0"/>
+        <w:pageBreakBefore w:val="0"/>
+        <w:widowControl/>
+        <w:suppressLineNumbers w:val="0"/>
+        <w:shd w:val="clear" w:fill="FFFFFF"/>
+        <w:kinsoku/>
+        <w:wordWrap w:val="0"/>
+        <w:overflowPunct/>
+        <w:topLinePunct w:val="0"/>
+        <w:autoSpaceDE/>
+        <w:autoSpaceDN/>
+        <w:bidi w:val="0"/>
+        <w:adjustRightInd/>
+        <w:snapToGrid/>
+        <w:spacing w:beforeAutospacing="0" w:afterAutospacing="0" w:line="240" w:lineRule="auto"/>
+        <w:ind w:left="0" w:right="0" w:firstLine="420" w:firstLineChars="0"/>
+        <w:textAlignment w:val="auto"/>
+        <w:rPr>
+          <w:rFonts w:hint="default" w:ascii="Times New Roman" w:hAnsi="Times New Roman" w:eastAsia="宋体" w:cs="Times New Roman"/>
+          <w:i w:val="0"/>
+          <w:iCs w:val="0"/>
+          <w:caps w:val="0"/>
+          <w:color w:val="0F1115"/>
+          <w:spacing w:val="0"/>
+          <w:sz w:val="24"/>
+          <w:szCs w:val="24"/>
+          <w:shd w:val="clear" w:fill="FFFFFF"/>
+        </w:rPr>
+      </w:pPr>
+      <w:r>
+        <w:rPr>
+          <w:rFonts w:hint="default" w:ascii="Times New Roman" w:hAnsi="Times New Roman" w:eastAsia="宋体" w:cs="Times New Roman"/>
+          <w:i w:val="0"/>
+          <w:iCs w:val="0"/>
+          <w:caps w:val="0"/>
+          <w:color w:val="0F1115"/>
+          <w:spacing w:val="0"/>
+          <w:sz w:val="24"/>
+          <w:szCs w:val="24"/>
+          <w:shd w:val="clear" w:fill="FFFFFF"/>
+        </w:rPr>
+        <w:t>第一优先（数据修改）：变位通过修改 FBaseEventContext 中的数据字段（如伤害倍率、投射物数量、速度倍率等）影响本位的执行结果。这是最常用、最干净的方式，本位完全不知道变位的存在，只读取 Context 中的数据。</w:t>
+      </w:r>
+    </w:p>
+    <w:p>
+      <w:pPr>
+        <w:pStyle w:val="12"/>
+        <w:keepNext w:val="0"/>
+        <w:keepLines w:val="0"/>
+        <w:pageBreakBefore w:val="0"/>
+        <w:widowControl/>
+        <w:suppressLineNumbers w:val="0"/>
+        <w:shd w:val="clear" w:fill="FFFFFF"/>
+        <w:kinsoku/>
+        <w:wordWrap w:val="0"/>
+        <w:overflowPunct/>
+        <w:topLinePunct w:val="0"/>
+        <w:autoSpaceDE/>
+        <w:autoSpaceDN/>
+        <w:bidi w:val="0"/>
+        <w:adjustRightInd/>
+        <w:snapToGrid/>
+        <w:spacing w:beforeAutospacing="0" w:afterAutospacing="0" w:line="240" w:lineRule="auto"/>
+        <w:ind w:left="0" w:right="0" w:firstLine="420" w:firstLineChars="0"/>
+        <w:textAlignment w:val="auto"/>
+        <w:rPr>
+          <w:rFonts w:hint="default" w:ascii="Times New Roman" w:hAnsi="Times New Roman" w:eastAsia="宋体" w:cs="Times New Roman"/>
+          <w:i w:val="0"/>
+          <w:iCs w:val="0"/>
+          <w:caps w:val="0"/>
+          <w:color w:val="0F1115"/>
+          <w:spacing w:val="0"/>
+          <w:sz w:val="24"/>
+          <w:szCs w:val="24"/>
+          <w:shd w:val="clear" w:fill="FFFFFF"/>
+        </w:rPr>
+      </w:pPr>
+      <w:r>
+        <w:rPr>
+          <w:rFonts w:hint="default" w:ascii="Times New Roman" w:hAnsi="Times New Roman" w:eastAsia="宋体" w:cs="Times New Roman"/>
+          <w:i w:val="0"/>
+          <w:iCs w:val="0"/>
+          <w:caps w:val="0"/>
+          <w:color w:val="0F1115"/>
+          <w:spacing w:val="0"/>
+          <w:sz w:val="24"/>
+          <w:szCs w:val="24"/>
+          <w:shd w:val="clear" w:fill="FFFFFF"/>
+        </w:rPr>
+        <w:t>第二优先（事件挂载增量逻辑）：变位通过监听本位广播的事件（OnCast、OnHit、OnFinish 等），在事件响应中执行额外的逻辑（如命中后追加 DOT、触发爆炸等），不修改本位本身的执行流程。</w:t>
+      </w:r>
+    </w:p>
+    <w:p>
+      <w:pPr>
+        <w:pStyle w:val="12"/>
+        <w:keepNext w:val="0"/>
+        <w:keepLines w:val="0"/>
+        <w:pageBreakBefore w:val="0"/>
+        <w:widowControl/>
+        <w:suppressLineNumbers w:val="0"/>
+        <w:shd w:val="clear" w:fill="FFFFFF"/>
+        <w:kinsoku/>
+        <w:wordWrap w:val="0"/>
+        <w:overflowPunct/>
+        <w:topLinePunct w:val="0"/>
+        <w:autoSpaceDE/>
+        <w:autoSpaceDN/>
+        <w:bidi w:val="0"/>
+        <w:adjustRightInd/>
+        <w:snapToGrid/>
+        <w:spacing w:beforeAutospacing="0" w:afterAutospacing="0" w:line="240" w:lineRule="auto"/>
+        <w:ind w:left="0" w:right="0" w:firstLine="420" w:firstLineChars="0"/>
+        <w:textAlignment w:val="auto"/>
+        <w:rPr>
+          <w:rFonts w:hint="default" w:ascii="Times New Roman" w:hAnsi="Times New Roman" w:eastAsia="宋体" w:cs="Times New Roman"/>
+          <w:i w:val="0"/>
+          <w:iCs w:val="0"/>
+          <w:caps w:val="0"/>
+          <w:color w:val="0F1115"/>
+          <w:spacing w:val="0"/>
+          <w:sz w:val="24"/>
+          <w:szCs w:val="24"/>
+          <w:shd w:val="clear" w:fill="FFFFFF"/>
+        </w:rPr>
+      </w:pPr>
+      <w:r>
+        <w:rPr>
+          <w:rFonts w:hint="default" w:ascii="Times New Roman" w:hAnsi="Times New Roman" w:eastAsia="宋体" w:cs="Times New Roman"/>
+          <w:i w:val="0"/>
+          <w:iCs w:val="0"/>
+          <w:caps w:val="0"/>
+          <w:color w:val="0F1115"/>
+          <w:spacing w:val="0"/>
+          <w:sz w:val="24"/>
+          <w:szCs w:val="24"/>
+          <w:shd w:val="clear" w:fill="FFFFFF"/>
+        </w:rPr>
+        <w:t>第三优先（管理层覆盖）：在极少数需要完全改变本位行为的情况下，由 UGlyphInventoryComponent 在 ExecuteSlot 中判断是否由变位接管执行。此方式为最后手段，当前阶段暂不实现，待后续有足够真实需求时再引入。</w:t>
+      </w:r>
+    </w:p>
+    <w:p>
+      <w:pPr>
+        <w:pStyle w:val="12"/>
+        <w:keepNext w:val="0"/>
+        <w:keepLines w:val="0"/>
+        <w:pageBreakBefore w:val="0"/>
+        <w:widowControl/>
+        <w:suppressLineNumbers w:val="0"/>
+        <w:shd w:val="clear" w:fill="FFFFFF"/>
+        <w:kinsoku/>
+        <w:wordWrap w:val="0"/>
+        <w:overflowPunct/>
+        <w:topLinePunct w:val="0"/>
+        <w:autoSpaceDE/>
+        <w:autoSpaceDN/>
+        <w:bidi w:val="0"/>
+        <w:adjustRightInd/>
+        <w:snapToGrid/>
+        <w:spacing w:beforeAutospacing="0" w:afterAutospacing="0" w:line="240" w:lineRule="auto"/>
+        <w:ind w:left="0" w:right="0" w:firstLine="420" w:firstLineChars="0"/>
+        <w:textAlignment w:val="auto"/>
+        <w:rPr>
+          <w:rFonts w:hint="default" w:ascii="Times New Roman" w:hAnsi="Times New Roman" w:eastAsia="宋体" w:cs="Times New Roman"/>
+          <w:i w:val="0"/>
+          <w:iCs w:val="0"/>
+          <w:caps w:val="0"/>
+          <w:color w:val="0F1115"/>
+          <w:spacing w:val="0"/>
+          <w:sz w:val="24"/>
+          <w:szCs w:val="24"/>
+          <w:shd w:val="clear" w:fill="FFFFFF"/>
+        </w:rPr>
+      </w:pPr>
+      <w:r>
+        <w:rPr>
+          <w:rFonts w:hint="default" w:ascii="Times New Roman" w:hAnsi="Times New Roman" w:eastAsia="宋体" w:cs="Times New Roman"/>
+          <w:i w:val="0"/>
+          <w:iCs w:val="0"/>
+          <w:caps w:val="0"/>
+          <w:color w:val="0F1115"/>
+          <w:spacing w:val="0"/>
+          <w:sz w:val="24"/>
+          <w:szCs w:val="24"/>
+          <w:shd w:val="clear" w:fill="FFFFFF"/>
+        </w:rPr>
+        <w:t>变位逻辑只做一套，通用于三个功能槽，通过在事件响应中判断当前功能槽类型来区分处理。</w:t>
       </w:r>
     </w:p>
     <w:p>
@@ -7374,7 +7602,7 @@
           <w:shd w:val="clear" w:fill="FFFFFF"/>
         </w:rPr>
       </w:pPr>
-      <w:bookmarkStart w:id="8" w:name="_Toc30523"/>
+      <w:bookmarkStart w:id="8" w:name="_Toc18917"/>
       <w:r>
         <w:rPr>
           <w:rFonts w:hint="default" w:ascii="Times New Roman" w:hAnsi="Times New Roman" w:eastAsia="宋体" w:cs="Times New Roman"/>
@@ -7606,7 +7834,7 @@
           <w:shd w:val="clear" w:fill="FFFFFF"/>
         </w:rPr>
       </w:pPr>
-      <w:bookmarkStart w:id="9" w:name="_Toc12564"/>
+      <w:bookmarkStart w:id="9" w:name="_Toc21681"/>
       <w:r>
         <w:rPr>
           <w:rFonts w:hint="default" w:ascii="Times New Roman" w:hAnsi="Times New Roman" w:eastAsia="宋体" w:cs="Times New Roman"/>
@@ -7733,6 +7961,54 @@
           <w:shd w:val="clear" w:fill="FFFFFF"/>
         </w:rPr>
       </w:pPr>
+      <w:r>
+        <w:rPr>
+          <w:rFonts w:hint="default" w:ascii="Times New Roman" w:hAnsi="Times New Roman" w:eastAsia="宋体" w:cs="Times New Roman"/>
+          <w:b w:val="0"/>
+          <w:bCs w:val="0"/>
+          <w:caps w:val="0"/>
+          <w:color w:val="0F1115"/>
+          <w:spacing w:val="0"/>
+          <w:sz w:val="24"/>
+          <w:szCs w:val="24"/>
+          <w:shd w:val="clear" w:fill="FFFFFF"/>
+        </w:rPr>
+        <w:t>同一时刻，库容中只能存在同一刻印类（如 BP_Glyph_Fire）的一个实例。重复获取时，不创建新实例，直接触发该刻印的等级晋升（上限三级）。此约束适用于所有获取途径。</w:t>
+      </w:r>
+    </w:p>
+    <w:p>
+      <w:pPr>
+        <w:keepNext w:val="0"/>
+        <w:keepLines w:val="0"/>
+        <w:pageBreakBefore w:val="0"/>
+        <w:widowControl/>
+        <w:suppressLineNumbers w:val="0"/>
+        <w:shd w:val="clear" w:fill="FFFFFF"/>
+        <w:kinsoku/>
+        <w:wordWrap w:val="0"/>
+        <w:overflowPunct/>
+        <w:topLinePunct w:val="0"/>
+        <w:autoSpaceDE/>
+        <w:autoSpaceDN/>
+        <w:bidi w:val="0"/>
+        <w:adjustRightInd/>
+        <w:snapToGrid/>
+        <w:spacing w:before="0" w:beforeAutospacing="0" w:after="0" w:afterAutospacing="0" w:line="240" w:lineRule="auto"/>
+        <w:ind w:left="0" w:right="0" w:firstLine="420" w:firstLineChars="0"/>
+        <w:textAlignment w:val="auto"/>
+        <w:outlineLvl w:val="9"/>
+        <w:rPr>
+          <w:rFonts w:hint="default" w:ascii="Times New Roman" w:hAnsi="Times New Roman" w:eastAsia="宋体" w:cs="Times New Roman"/>
+          <w:b w:val="0"/>
+          <w:bCs w:val="0"/>
+          <w:caps w:val="0"/>
+          <w:color w:val="0F1115"/>
+          <w:spacing w:val="0"/>
+          <w:sz w:val="24"/>
+          <w:szCs w:val="24"/>
+          <w:shd w:val="clear" w:fill="FFFFFF"/>
+        </w:rPr>
+      </w:pPr>
     </w:p>
     <w:p>
       <w:pPr>
@@ -7767,7 +8043,7 @@
           <w:szCs w:val="24"/>
         </w:rPr>
       </w:pPr>
-      <w:bookmarkStart w:id="10" w:name="_Toc1582"/>
+      <w:bookmarkStart w:id="10" w:name="_Toc3093"/>
       <w:r>
         <w:rPr>
           <w:rFonts w:hint="default" w:ascii="Times New Roman" w:hAnsi="Times New Roman" w:eastAsia="宋体" w:cs="Times New Roman"/>
@@ -8101,7 +8377,7 @@
           <w:szCs w:val="28"/>
         </w:rPr>
       </w:pPr>
-      <w:bookmarkStart w:id="11" w:name="_Toc11871"/>
+      <w:bookmarkStart w:id="11" w:name="_Toc16323"/>
       <w:r>
         <w:rPr>
           <w:rFonts w:hint="default" w:ascii="Times New Roman" w:hAnsi="Times New Roman" w:eastAsia="宋体" w:cs="Times New Roman"/>
@@ -8268,7 +8544,7 @@
           <w:lang w:val="en-US" w:eastAsia="zh-CN" w:bidi="ar"/>
         </w:rPr>
       </w:pPr>
-      <w:bookmarkStart w:id="12" w:name="_Toc28923"/>
+      <w:bookmarkStart w:id="12" w:name="_Toc13204"/>
       <w:r>
         <w:rPr>
           <w:rFonts w:hint="default" w:ascii="Times New Roman" w:hAnsi="Times New Roman" w:eastAsia="宋体" w:cs="Times New Roman"/>
@@ -9723,6 +9999,12 @@
             <w:insideH w:val="single" w:color="auto" w:sz="4" w:space="0"/>
             <w:insideV w:val="single" w:color="auto" w:sz="4" w:space="0"/>
           </w:tblBorders>
+          <w:tblCellMar>
+            <w:top w:w="0" w:type="dxa"/>
+            <w:left w:w="108" w:type="dxa"/>
+            <w:bottom w:w="0" w:type="dxa"/>
+            <w:right w:w="108" w:type="dxa"/>
+          </w:tblCellMar>
         </w:tblPrEx>
         <w:tc>
           <w:tcPr>
@@ -10663,7 +10945,7 @@
           <w:lang w:val="en-US" w:eastAsia="zh-CN" w:bidi="ar"/>
         </w:rPr>
       </w:pPr>
-      <w:bookmarkStart w:id="13" w:name="_Toc8845"/>
+      <w:bookmarkStart w:id="13" w:name="_Toc5698"/>
       <w:r>
         <w:rPr>
           <w:rFonts w:hint="default" w:ascii="Times New Roman" w:hAnsi="Times New Roman" w:eastAsia="宋体" w:cs="Times New Roman"/>
@@ -12487,6 +12769,12 @@
             <w:insideH w:val="single" w:color="auto" w:sz="4" w:space="0"/>
             <w:insideV w:val="single" w:color="auto" w:sz="4" w:space="0"/>
           </w:tblBorders>
+          <w:tblCellMar>
+            <w:top w:w="0" w:type="dxa"/>
+            <w:left w:w="108" w:type="dxa"/>
+            <w:bottom w:w="0" w:type="dxa"/>
+            <w:right w:w="108" w:type="dxa"/>
+          </w:tblCellMar>
         </w:tblPrEx>
         <w:tc>
           <w:tcPr>
@@ -13367,7 +13655,7 @@
           <w:lang w:val="en-US" w:eastAsia="zh-CN" w:bidi="ar"/>
         </w:rPr>
       </w:pPr>
-      <w:bookmarkStart w:id="14" w:name="_Toc24790"/>
+      <w:bookmarkStart w:id="14" w:name="_Toc13256"/>
       <w:r>
         <w:rPr>
           <w:rFonts w:hint="default" w:ascii="Times New Roman" w:hAnsi="Times New Roman" w:eastAsia="宋体" w:cs="Times New Roman"/>
@@ -13552,7 +13840,7 @@
           <w:lang w:val="en-US" w:eastAsia="zh-CN" w:bidi="ar"/>
         </w:rPr>
       </w:pPr>
-      <w:bookmarkStart w:id="15" w:name="_Toc12145"/>
+      <w:bookmarkStart w:id="15" w:name="_Toc19120"/>
       <w:r>
         <w:rPr>
           <w:rFonts w:hint="default" w:ascii="Times New Roman" w:hAnsi="Times New Roman" w:eastAsia="宋体" w:cs="Times New Roman"/>
@@ -13689,7 +13977,7 @@
           <w:szCs w:val="28"/>
         </w:rPr>
       </w:pPr>
-      <w:bookmarkStart w:id="16" w:name="_Toc24557"/>
+      <w:bookmarkStart w:id="16" w:name="_Toc14079"/>
       <w:r>
         <w:rPr>
           <w:rFonts w:hint="default" w:ascii="Times New Roman" w:hAnsi="Times New Roman" w:eastAsia="宋体" w:cs="Times New Roman"/>
@@ -13856,7 +14144,7 @@
           <w:szCs w:val="30"/>
         </w:rPr>
       </w:pPr>
-      <w:bookmarkStart w:id="17" w:name="_Toc3970"/>
+      <w:bookmarkStart w:id="17" w:name="_Toc8372"/>
       <w:r>
         <w:rPr>
           <w:rFonts w:hint="default" w:ascii="Times New Roman" w:hAnsi="Times New Roman" w:eastAsia="宋体" w:cs="Times New Roman"/>
@@ -13906,7 +14194,7 @@
           <w:szCs w:val="28"/>
         </w:rPr>
       </w:pPr>
-      <w:bookmarkStart w:id="18" w:name="_Toc15318"/>
+      <w:bookmarkStart w:id="18" w:name="_Toc21150"/>
       <w:r>
         <w:rPr>
           <w:rFonts w:hint="default" w:ascii="Times New Roman" w:hAnsi="Times New Roman" w:eastAsia="宋体" w:cs="Times New Roman"/>
@@ -14592,6 +14880,7 @@
             <w:insideH w:val="none" w:color="auto" w:sz="0" w:space="0"/>
             <w:insideV w:val="none" w:color="auto" w:sz="0" w:space="0"/>
           </w:tblBorders>
+          <w:shd w:val="clear" w:color="auto" w:fill="FFFFFF"/>
           <w:tblCellMar>
             <w:top w:w="15" w:type="dxa"/>
             <w:left w:w="15" w:type="dxa"/>
@@ -14805,6 +15094,7 @@
             <w:insideH w:val="none" w:color="auto" w:sz="0" w:space="0"/>
             <w:insideV w:val="none" w:color="auto" w:sz="0" w:space="0"/>
           </w:tblBorders>
+          <w:shd w:val="clear" w:color="auto" w:fill="FFFFFF"/>
           <w:tblCellMar>
             <w:top w:w="15" w:type="dxa"/>
             <w:left w:w="15" w:type="dxa"/>
@@ -15484,7 +15774,7 @@
           <w:szCs w:val="24"/>
           <w:shd w:val="clear" w:fill="FFFFFF"/>
         </w:rPr>
-        <w:t>每个本位事件内部执行三件事：执行本位行为、调用工具组件函数、广播事件给变位。</w:t>
+        <w:t>每个本位事件内部执行三件事：执行本位行为、调用工具组件函数、广播事件给变位。本位不持有任何变位的引用，也不为变位预留任何逻辑分支。本位只读取 FBaseEventContext 中的数据，不知道数据是被谁修改的。这保证了“本位不知道变位存在”的设计原则。</w:t>
       </w:r>
     </w:p>
     <w:p>
@@ -15712,7 +16002,7 @@
           <w:szCs w:val="28"/>
         </w:rPr>
       </w:pPr>
-      <w:bookmarkStart w:id="19" w:name="_Toc19219"/>
+      <w:bookmarkStart w:id="19" w:name="_Toc16113"/>
       <w:r>
         <w:rPr>
           <w:rFonts w:hint="default" w:ascii="Times New Roman" w:hAnsi="Times New Roman" w:eastAsia="宋体" w:cs="Times New Roman"/>
@@ -15859,7 +16149,7 @@
           <w:szCs w:val="24"/>
           <w:shd w:val="clear" w:fill="FFFFFF"/>
         </w:rPr>
-        <w:t>事件流：功能槽 Ability 被激活后调用 InventoryComponent 的 ExecuteSlot(SlotType, AbilityRef)，InventoryComponent 获取对应槽位的本位刻印并调用其执行函数，传入 AbilityRef。本位刻印通过 AbilityRef 调用 GAS 功能完成核心行为，然后调用 Broadcast 广播事件。变位刻印在 OnEventReceived 中接收事件，通过 InventoryComponent 获取本位刻印引用进行交互（修改本位状态、获取数据等），执行响应逻辑。功能槽类型通过 CurrentSlotType 字段传递给变位。</w:t>
+        <w:t>事件流：功能槽 Ability 被激活后调用 InventoryComponent 的 ExecuteSlot(SlotType, AbilityRef)，InventoryComponent 获取对应槽位的本位刻印并调用其执行函数，传入 AbilityRef。本位刻印通过 AbilityRef 调用 GAS 功能完成核心行为，然后调用 Broadcast 广播事件。变位刻印在 OnEventReceived 中接收事件，通过修改 FBaseEventContext 中的数据来影响本位的执行结果（第一优先），或执行额外的增量逻辑（第二优先）。变位不直接调用本位的内部函数，所有交互通过 Context 和事件广播完成。功能槽类型通过 CurrentSlotType 字段传递给变位。</w:t>
       </w:r>
     </w:p>
     <w:p>
@@ -15932,7 +16222,7 @@
           <w:shd w:val="clear" w:fill="FFFFFF"/>
         </w:rPr>
       </w:pPr>
-      <w:bookmarkStart w:id="20" w:name="_Toc20578"/>
+      <w:bookmarkStart w:id="20" w:name="_Toc17970"/>
       <w:r>
         <w:rPr>
           <w:rFonts w:hint="default" w:ascii="Times New Roman" w:hAnsi="Times New Roman" w:eastAsia="宋体" w:cs="Times New Roman"/>
@@ -16302,6 +16592,7 @@
             <w:insideH w:val="none" w:color="auto" w:sz="0" w:space="0"/>
             <w:insideV w:val="none" w:color="auto" w:sz="0" w:space="0"/>
           </w:tblBorders>
+          <w:shd w:val="clear" w:color="auto" w:fill="FFFFFF"/>
           <w:tblCellMar>
             <w:top w:w="15" w:type="dxa"/>
             <w:left w:w="15" w:type="dxa"/>
@@ -16515,6 +16806,7 @@
             <w:insideH w:val="none" w:color="auto" w:sz="0" w:space="0"/>
             <w:insideV w:val="none" w:color="auto" w:sz="0" w:space="0"/>
           </w:tblBorders>
+          <w:shd w:val="clear" w:color="auto" w:fill="FFFFFF"/>
           <w:tblCellMar>
             <w:top w:w="15" w:type="dxa"/>
             <w:left w:w="15" w:type="dxa"/>
@@ -16942,6 +17234,7 @@
             <w:insideH w:val="none" w:color="auto" w:sz="0" w:space="0"/>
             <w:insideV w:val="none" w:color="auto" w:sz="0" w:space="0"/>
           </w:tblBorders>
+          <w:shd w:val="clear" w:color="auto" w:fill="FFFFFF"/>
           <w:tblCellMar>
             <w:top w:w="15" w:type="dxa"/>
             <w:left w:w="15" w:type="dxa"/>
@@ -17195,6 +17488,43 @@
         <w:bidi w:val="0"/>
         <w:adjustRightInd/>
         <w:snapToGrid/>
+        <w:ind w:firstLine="420" w:firstLineChars="0"/>
+        <w:textAlignment w:val="auto"/>
+        <w:rPr>
+          <w:rFonts w:hint="default" w:ascii="Times New Roman" w:hAnsi="Times New Roman" w:eastAsia="宋体" w:cs="Times New Roman"/>
+          <w:b w:val="0"/>
+          <w:bCs w:val="0"/>
+          <w:sz w:val="24"/>
+          <w:szCs w:val="24"/>
+        </w:rPr>
+      </w:pPr>
+      <w:r>
+        <w:rPr>
+          <w:rFonts w:hint="default" w:ascii="Times New Roman" w:hAnsi="Times New Roman" w:eastAsia="宋体" w:cs="Times New Roman"/>
+          <w:b w:val="0"/>
+          <w:bCs w:val="0"/>
+          <w:sz w:val="24"/>
+          <w:szCs w:val="24"/>
+        </w:rPr>
+        <w:t>投射物（ABaseProjectile）持有源刻印的引用（SourceGlyph），不持有 AbilityRef。命中时通过 SourceGlyph 调用伤害函数，由刻印负责伤害计算和信息素记录。投射物的 Owner 设为角色，用于引擎层的所有权追溯。</w:t>
+      </w:r>
+      <w:bookmarkStart w:id="51" w:name="_GoBack"/>
+      <w:bookmarkEnd w:id="51"/>
+    </w:p>
+    <w:p>
+      <w:pPr>
+        <w:keepNext w:val="0"/>
+        <w:keepLines w:val="0"/>
+        <w:pageBreakBefore w:val="0"/>
+        <w:kinsoku/>
+        <w:wordWrap w:val="0"/>
+        <w:overflowPunct/>
+        <w:topLinePunct w:val="0"/>
+        <w:autoSpaceDE/>
+        <w:autoSpaceDN/>
+        <w:bidi w:val="0"/>
+        <w:adjustRightInd/>
+        <w:snapToGrid/>
         <w:textAlignment w:val="auto"/>
         <w:rPr>
           <w:rFonts w:hint="default"/>
@@ -17239,7 +17569,7 @@
           <w:shd w:val="clear" w:fill="FFFFFF"/>
         </w:rPr>
       </w:pPr>
-      <w:bookmarkStart w:id="21" w:name="_Toc6224"/>
+      <w:bookmarkStart w:id="21" w:name="_Toc5231"/>
       <w:r>
         <w:rPr>
           <w:rFonts w:hint="default" w:ascii="Times New Roman" w:hAnsi="Times New Roman" w:eastAsia="宋体" w:cs="Times New Roman"/>
@@ -17406,7 +17736,7 @@
           <w:szCs w:val="30"/>
         </w:rPr>
       </w:pPr>
-      <w:bookmarkStart w:id="22" w:name="_Toc9767"/>
+      <w:bookmarkStart w:id="22" w:name="_Toc25510"/>
       <w:r>
         <w:rPr>
           <w:rFonts w:hint="default" w:ascii="Times New Roman" w:hAnsi="Times New Roman" w:eastAsia="宋体" w:cs="Times New Roman"/>
@@ -17456,7 +17786,7 @@
           <w:szCs w:val="28"/>
         </w:rPr>
       </w:pPr>
-      <w:bookmarkStart w:id="23" w:name="_Toc17450"/>
+      <w:bookmarkStart w:id="23" w:name="_Toc22121"/>
       <w:r>
         <w:rPr>
           <w:rFonts w:hint="default" w:ascii="Times New Roman" w:hAnsi="Times New Roman" w:eastAsia="宋体" w:cs="Times New Roman"/>
@@ -17617,7 +17947,7 @@
           <w:szCs w:val="28"/>
         </w:rPr>
       </w:pPr>
-      <w:bookmarkStart w:id="24" w:name="_Toc27200"/>
+      <w:bookmarkStart w:id="24" w:name="_Toc29275"/>
       <w:r>
         <w:rPr>
           <w:rFonts w:hint="default" w:ascii="Times New Roman" w:hAnsi="Times New Roman" w:eastAsia="宋体" w:cs="Times New Roman"/>
@@ -17826,7 +18156,7 @@
           <w:szCs w:val="28"/>
         </w:rPr>
       </w:pPr>
-      <w:bookmarkStart w:id="25" w:name="_Toc13202"/>
+      <w:bookmarkStart w:id="25" w:name="_Toc16771"/>
       <w:r>
         <w:rPr>
           <w:rFonts w:hint="default" w:ascii="Times New Roman" w:hAnsi="Times New Roman" w:eastAsia="宋体" w:cs="Times New Roman"/>
@@ -18021,7 +18351,7 @@
           <w:szCs w:val="24"/>
         </w:rPr>
       </w:pPr>
-      <w:bookmarkStart w:id="26" w:name="_Toc12556"/>
+      <w:bookmarkStart w:id="26" w:name="_Toc11272"/>
       <w:r>
         <w:rPr>
           <w:rFonts w:hint="default" w:ascii="Times New Roman" w:hAnsi="Times New Roman" w:eastAsia="宋体" w:cs="Times New Roman"/>
@@ -18071,7 +18401,7 @@
           <w:szCs w:val="28"/>
         </w:rPr>
       </w:pPr>
-      <w:bookmarkStart w:id="27" w:name="_Toc18366"/>
+      <w:bookmarkStart w:id="27" w:name="_Toc25006"/>
       <w:r>
         <w:rPr>
           <w:rFonts w:hint="default" w:ascii="Times New Roman" w:hAnsi="Times New Roman" w:eastAsia="宋体" w:cs="Times New Roman"/>
@@ -19923,7 +20253,7 @@
           <w:szCs w:val="28"/>
         </w:rPr>
       </w:pPr>
-      <w:bookmarkStart w:id="28" w:name="_Toc17402"/>
+      <w:bookmarkStart w:id="28" w:name="_Toc10630"/>
       <w:r>
         <w:rPr>
           <w:rFonts w:hint="default" w:ascii="Times New Roman" w:hAnsi="Times New Roman" w:eastAsia="宋体" w:cs="Times New Roman"/>
@@ -20006,6 +20336,7 @@
             <w:insideH w:val="none" w:color="auto" w:sz="0" w:space="0"/>
             <w:insideV w:val="none" w:color="auto" w:sz="0" w:space="0"/>
           </w:tblBorders>
+          <w:shd w:val="clear" w:color="auto" w:fill="FFFFFF"/>
           <w:tblCellMar>
             <w:top w:w="15" w:type="dxa"/>
             <w:left w:w="15" w:type="dxa"/>
@@ -21164,6 +21495,7 @@
             <w:insideH w:val="none" w:color="auto" w:sz="0" w:space="0"/>
             <w:insideV w:val="none" w:color="auto" w:sz="0" w:space="0"/>
           </w:tblBorders>
+          <w:shd w:val="clear" w:color="auto" w:fill="FFFFFF"/>
           <w:tblCellMar>
             <w:top w:w="15" w:type="dxa"/>
             <w:left w:w="15" w:type="dxa"/>
@@ -21524,7 +21856,6 @@
             <w:insideH w:val="none" w:color="auto" w:sz="0" w:space="0"/>
             <w:insideV w:val="none" w:color="auto" w:sz="0" w:space="0"/>
           </w:tblBorders>
-          <w:shd w:val="clear" w:color="auto" w:fill="FFFFFF"/>
           <w:tblCellMar>
             <w:top w:w="15" w:type="dxa"/>
             <w:left w:w="15" w:type="dxa"/>
@@ -21763,7 +22094,7 @@
           <w:szCs w:val="28"/>
         </w:rPr>
       </w:pPr>
-      <w:bookmarkStart w:id="29" w:name="_Toc1346"/>
+      <w:bookmarkStart w:id="29" w:name="_Toc32336"/>
       <w:r>
         <w:rPr>
           <w:rFonts w:hint="default" w:ascii="Times New Roman" w:hAnsi="Times New Roman" w:eastAsia="宋体" w:cs="Times New Roman"/>
@@ -21843,7 +22174,7 @@
           <w:shd w:val="clear" w:fill="FFFFFF"/>
         </w:rPr>
       </w:pPr>
-      <w:bookmarkStart w:id="30" w:name="_Toc31395"/>
+      <w:bookmarkStart w:id="30" w:name="_Toc1772"/>
       <w:r>
         <w:rPr>
           <w:rFonts w:hint="default" w:ascii="Times New Roman" w:hAnsi="Times New Roman" w:eastAsia="宋体" w:cs="Times New Roman"/>
@@ -22024,7 +22355,7 @@
           <w:szCs w:val="24"/>
         </w:rPr>
       </w:pPr>
-      <w:bookmarkStart w:id="31" w:name="_Toc7493"/>
+      <w:bookmarkStart w:id="31" w:name="_Toc29790"/>
       <w:r>
         <w:rPr>
           <w:rFonts w:hint="default" w:ascii="Times New Roman" w:hAnsi="Times New Roman" w:eastAsia="宋体" w:cs="Times New Roman"/>
@@ -22131,7 +22462,56 @@
           <w:sz w:val="24"/>
           <w:szCs w:val="24"/>
         </w:rPr>
-        <w:t>ID、DisplayName、MaxLevel、CurrentLevel）。本位事件 OnCast、OnSpawn、OnTravel、OnHit、OnFinish 为 BlueprintNativeEvent。变位事件接收 OnEventReceived 为 BlueprintNativeEvent。事件广播系统提供 BroadcastEvent 函数。基类持有 DamageComp、StatusComp、VFXComp、AudioComp 四个工具组件的引用指针，由构造函数使用 NewObject 创建并赋值。</w:t>
+        <w:t>ID、DisplayName、MaxLevel、CurrentLevel）。本位事件 OnCast、OnSpawn、OnTravel、OnHit、OnFinish 为 BlueprintNativeEvent。变位事件接收 OnEventReceived 为 BlueprintNativeEvent。事件广播系统提供 BroadcastEvent 函数</w:t>
+      </w:r>
+      <w:r>
+        <w:rPr>
+          <w:rFonts w:hint="eastAsia" w:ascii="Times New Roman" w:hAnsi="Times New Roman" w:eastAsia="宋体" w:cs="Times New Roman"/>
+          <w:sz w:val="24"/>
+          <w:szCs w:val="24"/>
+          <w:lang w:eastAsia="zh-CN"/>
+        </w:rPr>
+        <w:t>，通过修改 Context 数据或执行增量逻辑来影响本位</w:t>
+      </w:r>
+      <w:r>
+        <w:rPr>
+          <w:rFonts w:hint="default" w:ascii="Times New Roman" w:hAnsi="Times New Roman" w:eastAsia="宋体" w:cs="Times New Roman"/>
+          <w:sz w:val="24"/>
+          <w:szCs w:val="24"/>
+        </w:rPr>
+        <w:t>。</w:t>
+      </w:r>
+    </w:p>
+    <w:p>
+      <w:pPr>
+        <w:keepNext w:val="0"/>
+        <w:keepLines w:val="0"/>
+        <w:pageBreakBefore w:val="0"/>
+        <w:kinsoku/>
+        <w:wordWrap w:val="0"/>
+        <w:overflowPunct/>
+        <w:topLinePunct w:val="0"/>
+        <w:autoSpaceDE/>
+        <w:autoSpaceDN/>
+        <w:bidi w:val="0"/>
+        <w:adjustRightInd/>
+        <w:snapToGrid/>
+        <w:spacing w:line="240" w:lineRule="auto"/>
+        <w:ind w:firstLine="420" w:firstLineChars="0"/>
+        <w:textAlignment w:val="auto"/>
+        <w:rPr>
+          <w:rFonts w:hint="default" w:ascii="Times New Roman" w:hAnsi="Times New Roman" w:eastAsia="宋体" w:cs="Times New Roman"/>
+          <w:sz w:val="24"/>
+          <w:szCs w:val="24"/>
+        </w:rPr>
+      </w:pPr>
+      <w:r>
+        <w:rPr>
+          <w:rFonts w:hint="default" w:ascii="Times New Roman" w:hAnsi="Times New Roman" w:eastAsia="宋体" w:cs="Times New Roman"/>
+          <w:sz w:val="24"/>
+          <w:szCs w:val="24"/>
+        </w:rPr>
+        <w:t>FBaseEventContext 包含本位执行所需的所有可变参数（伤害倍率、投射物数量、速度倍率、范围倍率、投射物类覆盖等），变位通过修改这些数据点来影响本位行为，无需修改本位代码。基类持有 DamageComp、StatusComp、VFXComp、AudioComp 四个工具组件的引用指针，由构造函数使用 NewObject 创建并赋值。</w:t>
       </w:r>
     </w:p>
     <w:p>
@@ -22191,7 +22571,7 @@
           <w:szCs w:val="24"/>
         </w:rPr>
       </w:pPr>
-      <w:bookmarkStart w:id="32" w:name="_Toc25023"/>
+      <w:bookmarkStart w:id="32" w:name="_Toc428"/>
       <w:r>
         <w:rPr>
           <w:rFonts w:hint="default" w:ascii="Times New Roman" w:hAnsi="Times New Roman" w:eastAsia="宋体" w:cs="Times New Roman"/>
@@ -22334,7 +22714,7 @@
           <w:lang w:val="en-US" w:eastAsia="zh-CN" w:bidi="ar"/>
         </w:rPr>
       </w:pPr>
-      <w:bookmarkStart w:id="33" w:name="_Toc12577"/>
+      <w:bookmarkStart w:id="33" w:name="_Toc22150"/>
       <w:r>
         <w:rPr>
           <w:rFonts w:hint="default" w:ascii="Times New Roman" w:hAnsi="Times New Roman" w:eastAsia="宋体" w:cs="Times New Roman"/>
@@ -22495,7 +22875,7 @@
           <w:szCs w:val="28"/>
         </w:rPr>
       </w:pPr>
-      <w:bookmarkStart w:id="34" w:name="_Toc18106"/>
+      <w:bookmarkStart w:id="34" w:name="_Toc10391"/>
       <w:r>
         <w:rPr>
           <w:rFonts w:hint="default" w:ascii="Times New Roman" w:hAnsi="Times New Roman" w:eastAsia="宋体" w:cs="Times New Roman"/>
@@ -22659,7 +23039,7 @@
           <w:shd w:val="clear" w:fill="FFFFFF"/>
         </w:rPr>
       </w:pPr>
-      <w:bookmarkStart w:id="35" w:name="_Toc11300"/>
+      <w:bookmarkStart w:id="35" w:name="_Toc11186"/>
       <w:r>
         <w:rPr>
           <w:rFonts w:hint="default" w:ascii="Times New Roman" w:hAnsi="Times New Roman" w:eastAsia="宋体" w:cs="Times New Roman"/>
@@ -22855,7 +23235,7 @@
           <w:szCs w:val="30"/>
         </w:rPr>
       </w:pPr>
-      <w:bookmarkStart w:id="36" w:name="_Toc13554"/>
+      <w:bookmarkStart w:id="36" w:name="_Toc13548"/>
       <w:r>
         <w:rPr>
           <w:rFonts w:hint="default" w:ascii="Times New Roman" w:hAnsi="Times New Roman" w:eastAsia="宋体" w:cs="Times New Roman"/>
@@ -22906,7 +23286,7 @@
           <w:shd w:val="clear" w:fill="FFFFFF"/>
         </w:rPr>
       </w:pPr>
-      <w:bookmarkStart w:id="37" w:name="_Toc11352"/>
+      <w:bookmarkStart w:id="37" w:name="_Toc9809"/>
       <w:r>
         <w:rPr>
           <w:rFonts w:hint="default" w:ascii="Times New Roman" w:hAnsi="Times New Roman" w:eastAsia="宋体" w:cs="Times New Roman"/>
@@ -23244,6 +23624,7 @@
             <w:insideH w:val="none" w:color="auto" w:sz="0" w:space="0"/>
             <w:insideV w:val="none" w:color="auto" w:sz="0" w:space="0"/>
           </w:tblBorders>
+          <w:shd w:val="clear" w:color="auto" w:fill="FFFFFF"/>
           <w:tblCellMar>
             <w:top w:w="15" w:type="dxa"/>
             <w:left w:w="15" w:type="dxa"/>
@@ -23744,6 +24125,7 @@
             <w:insideH w:val="none" w:color="auto" w:sz="0" w:space="0"/>
             <w:insideV w:val="none" w:color="auto" w:sz="0" w:space="0"/>
           </w:tblBorders>
+          <w:shd w:val="clear" w:color="auto" w:fill="FFFFFF"/>
           <w:tblCellMar>
             <w:top w:w="15" w:type="dxa"/>
             <w:left w:w="15" w:type="dxa"/>
@@ -24552,7 +24934,7 @@
           <w:szCs w:val="28"/>
         </w:rPr>
       </w:pPr>
-      <w:bookmarkStart w:id="38" w:name="_Toc6629"/>
+      <w:bookmarkStart w:id="38" w:name="_Toc7383"/>
       <w:r>
         <w:rPr>
           <w:rFonts w:hint="default" w:ascii="Times New Roman" w:hAnsi="Times New Roman" w:eastAsia="宋体" w:cs="Times New Roman"/>
@@ -25049,6 +25431,7 @@
             <w:insideH w:val="none" w:color="auto" w:sz="0" w:space="0"/>
             <w:insideV w:val="none" w:color="auto" w:sz="0" w:space="0"/>
           </w:tblBorders>
+          <w:shd w:val="clear" w:color="auto" w:fill="FFFFFF"/>
           <w:tblCellMar>
             <w:top w:w="15" w:type="dxa"/>
             <w:left w:w="15" w:type="dxa"/>
@@ -25377,6 +25760,688 @@
                 <w:lang w:val="en-US" w:eastAsia="zh-CN"/>
               </w:rPr>
               <w:t>命中目标挂上对应属性持续伤害</w:t>
+            </w:r>
+          </w:p>
+        </w:tc>
+      </w:tr>
+      <w:tr>
+        <w:tblPrEx>
+          <w:tblBorders>
+            <w:top w:val="none" w:color="auto" w:sz="0" w:space="0"/>
+            <w:left w:val="none" w:color="auto" w:sz="0" w:space="0"/>
+            <w:bottom w:val="none" w:color="auto" w:sz="0" w:space="0"/>
+            <w:right w:val="none" w:color="auto" w:sz="0" w:space="0"/>
+            <w:insideH w:val="none" w:color="auto" w:sz="0" w:space="0"/>
+            <w:insideV w:val="none" w:color="auto" w:sz="0" w:space="0"/>
+          </w:tblBorders>
+          <w:tblCellMar>
+            <w:top w:w="15" w:type="dxa"/>
+            <w:left w:w="15" w:type="dxa"/>
+            <w:bottom w:w="15" w:type="dxa"/>
+            <w:right w:w="15" w:type="dxa"/>
+          </w:tblCellMar>
+        </w:tblPrEx>
+        <w:tc>
+          <w:tcPr>
+            <w:tcW w:w="354" w:type="pct"/>
+            <w:tcBorders>
+              <w:top w:val="single" w:color="auto" w:sz="4" w:space="0"/>
+              <w:left w:val="single" w:color="auto" w:sz="4" w:space="0"/>
+              <w:bottom w:val="single" w:color="auto" w:sz="4" w:space="0"/>
+              <w:right w:val="single" w:color="auto" w:sz="4" w:space="0"/>
+            </w:tcBorders>
+            <w:shd w:val="clear" w:color="auto" w:fill="auto"/>
+            <w:tcMar>
+              <w:top w:w="100" w:type="dxa"/>
+              <w:left w:w="0" w:type="dxa"/>
+              <w:bottom w:w="100" w:type="dxa"/>
+              <w:right w:w="160" w:type="dxa"/>
+            </w:tcMar>
+            <w:vAlign w:val="center"/>
+          </w:tcPr>
+          <w:p>
+            <w:pPr>
+              <w:keepNext w:val="0"/>
+              <w:keepLines w:val="0"/>
+              <w:widowControl/>
+              <w:suppressLineNumbers w:val="0"/>
+              <w:spacing w:line="250" w:lineRule="atLeast"/>
+              <w:jc w:val="left"/>
+              <w:rPr>
+                <w:rFonts w:hint="default" w:ascii="Times New Roman" w:hAnsi="Times New Roman" w:eastAsia="宋体" w:cs="Times New Roman"/>
+                <w:i w:val="0"/>
+                <w:iCs w:val="0"/>
+                <w:caps w:val="0"/>
+                <w:color w:val="0F1115"/>
+                <w:spacing w:val="0"/>
+                <w:sz w:val="18"/>
+                <w:szCs w:val="18"/>
+              </w:rPr>
+            </w:pPr>
+            <w:r>
+              <w:rPr>
+                <w:rFonts w:hint="default" w:ascii="Times New Roman" w:hAnsi="Times New Roman" w:eastAsia="宋体" w:cs="Times New Roman"/>
+                <w:i w:val="0"/>
+                <w:iCs w:val="0"/>
+                <w:caps w:val="0"/>
+                <w:color w:val="0F1115"/>
+                <w:spacing w:val="0"/>
+                <w:kern w:val="0"/>
+                <w:sz w:val="18"/>
+                <w:szCs w:val="18"/>
+                <w:lang w:val="en-US" w:eastAsia="zh-CN" w:bidi="ar"/>
+              </w:rPr>
+              <w:t>火</w:t>
+            </w:r>
+          </w:p>
+        </w:tc>
+        <w:tc>
+          <w:tcPr>
+            <w:tcW w:w="552" w:type="pct"/>
+            <w:tcBorders>
+              <w:top w:val="single" w:color="auto" w:sz="4" w:space="0"/>
+              <w:left w:val="single" w:color="auto" w:sz="4" w:space="0"/>
+              <w:bottom w:val="single" w:color="auto" w:sz="4" w:space="0"/>
+              <w:right w:val="single" w:color="auto" w:sz="4" w:space="0"/>
+            </w:tcBorders>
+            <w:shd w:val="clear" w:color="auto" w:fill="auto"/>
+            <w:tcMar>
+              <w:top w:w="100" w:type="dxa"/>
+              <w:left w:w="160" w:type="dxa"/>
+              <w:bottom w:w="100" w:type="dxa"/>
+              <w:right w:w="160" w:type="dxa"/>
+            </w:tcMar>
+            <w:vAlign w:val="center"/>
+          </w:tcPr>
+          <w:p>
+            <w:pPr>
+              <w:keepNext w:val="0"/>
+              <w:keepLines w:val="0"/>
+              <w:widowControl/>
+              <w:suppressLineNumbers w:val="0"/>
+              <w:spacing w:line="250" w:lineRule="atLeast"/>
+              <w:jc w:val="left"/>
+              <w:rPr>
+                <w:rFonts w:hint="default" w:ascii="Times New Roman" w:hAnsi="Times New Roman" w:eastAsia="宋体" w:cs="Times New Roman"/>
+                <w:i w:val="0"/>
+                <w:iCs w:val="0"/>
+                <w:caps w:val="0"/>
+                <w:color w:val="0F1115"/>
+                <w:spacing w:val="0"/>
+                <w:sz w:val="18"/>
+                <w:szCs w:val="18"/>
+              </w:rPr>
+            </w:pPr>
+            <w:r>
+              <w:rPr>
+                <w:rFonts w:hint="default" w:ascii="Times New Roman" w:hAnsi="Times New Roman" w:eastAsia="宋体" w:cs="Times New Roman"/>
+                <w:i w:val="0"/>
+                <w:iCs w:val="0"/>
+                <w:caps w:val="0"/>
+                <w:color w:val="0F1115"/>
+                <w:spacing w:val="0"/>
+                <w:sz w:val="18"/>
+                <w:szCs w:val="18"/>
+              </w:rPr>
+              <w:t>燃屑</w:t>
+            </w:r>
+          </w:p>
+        </w:tc>
+        <w:tc>
+          <w:tcPr>
+            <w:tcW w:w="653" w:type="pct"/>
+            <w:tcBorders>
+              <w:top w:val="single" w:color="auto" w:sz="4" w:space="0"/>
+              <w:left w:val="single" w:color="auto" w:sz="4" w:space="0"/>
+              <w:bottom w:val="single" w:color="auto" w:sz="4" w:space="0"/>
+              <w:right w:val="single" w:color="auto" w:sz="4" w:space="0"/>
+            </w:tcBorders>
+            <w:shd w:val="clear" w:color="auto" w:fill="auto"/>
+            <w:tcMar>
+              <w:top w:w="100" w:type="dxa"/>
+              <w:left w:w="160" w:type="dxa"/>
+              <w:bottom w:w="100" w:type="dxa"/>
+              <w:right w:w="0" w:type="dxa"/>
+            </w:tcMar>
+            <w:vAlign w:val="center"/>
+          </w:tcPr>
+          <w:p>
+            <w:pPr>
+              <w:keepNext w:val="0"/>
+              <w:keepLines w:val="0"/>
+              <w:widowControl/>
+              <w:suppressLineNumbers w:val="0"/>
+              <w:spacing w:line="250" w:lineRule="atLeast"/>
+              <w:jc w:val="left"/>
+              <w:rPr>
+                <w:rFonts w:hint="eastAsia" w:ascii="Times New Roman" w:hAnsi="Times New Roman" w:eastAsia="宋体" w:cs="Times New Roman"/>
+                <w:i w:val="0"/>
+                <w:iCs w:val="0"/>
+                <w:caps w:val="0"/>
+                <w:color w:val="0F1115"/>
+                <w:spacing w:val="0"/>
+                <w:sz w:val="18"/>
+                <w:szCs w:val="18"/>
+                <w:lang w:val="en-US" w:eastAsia="zh-CN"/>
+              </w:rPr>
+            </w:pPr>
+            <w:r>
+              <w:rPr>
+                <w:rFonts w:hint="eastAsia" w:ascii="Times New Roman" w:hAnsi="Times New Roman" w:eastAsia="宋体" w:cs="Times New Roman"/>
+                <w:i w:val="0"/>
+                <w:iCs w:val="0"/>
+                <w:caps w:val="0"/>
+                <w:color w:val="0F1115"/>
+                <w:spacing w:val="0"/>
+                <w:sz w:val="18"/>
+                <w:szCs w:val="18"/>
+                <w:lang w:val="en-US" w:eastAsia="zh-CN"/>
+              </w:rPr>
+              <w:t>拳击</w:t>
+            </w:r>
+          </w:p>
+        </w:tc>
+        <w:tc>
+          <w:tcPr>
+            <w:tcW w:w="1070" w:type="pct"/>
+            <w:tcBorders>
+              <w:top w:val="single" w:color="auto" w:sz="4" w:space="0"/>
+              <w:left w:val="single" w:color="auto" w:sz="4" w:space="0"/>
+              <w:bottom w:val="single" w:color="auto" w:sz="4" w:space="0"/>
+              <w:right w:val="single" w:color="auto" w:sz="4" w:space="0"/>
+            </w:tcBorders>
+            <w:shd w:val="clear" w:color="auto" w:fill="auto"/>
+            <w:tcMar>
+              <w:top w:w="100" w:type="dxa"/>
+              <w:left w:w="160" w:type="dxa"/>
+              <w:bottom w:w="100" w:type="dxa"/>
+              <w:right w:w="0" w:type="dxa"/>
+            </w:tcMar>
+            <w:vAlign w:val="center"/>
+          </w:tcPr>
+          <w:p>
+            <w:pPr>
+              <w:keepNext w:val="0"/>
+              <w:keepLines w:val="0"/>
+              <w:widowControl/>
+              <w:suppressLineNumbers w:val="0"/>
+              <w:spacing w:line="250" w:lineRule="atLeast"/>
+              <w:jc w:val="left"/>
+              <w:rPr>
+                <w:rFonts w:hint="default" w:ascii="Times New Roman" w:hAnsi="Times New Roman" w:eastAsia="宋体" w:cs="Times New Roman"/>
+                <w:i w:val="0"/>
+                <w:iCs w:val="0"/>
+                <w:caps w:val="0"/>
+                <w:color w:val="0F1115"/>
+                <w:spacing w:val="0"/>
+                <w:sz w:val="18"/>
+                <w:szCs w:val="18"/>
+                <w:lang w:val="en-US" w:eastAsia="zh-CN"/>
+              </w:rPr>
+            </w:pPr>
+            <w:r>
+              <w:rPr>
+                <w:rFonts w:hint="eastAsia" w:ascii="Times New Roman" w:hAnsi="Times New Roman" w:eastAsia="宋体" w:cs="Times New Roman"/>
+                <w:i w:val="0"/>
+                <w:iCs w:val="0"/>
+                <w:caps w:val="0"/>
+                <w:color w:val="0F1115"/>
+                <w:spacing w:val="0"/>
+                <w:sz w:val="18"/>
+                <w:szCs w:val="18"/>
+                <w:lang w:val="en-US" w:eastAsia="zh-CN"/>
+              </w:rPr>
+              <w:t>周围生成爆炸粉尘</w:t>
+            </w:r>
+          </w:p>
+        </w:tc>
+        <w:tc>
+          <w:tcPr>
+            <w:tcW w:w="663" w:type="pct"/>
+            <w:tcBorders>
+              <w:top w:val="single" w:color="auto" w:sz="4" w:space="0"/>
+              <w:left w:val="single" w:color="auto" w:sz="4" w:space="0"/>
+              <w:bottom w:val="single" w:color="auto" w:sz="4" w:space="0"/>
+              <w:right w:val="single" w:color="auto" w:sz="4" w:space="0"/>
+            </w:tcBorders>
+            <w:shd w:val="clear" w:color="auto" w:fill="auto"/>
+            <w:tcMar>
+              <w:top w:w="100" w:type="dxa"/>
+              <w:left w:w="160" w:type="dxa"/>
+              <w:bottom w:w="100" w:type="dxa"/>
+              <w:right w:w="0" w:type="dxa"/>
+            </w:tcMar>
+            <w:vAlign w:val="center"/>
+          </w:tcPr>
+          <w:p>
+            <w:pPr>
+              <w:keepNext w:val="0"/>
+              <w:keepLines w:val="0"/>
+              <w:widowControl/>
+              <w:suppressLineNumbers w:val="0"/>
+              <w:spacing w:line="250" w:lineRule="atLeast"/>
+              <w:jc w:val="left"/>
+              <w:rPr>
+                <w:rFonts w:hint="eastAsia" w:ascii="Times New Roman" w:hAnsi="Times New Roman" w:eastAsia="宋体" w:cs="Times New Roman"/>
+                <w:i w:val="0"/>
+                <w:iCs w:val="0"/>
+                <w:caps w:val="0"/>
+                <w:color w:val="0F1115"/>
+                <w:spacing w:val="0"/>
+                <w:sz w:val="18"/>
+                <w:szCs w:val="18"/>
+                <w:lang w:val="en-US" w:eastAsia="zh-CN"/>
+              </w:rPr>
+            </w:pPr>
+            <w:r>
+              <w:rPr>
+                <w:rFonts w:hint="eastAsia" w:ascii="Times New Roman" w:hAnsi="Times New Roman" w:eastAsia="宋体" w:cs="Times New Roman"/>
+                <w:i w:val="0"/>
+                <w:iCs w:val="0"/>
+                <w:caps w:val="0"/>
+                <w:color w:val="0F1115"/>
+                <w:spacing w:val="0"/>
+                <w:sz w:val="18"/>
+                <w:szCs w:val="18"/>
+                <w:lang w:val="en-US" w:eastAsia="zh-CN"/>
+              </w:rPr>
+              <w:t>翻滚</w:t>
+            </w:r>
+          </w:p>
+        </w:tc>
+        <w:tc>
+          <w:tcPr>
+            <w:tcW w:w="1705" w:type="pct"/>
+            <w:tcBorders>
+              <w:top w:val="single" w:color="auto" w:sz="4" w:space="0"/>
+              <w:left w:val="single" w:color="auto" w:sz="4" w:space="0"/>
+              <w:bottom w:val="single" w:color="auto" w:sz="4" w:space="0"/>
+              <w:right w:val="single" w:color="auto" w:sz="4" w:space="0"/>
+            </w:tcBorders>
+            <w:shd w:val="clear" w:color="auto" w:fill="auto"/>
+            <w:tcMar>
+              <w:top w:w="100" w:type="dxa"/>
+              <w:left w:w="160" w:type="dxa"/>
+              <w:bottom w:w="100" w:type="dxa"/>
+              <w:right w:w="0" w:type="dxa"/>
+            </w:tcMar>
+            <w:vAlign w:val="center"/>
+          </w:tcPr>
+          <w:p>
+            <w:pPr>
+              <w:keepNext w:val="0"/>
+              <w:keepLines w:val="0"/>
+              <w:widowControl/>
+              <w:suppressLineNumbers w:val="0"/>
+              <w:spacing w:line="250" w:lineRule="atLeast"/>
+              <w:jc w:val="left"/>
+              <w:rPr>
+                <w:rFonts w:hint="default" w:ascii="Times New Roman" w:hAnsi="Times New Roman" w:eastAsia="宋体" w:cs="Times New Roman"/>
+                <w:i w:val="0"/>
+                <w:iCs w:val="0"/>
+                <w:caps w:val="0"/>
+                <w:color w:val="0F1115"/>
+                <w:spacing w:val="0"/>
+                <w:sz w:val="18"/>
+                <w:szCs w:val="18"/>
+                <w:lang w:val="en-US" w:eastAsia="zh-CN"/>
+              </w:rPr>
+            </w:pPr>
+            <w:r>
+              <w:rPr>
+                <w:rFonts w:hint="eastAsia" w:ascii="Times New Roman" w:hAnsi="Times New Roman" w:eastAsia="宋体" w:cs="Times New Roman"/>
+                <w:i w:val="0"/>
+                <w:iCs w:val="0"/>
+                <w:caps w:val="0"/>
+                <w:color w:val="0F1115"/>
+                <w:spacing w:val="0"/>
+                <w:sz w:val="18"/>
+                <w:szCs w:val="18"/>
+                <w:lang w:val="en-US" w:eastAsia="zh-CN"/>
+              </w:rPr>
+              <w:t>攻击或位移的轨迹生成爆炸粉尘</w:t>
+            </w:r>
+          </w:p>
+        </w:tc>
+      </w:tr>
+      <w:tr>
+        <w:tblPrEx>
+          <w:tblBorders>
+            <w:top w:val="none" w:color="auto" w:sz="0" w:space="0"/>
+            <w:left w:val="none" w:color="auto" w:sz="0" w:space="0"/>
+            <w:bottom w:val="none" w:color="auto" w:sz="0" w:space="0"/>
+            <w:right w:val="none" w:color="auto" w:sz="0" w:space="0"/>
+            <w:insideH w:val="none" w:color="auto" w:sz="0" w:space="0"/>
+            <w:insideV w:val="none" w:color="auto" w:sz="0" w:space="0"/>
+          </w:tblBorders>
+          <w:tblCellMar>
+            <w:top w:w="15" w:type="dxa"/>
+            <w:left w:w="15" w:type="dxa"/>
+            <w:bottom w:w="15" w:type="dxa"/>
+            <w:right w:w="15" w:type="dxa"/>
+          </w:tblCellMar>
+        </w:tblPrEx>
+        <w:tc>
+          <w:tcPr>
+            <w:tcW w:w="354" w:type="pct"/>
+            <w:tcBorders>
+              <w:top w:val="single" w:color="auto" w:sz="4" w:space="0"/>
+              <w:left w:val="single" w:color="auto" w:sz="4" w:space="0"/>
+              <w:bottom w:val="single" w:color="auto" w:sz="4" w:space="0"/>
+              <w:right w:val="single" w:color="auto" w:sz="4" w:space="0"/>
+            </w:tcBorders>
+            <w:shd w:val="clear" w:color="auto" w:fill="auto"/>
+            <w:tcMar>
+              <w:top w:w="100" w:type="dxa"/>
+              <w:left w:w="0" w:type="dxa"/>
+              <w:bottom w:w="100" w:type="dxa"/>
+              <w:right w:w="160" w:type="dxa"/>
+            </w:tcMar>
+            <w:vAlign w:val="center"/>
+          </w:tcPr>
+          <w:p>
+            <w:pPr>
+              <w:keepNext w:val="0"/>
+              <w:keepLines w:val="0"/>
+              <w:widowControl/>
+              <w:suppressLineNumbers w:val="0"/>
+              <w:spacing w:line="250" w:lineRule="atLeast"/>
+              <w:jc w:val="left"/>
+              <w:rPr>
+                <w:rFonts w:hint="default" w:ascii="Times New Roman" w:hAnsi="Times New Roman" w:eastAsia="宋体" w:cs="Times New Roman"/>
+                <w:i w:val="0"/>
+                <w:iCs w:val="0"/>
+                <w:caps w:val="0"/>
+                <w:color w:val="0F1115"/>
+                <w:spacing w:val="0"/>
+                <w:sz w:val="18"/>
+                <w:szCs w:val="18"/>
+              </w:rPr>
+            </w:pPr>
+            <w:r>
+              <w:rPr>
+                <w:rFonts w:hint="default" w:ascii="Times New Roman" w:hAnsi="Times New Roman" w:eastAsia="宋体" w:cs="Times New Roman"/>
+                <w:i w:val="0"/>
+                <w:iCs w:val="0"/>
+                <w:caps w:val="0"/>
+                <w:color w:val="0F1115"/>
+                <w:spacing w:val="0"/>
+                <w:kern w:val="0"/>
+                <w:sz w:val="18"/>
+                <w:szCs w:val="18"/>
+                <w:lang w:val="en-US" w:eastAsia="zh-CN" w:bidi="ar"/>
+              </w:rPr>
+              <w:t>水</w:t>
+            </w:r>
+          </w:p>
+        </w:tc>
+        <w:tc>
+          <w:tcPr>
+            <w:tcW w:w="552" w:type="pct"/>
+            <w:tcBorders>
+              <w:top w:val="single" w:color="auto" w:sz="4" w:space="0"/>
+              <w:left w:val="single" w:color="auto" w:sz="4" w:space="0"/>
+              <w:bottom w:val="single" w:color="auto" w:sz="4" w:space="0"/>
+              <w:right w:val="single" w:color="auto" w:sz="4" w:space="0"/>
+            </w:tcBorders>
+            <w:shd w:val="clear" w:color="auto" w:fill="auto"/>
+            <w:tcMar>
+              <w:top w:w="100" w:type="dxa"/>
+              <w:left w:w="160" w:type="dxa"/>
+              <w:bottom w:w="100" w:type="dxa"/>
+              <w:right w:w="160" w:type="dxa"/>
+            </w:tcMar>
+            <w:vAlign w:val="center"/>
+          </w:tcPr>
+          <w:p>
+            <w:pPr>
+              <w:keepNext w:val="0"/>
+              <w:keepLines w:val="0"/>
+              <w:widowControl/>
+              <w:suppressLineNumbers w:val="0"/>
+              <w:spacing w:line="250" w:lineRule="atLeast"/>
+              <w:jc w:val="left"/>
+              <w:rPr>
+                <w:rFonts w:hint="default" w:ascii="Times New Roman" w:hAnsi="Times New Roman" w:eastAsia="宋体" w:cs="Times New Roman"/>
+                <w:i w:val="0"/>
+                <w:iCs w:val="0"/>
+                <w:caps w:val="0"/>
+                <w:color w:val="0F1115"/>
+                <w:spacing w:val="0"/>
+                <w:sz w:val="18"/>
+                <w:szCs w:val="18"/>
+              </w:rPr>
+            </w:pPr>
+            <w:r>
+              <w:rPr>
+                <w:rFonts w:hint="default" w:ascii="Times New Roman" w:hAnsi="Times New Roman" w:eastAsia="宋体" w:cs="Times New Roman"/>
+                <w:i w:val="0"/>
+                <w:iCs w:val="0"/>
+                <w:caps w:val="0"/>
+                <w:color w:val="0F1115"/>
+                <w:spacing w:val="0"/>
+                <w:kern w:val="0"/>
+                <w:sz w:val="18"/>
+                <w:szCs w:val="18"/>
+                <w:lang w:val="en-US" w:eastAsia="zh-CN" w:bidi="ar"/>
+              </w:rPr>
+              <w:t>露珠</w:t>
+            </w:r>
+          </w:p>
+        </w:tc>
+        <w:tc>
+          <w:tcPr>
+            <w:tcW w:w="653" w:type="pct"/>
+            <w:tcBorders>
+              <w:top w:val="single" w:color="auto" w:sz="4" w:space="0"/>
+              <w:left w:val="single" w:color="auto" w:sz="4" w:space="0"/>
+              <w:bottom w:val="single" w:color="auto" w:sz="4" w:space="0"/>
+              <w:right w:val="single" w:color="auto" w:sz="4" w:space="0"/>
+            </w:tcBorders>
+            <w:shd w:val="clear" w:color="auto" w:fill="auto"/>
+            <w:tcMar>
+              <w:top w:w="100" w:type="dxa"/>
+              <w:left w:w="160" w:type="dxa"/>
+              <w:bottom w:w="100" w:type="dxa"/>
+              <w:right w:w="0" w:type="dxa"/>
+            </w:tcMar>
+            <w:vAlign w:val="center"/>
+          </w:tcPr>
+          <w:p>
+            <w:pPr>
+              <w:keepNext w:val="0"/>
+              <w:keepLines w:val="0"/>
+              <w:widowControl/>
+              <w:suppressLineNumbers w:val="0"/>
+              <w:spacing w:line="250" w:lineRule="atLeast"/>
+              <w:jc w:val="left"/>
+              <w:rPr>
+                <w:rFonts w:hint="eastAsia" w:ascii="Times New Roman" w:hAnsi="Times New Roman" w:eastAsia="宋体" w:cs="Times New Roman"/>
+                <w:i w:val="0"/>
+                <w:iCs w:val="0"/>
+                <w:caps w:val="0"/>
+                <w:color w:val="0F1115"/>
+                <w:spacing w:val="0"/>
+                <w:sz w:val="18"/>
+                <w:szCs w:val="18"/>
+                <w:lang w:val="en-US" w:eastAsia="zh-CN"/>
+              </w:rPr>
+            </w:pPr>
+            <w:r>
+              <w:rPr>
+                <w:rFonts w:hint="eastAsia" w:ascii="Times New Roman" w:hAnsi="Times New Roman" w:eastAsia="宋体" w:cs="Times New Roman"/>
+                <w:i w:val="0"/>
+                <w:iCs w:val="0"/>
+                <w:caps w:val="0"/>
+                <w:color w:val="0F1115"/>
+                <w:spacing w:val="0"/>
+                <w:sz w:val="18"/>
+                <w:szCs w:val="18"/>
+                <w:lang w:val="en-US" w:eastAsia="zh-CN"/>
+              </w:rPr>
+              <w:t>法球</w:t>
+            </w:r>
+          </w:p>
+        </w:tc>
+        <w:tc>
+          <w:tcPr>
+            <w:tcW w:w="1070" w:type="pct"/>
+            <w:tcBorders>
+              <w:top w:val="single" w:color="auto" w:sz="4" w:space="0"/>
+              <w:left w:val="single" w:color="auto" w:sz="4" w:space="0"/>
+              <w:bottom w:val="single" w:color="auto" w:sz="4" w:space="0"/>
+              <w:right w:val="single" w:color="auto" w:sz="4" w:space="0"/>
+            </w:tcBorders>
+            <w:shd w:val="clear" w:color="auto" w:fill="auto"/>
+            <w:tcMar>
+              <w:top w:w="100" w:type="dxa"/>
+              <w:left w:w="160" w:type="dxa"/>
+              <w:bottom w:w="100" w:type="dxa"/>
+              <w:right w:w="0" w:type="dxa"/>
+            </w:tcMar>
+            <w:vAlign w:val="center"/>
+          </w:tcPr>
+          <w:p>
+            <w:pPr>
+              <w:keepNext w:val="0"/>
+              <w:keepLines w:val="0"/>
+              <w:widowControl/>
+              <w:suppressLineNumbers w:val="0"/>
+              <w:spacing w:line="250" w:lineRule="atLeast"/>
+              <w:jc w:val="left"/>
+              <w:rPr>
+                <w:rFonts w:hint="default" w:ascii="Times New Roman" w:hAnsi="Times New Roman" w:eastAsia="宋体" w:cs="Times New Roman"/>
+                <w:i w:val="0"/>
+                <w:iCs w:val="0"/>
+                <w:caps w:val="0"/>
+                <w:color w:val="0F1115"/>
+                <w:spacing w:val="0"/>
+                <w:sz w:val="18"/>
+                <w:szCs w:val="18"/>
+                <w:lang w:val="en-US" w:eastAsia="zh-CN"/>
+              </w:rPr>
+            </w:pPr>
+            <w:r>
+              <w:rPr>
+                <w:rFonts w:hint="eastAsia" w:ascii="Times New Roman" w:hAnsi="Times New Roman" w:eastAsia="宋体" w:cs="Times New Roman"/>
+                <w:i w:val="0"/>
+                <w:iCs w:val="0"/>
+                <w:caps w:val="0"/>
+                <w:color w:val="0F1115"/>
+                <w:spacing w:val="0"/>
+                <w:sz w:val="18"/>
+                <w:szCs w:val="18"/>
+                <w:lang w:val="en-US" w:eastAsia="zh-CN"/>
+              </w:rPr>
+              <w:t>生成法球环绕</w:t>
+            </w:r>
+          </w:p>
+        </w:tc>
+        <w:tc>
+          <w:tcPr>
+            <w:tcW w:w="663" w:type="pct"/>
+            <w:tcBorders>
+              <w:top w:val="single" w:color="auto" w:sz="4" w:space="0"/>
+              <w:left w:val="single" w:color="auto" w:sz="4" w:space="0"/>
+              <w:bottom w:val="single" w:color="auto" w:sz="4" w:space="0"/>
+              <w:right w:val="single" w:color="auto" w:sz="4" w:space="0"/>
+            </w:tcBorders>
+            <w:shd w:val="clear" w:color="auto" w:fill="auto"/>
+            <w:tcMar>
+              <w:top w:w="100" w:type="dxa"/>
+              <w:left w:w="160" w:type="dxa"/>
+              <w:bottom w:w="100" w:type="dxa"/>
+              <w:right w:w="0" w:type="dxa"/>
+            </w:tcMar>
+            <w:vAlign w:val="center"/>
+          </w:tcPr>
+          <w:p>
+            <w:pPr>
+              <w:keepNext w:val="0"/>
+              <w:keepLines w:val="0"/>
+              <w:widowControl/>
+              <w:suppressLineNumbers w:val="0"/>
+              <w:spacing w:line="250" w:lineRule="atLeast"/>
+              <w:jc w:val="left"/>
+              <w:rPr>
+                <w:rFonts w:hint="default" w:ascii="Times New Roman" w:hAnsi="Times New Roman" w:eastAsia="宋体" w:cs="Times New Roman"/>
+                <w:i w:val="0"/>
+                <w:iCs w:val="0"/>
+                <w:caps w:val="0"/>
+                <w:color w:val="0F1115"/>
+                <w:spacing w:val="0"/>
+                <w:sz w:val="18"/>
+                <w:szCs w:val="18"/>
+                <w:lang w:val="en-US" w:eastAsia="zh-CN"/>
+              </w:rPr>
+            </w:pPr>
+            <w:r>
+              <w:rPr>
+                <w:rFonts w:hint="eastAsia" w:ascii="Times New Roman" w:hAnsi="Times New Roman" w:eastAsia="宋体" w:cs="Times New Roman"/>
+                <w:i w:val="0"/>
+                <w:iCs w:val="0"/>
+                <w:caps w:val="0"/>
+                <w:color w:val="0F1115"/>
+                <w:spacing w:val="0"/>
+                <w:sz w:val="18"/>
+                <w:szCs w:val="18"/>
+                <w:lang w:val="en-US" w:eastAsia="zh-CN"/>
+              </w:rPr>
+              <w:t>隐身</w:t>
+            </w:r>
+          </w:p>
+        </w:tc>
+        <w:tc>
+          <w:tcPr>
+            <w:tcW w:w="1705" w:type="pct"/>
+            <w:tcBorders>
+              <w:top w:val="single" w:color="auto" w:sz="4" w:space="0"/>
+              <w:left w:val="single" w:color="auto" w:sz="4" w:space="0"/>
+              <w:bottom w:val="single" w:color="auto" w:sz="4" w:space="0"/>
+              <w:right w:val="single" w:color="auto" w:sz="4" w:space="0"/>
+            </w:tcBorders>
+            <w:shd w:val="clear" w:color="auto" w:fill="auto"/>
+            <w:tcMar>
+              <w:top w:w="100" w:type="dxa"/>
+              <w:left w:w="160" w:type="dxa"/>
+              <w:bottom w:w="100" w:type="dxa"/>
+              <w:right w:w="0" w:type="dxa"/>
+            </w:tcMar>
+            <w:vAlign w:val="center"/>
+          </w:tcPr>
+          <w:p>
+            <w:pPr>
+              <w:keepNext w:val="0"/>
+              <w:keepLines w:val="0"/>
+              <w:widowControl/>
+              <w:suppressLineNumbers w:val="0"/>
+              <w:spacing w:line="250" w:lineRule="atLeast"/>
+              <w:jc w:val="left"/>
+              <w:rPr>
+                <w:rFonts w:hint="default" w:ascii="Times New Roman" w:hAnsi="Times New Roman" w:eastAsia="宋体" w:cs="Times New Roman"/>
+                <w:i w:val="0"/>
+                <w:iCs w:val="0"/>
+                <w:caps w:val="0"/>
+                <w:color w:val="0F1115"/>
+                <w:spacing w:val="0"/>
+                <w:sz w:val="18"/>
+                <w:szCs w:val="18"/>
+                <w:lang w:val="en-US" w:eastAsia="zh-CN"/>
+              </w:rPr>
+            </w:pPr>
+            <w:r>
+              <w:rPr>
+                <w:rFonts w:hint="eastAsia" w:ascii="Times New Roman" w:hAnsi="Times New Roman" w:eastAsia="宋体" w:cs="Times New Roman"/>
+                <w:i w:val="0"/>
+                <w:iCs w:val="0"/>
+                <w:caps w:val="0"/>
+                <w:color w:val="0F1115"/>
+                <w:spacing w:val="0"/>
+                <w:sz w:val="18"/>
+                <w:szCs w:val="18"/>
+                <w:lang w:val="en-US" w:eastAsia="zh-CN"/>
+              </w:rPr>
+              <w:t>生成前可以蓄力，释放强力版</w:t>
             </w:r>
           </w:p>
         </w:tc>
@@ -25449,688 +26514,6 @@
                 <w:szCs w:val="18"/>
                 <w:lang w:val="en-US" w:eastAsia="zh-CN" w:bidi="ar"/>
               </w:rPr>
-              <w:t>火</w:t>
-            </w:r>
-          </w:p>
-        </w:tc>
-        <w:tc>
-          <w:tcPr>
-            <w:tcW w:w="552" w:type="pct"/>
-            <w:tcBorders>
-              <w:top w:val="single" w:color="auto" w:sz="4" w:space="0"/>
-              <w:left w:val="single" w:color="auto" w:sz="4" w:space="0"/>
-              <w:bottom w:val="single" w:color="auto" w:sz="4" w:space="0"/>
-              <w:right w:val="single" w:color="auto" w:sz="4" w:space="0"/>
-            </w:tcBorders>
-            <w:shd w:val="clear" w:color="auto" w:fill="auto"/>
-            <w:tcMar>
-              <w:top w:w="100" w:type="dxa"/>
-              <w:left w:w="160" w:type="dxa"/>
-              <w:bottom w:w="100" w:type="dxa"/>
-              <w:right w:w="160" w:type="dxa"/>
-            </w:tcMar>
-            <w:vAlign w:val="center"/>
-          </w:tcPr>
-          <w:p>
-            <w:pPr>
-              <w:keepNext w:val="0"/>
-              <w:keepLines w:val="0"/>
-              <w:widowControl/>
-              <w:suppressLineNumbers w:val="0"/>
-              <w:spacing w:line="250" w:lineRule="atLeast"/>
-              <w:jc w:val="left"/>
-              <w:rPr>
-                <w:rFonts w:hint="default" w:ascii="Times New Roman" w:hAnsi="Times New Roman" w:eastAsia="宋体" w:cs="Times New Roman"/>
-                <w:i w:val="0"/>
-                <w:iCs w:val="0"/>
-                <w:caps w:val="0"/>
-                <w:color w:val="0F1115"/>
-                <w:spacing w:val="0"/>
-                <w:sz w:val="18"/>
-                <w:szCs w:val="18"/>
-              </w:rPr>
-            </w:pPr>
-            <w:r>
-              <w:rPr>
-                <w:rFonts w:hint="default" w:ascii="Times New Roman" w:hAnsi="Times New Roman" w:eastAsia="宋体" w:cs="Times New Roman"/>
-                <w:i w:val="0"/>
-                <w:iCs w:val="0"/>
-                <w:caps w:val="0"/>
-                <w:color w:val="0F1115"/>
-                <w:spacing w:val="0"/>
-                <w:sz w:val="18"/>
-                <w:szCs w:val="18"/>
-              </w:rPr>
-              <w:t>燃屑</w:t>
-            </w:r>
-          </w:p>
-        </w:tc>
-        <w:tc>
-          <w:tcPr>
-            <w:tcW w:w="653" w:type="pct"/>
-            <w:tcBorders>
-              <w:top w:val="single" w:color="auto" w:sz="4" w:space="0"/>
-              <w:left w:val="single" w:color="auto" w:sz="4" w:space="0"/>
-              <w:bottom w:val="single" w:color="auto" w:sz="4" w:space="0"/>
-              <w:right w:val="single" w:color="auto" w:sz="4" w:space="0"/>
-            </w:tcBorders>
-            <w:shd w:val="clear" w:color="auto" w:fill="auto"/>
-            <w:tcMar>
-              <w:top w:w="100" w:type="dxa"/>
-              <w:left w:w="160" w:type="dxa"/>
-              <w:bottom w:w="100" w:type="dxa"/>
-              <w:right w:w="0" w:type="dxa"/>
-            </w:tcMar>
-            <w:vAlign w:val="center"/>
-          </w:tcPr>
-          <w:p>
-            <w:pPr>
-              <w:keepNext w:val="0"/>
-              <w:keepLines w:val="0"/>
-              <w:widowControl/>
-              <w:suppressLineNumbers w:val="0"/>
-              <w:spacing w:line="250" w:lineRule="atLeast"/>
-              <w:jc w:val="left"/>
-              <w:rPr>
-                <w:rFonts w:hint="eastAsia" w:ascii="Times New Roman" w:hAnsi="Times New Roman" w:eastAsia="宋体" w:cs="Times New Roman"/>
-                <w:i w:val="0"/>
-                <w:iCs w:val="0"/>
-                <w:caps w:val="0"/>
-                <w:color w:val="0F1115"/>
-                <w:spacing w:val="0"/>
-                <w:sz w:val="18"/>
-                <w:szCs w:val="18"/>
-                <w:lang w:val="en-US" w:eastAsia="zh-CN"/>
-              </w:rPr>
-            </w:pPr>
-            <w:r>
-              <w:rPr>
-                <w:rFonts w:hint="eastAsia" w:ascii="Times New Roman" w:hAnsi="Times New Roman" w:eastAsia="宋体" w:cs="Times New Roman"/>
-                <w:i w:val="0"/>
-                <w:iCs w:val="0"/>
-                <w:caps w:val="0"/>
-                <w:color w:val="0F1115"/>
-                <w:spacing w:val="0"/>
-                <w:sz w:val="18"/>
-                <w:szCs w:val="18"/>
-                <w:lang w:val="en-US" w:eastAsia="zh-CN"/>
-              </w:rPr>
-              <w:t>拳击</w:t>
-            </w:r>
-          </w:p>
-        </w:tc>
-        <w:tc>
-          <w:tcPr>
-            <w:tcW w:w="1070" w:type="pct"/>
-            <w:tcBorders>
-              <w:top w:val="single" w:color="auto" w:sz="4" w:space="0"/>
-              <w:left w:val="single" w:color="auto" w:sz="4" w:space="0"/>
-              <w:bottom w:val="single" w:color="auto" w:sz="4" w:space="0"/>
-              <w:right w:val="single" w:color="auto" w:sz="4" w:space="0"/>
-            </w:tcBorders>
-            <w:shd w:val="clear" w:color="auto" w:fill="auto"/>
-            <w:tcMar>
-              <w:top w:w="100" w:type="dxa"/>
-              <w:left w:w="160" w:type="dxa"/>
-              <w:bottom w:w="100" w:type="dxa"/>
-              <w:right w:w="0" w:type="dxa"/>
-            </w:tcMar>
-            <w:vAlign w:val="center"/>
-          </w:tcPr>
-          <w:p>
-            <w:pPr>
-              <w:keepNext w:val="0"/>
-              <w:keepLines w:val="0"/>
-              <w:widowControl/>
-              <w:suppressLineNumbers w:val="0"/>
-              <w:spacing w:line="250" w:lineRule="atLeast"/>
-              <w:jc w:val="left"/>
-              <w:rPr>
-                <w:rFonts w:hint="default" w:ascii="Times New Roman" w:hAnsi="Times New Roman" w:eastAsia="宋体" w:cs="Times New Roman"/>
-                <w:i w:val="0"/>
-                <w:iCs w:val="0"/>
-                <w:caps w:val="0"/>
-                <w:color w:val="0F1115"/>
-                <w:spacing w:val="0"/>
-                <w:sz w:val="18"/>
-                <w:szCs w:val="18"/>
-                <w:lang w:val="en-US" w:eastAsia="zh-CN"/>
-              </w:rPr>
-            </w:pPr>
-            <w:r>
-              <w:rPr>
-                <w:rFonts w:hint="eastAsia" w:ascii="Times New Roman" w:hAnsi="Times New Roman" w:eastAsia="宋体" w:cs="Times New Roman"/>
-                <w:i w:val="0"/>
-                <w:iCs w:val="0"/>
-                <w:caps w:val="0"/>
-                <w:color w:val="0F1115"/>
-                <w:spacing w:val="0"/>
-                <w:sz w:val="18"/>
-                <w:szCs w:val="18"/>
-                <w:lang w:val="en-US" w:eastAsia="zh-CN"/>
-              </w:rPr>
-              <w:t>周围生成爆炸粉尘</w:t>
-            </w:r>
-          </w:p>
-        </w:tc>
-        <w:tc>
-          <w:tcPr>
-            <w:tcW w:w="663" w:type="pct"/>
-            <w:tcBorders>
-              <w:top w:val="single" w:color="auto" w:sz="4" w:space="0"/>
-              <w:left w:val="single" w:color="auto" w:sz="4" w:space="0"/>
-              <w:bottom w:val="single" w:color="auto" w:sz="4" w:space="0"/>
-              <w:right w:val="single" w:color="auto" w:sz="4" w:space="0"/>
-            </w:tcBorders>
-            <w:shd w:val="clear" w:color="auto" w:fill="auto"/>
-            <w:tcMar>
-              <w:top w:w="100" w:type="dxa"/>
-              <w:left w:w="160" w:type="dxa"/>
-              <w:bottom w:w="100" w:type="dxa"/>
-              <w:right w:w="0" w:type="dxa"/>
-            </w:tcMar>
-            <w:vAlign w:val="center"/>
-          </w:tcPr>
-          <w:p>
-            <w:pPr>
-              <w:keepNext w:val="0"/>
-              <w:keepLines w:val="0"/>
-              <w:widowControl/>
-              <w:suppressLineNumbers w:val="0"/>
-              <w:spacing w:line="250" w:lineRule="atLeast"/>
-              <w:jc w:val="left"/>
-              <w:rPr>
-                <w:rFonts w:hint="eastAsia" w:ascii="Times New Roman" w:hAnsi="Times New Roman" w:eastAsia="宋体" w:cs="Times New Roman"/>
-                <w:i w:val="0"/>
-                <w:iCs w:val="0"/>
-                <w:caps w:val="0"/>
-                <w:color w:val="0F1115"/>
-                <w:spacing w:val="0"/>
-                <w:sz w:val="18"/>
-                <w:szCs w:val="18"/>
-                <w:lang w:val="en-US" w:eastAsia="zh-CN"/>
-              </w:rPr>
-            </w:pPr>
-            <w:r>
-              <w:rPr>
-                <w:rFonts w:hint="eastAsia" w:ascii="Times New Roman" w:hAnsi="Times New Roman" w:eastAsia="宋体" w:cs="Times New Roman"/>
-                <w:i w:val="0"/>
-                <w:iCs w:val="0"/>
-                <w:caps w:val="0"/>
-                <w:color w:val="0F1115"/>
-                <w:spacing w:val="0"/>
-                <w:sz w:val="18"/>
-                <w:szCs w:val="18"/>
-                <w:lang w:val="en-US" w:eastAsia="zh-CN"/>
-              </w:rPr>
-              <w:t>翻滚</w:t>
-            </w:r>
-          </w:p>
-        </w:tc>
-        <w:tc>
-          <w:tcPr>
-            <w:tcW w:w="1705" w:type="pct"/>
-            <w:tcBorders>
-              <w:top w:val="single" w:color="auto" w:sz="4" w:space="0"/>
-              <w:left w:val="single" w:color="auto" w:sz="4" w:space="0"/>
-              <w:bottom w:val="single" w:color="auto" w:sz="4" w:space="0"/>
-              <w:right w:val="single" w:color="auto" w:sz="4" w:space="0"/>
-            </w:tcBorders>
-            <w:shd w:val="clear" w:color="auto" w:fill="auto"/>
-            <w:tcMar>
-              <w:top w:w="100" w:type="dxa"/>
-              <w:left w:w="160" w:type="dxa"/>
-              <w:bottom w:w="100" w:type="dxa"/>
-              <w:right w:w="0" w:type="dxa"/>
-            </w:tcMar>
-            <w:vAlign w:val="center"/>
-          </w:tcPr>
-          <w:p>
-            <w:pPr>
-              <w:keepNext w:val="0"/>
-              <w:keepLines w:val="0"/>
-              <w:widowControl/>
-              <w:suppressLineNumbers w:val="0"/>
-              <w:spacing w:line="250" w:lineRule="atLeast"/>
-              <w:jc w:val="left"/>
-              <w:rPr>
-                <w:rFonts w:hint="default" w:ascii="Times New Roman" w:hAnsi="Times New Roman" w:eastAsia="宋体" w:cs="Times New Roman"/>
-                <w:i w:val="0"/>
-                <w:iCs w:val="0"/>
-                <w:caps w:val="0"/>
-                <w:color w:val="0F1115"/>
-                <w:spacing w:val="0"/>
-                <w:sz w:val="18"/>
-                <w:szCs w:val="18"/>
-                <w:lang w:val="en-US" w:eastAsia="zh-CN"/>
-              </w:rPr>
-            </w:pPr>
-            <w:r>
-              <w:rPr>
-                <w:rFonts w:hint="eastAsia" w:ascii="Times New Roman" w:hAnsi="Times New Roman" w:eastAsia="宋体" w:cs="Times New Roman"/>
-                <w:i w:val="0"/>
-                <w:iCs w:val="0"/>
-                <w:caps w:val="0"/>
-                <w:color w:val="0F1115"/>
-                <w:spacing w:val="0"/>
-                <w:sz w:val="18"/>
-                <w:szCs w:val="18"/>
-                <w:lang w:val="en-US" w:eastAsia="zh-CN"/>
-              </w:rPr>
-              <w:t>攻击或位移的轨迹生成爆炸粉尘</w:t>
-            </w:r>
-          </w:p>
-        </w:tc>
-      </w:tr>
-      <w:tr>
-        <w:tblPrEx>
-          <w:tblBorders>
-            <w:top w:val="none" w:color="auto" w:sz="0" w:space="0"/>
-            <w:left w:val="none" w:color="auto" w:sz="0" w:space="0"/>
-            <w:bottom w:val="none" w:color="auto" w:sz="0" w:space="0"/>
-            <w:right w:val="none" w:color="auto" w:sz="0" w:space="0"/>
-            <w:insideH w:val="none" w:color="auto" w:sz="0" w:space="0"/>
-            <w:insideV w:val="none" w:color="auto" w:sz="0" w:space="0"/>
-          </w:tblBorders>
-          <w:tblCellMar>
-            <w:top w:w="15" w:type="dxa"/>
-            <w:left w:w="15" w:type="dxa"/>
-            <w:bottom w:w="15" w:type="dxa"/>
-            <w:right w:w="15" w:type="dxa"/>
-          </w:tblCellMar>
-        </w:tblPrEx>
-        <w:tc>
-          <w:tcPr>
-            <w:tcW w:w="354" w:type="pct"/>
-            <w:tcBorders>
-              <w:top w:val="single" w:color="auto" w:sz="4" w:space="0"/>
-              <w:left w:val="single" w:color="auto" w:sz="4" w:space="0"/>
-              <w:bottom w:val="single" w:color="auto" w:sz="4" w:space="0"/>
-              <w:right w:val="single" w:color="auto" w:sz="4" w:space="0"/>
-            </w:tcBorders>
-            <w:shd w:val="clear" w:color="auto" w:fill="auto"/>
-            <w:tcMar>
-              <w:top w:w="100" w:type="dxa"/>
-              <w:left w:w="0" w:type="dxa"/>
-              <w:bottom w:w="100" w:type="dxa"/>
-              <w:right w:w="160" w:type="dxa"/>
-            </w:tcMar>
-            <w:vAlign w:val="center"/>
-          </w:tcPr>
-          <w:p>
-            <w:pPr>
-              <w:keepNext w:val="0"/>
-              <w:keepLines w:val="0"/>
-              <w:widowControl/>
-              <w:suppressLineNumbers w:val="0"/>
-              <w:spacing w:line="250" w:lineRule="atLeast"/>
-              <w:jc w:val="left"/>
-              <w:rPr>
-                <w:rFonts w:hint="default" w:ascii="Times New Roman" w:hAnsi="Times New Roman" w:eastAsia="宋体" w:cs="Times New Roman"/>
-                <w:i w:val="0"/>
-                <w:iCs w:val="0"/>
-                <w:caps w:val="0"/>
-                <w:color w:val="0F1115"/>
-                <w:spacing w:val="0"/>
-                <w:sz w:val="18"/>
-                <w:szCs w:val="18"/>
-              </w:rPr>
-            </w:pPr>
-            <w:r>
-              <w:rPr>
-                <w:rFonts w:hint="default" w:ascii="Times New Roman" w:hAnsi="Times New Roman" w:eastAsia="宋体" w:cs="Times New Roman"/>
-                <w:i w:val="0"/>
-                <w:iCs w:val="0"/>
-                <w:caps w:val="0"/>
-                <w:color w:val="0F1115"/>
-                <w:spacing w:val="0"/>
-                <w:kern w:val="0"/>
-                <w:sz w:val="18"/>
-                <w:szCs w:val="18"/>
-                <w:lang w:val="en-US" w:eastAsia="zh-CN" w:bidi="ar"/>
-              </w:rPr>
-              <w:t>水</w:t>
-            </w:r>
-          </w:p>
-        </w:tc>
-        <w:tc>
-          <w:tcPr>
-            <w:tcW w:w="552" w:type="pct"/>
-            <w:tcBorders>
-              <w:top w:val="single" w:color="auto" w:sz="4" w:space="0"/>
-              <w:left w:val="single" w:color="auto" w:sz="4" w:space="0"/>
-              <w:bottom w:val="single" w:color="auto" w:sz="4" w:space="0"/>
-              <w:right w:val="single" w:color="auto" w:sz="4" w:space="0"/>
-            </w:tcBorders>
-            <w:shd w:val="clear" w:color="auto" w:fill="auto"/>
-            <w:tcMar>
-              <w:top w:w="100" w:type="dxa"/>
-              <w:left w:w="160" w:type="dxa"/>
-              <w:bottom w:w="100" w:type="dxa"/>
-              <w:right w:w="160" w:type="dxa"/>
-            </w:tcMar>
-            <w:vAlign w:val="center"/>
-          </w:tcPr>
-          <w:p>
-            <w:pPr>
-              <w:keepNext w:val="0"/>
-              <w:keepLines w:val="0"/>
-              <w:widowControl/>
-              <w:suppressLineNumbers w:val="0"/>
-              <w:spacing w:line="250" w:lineRule="atLeast"/>
-              <w:jc w:val="left"/>
-              <w:rPr>
-                <w:rFonts w:hint="default" w:ascii="Times New Roman" w:hAnsi="Times New Roman" w:eastAsia="宋体" w:cs="Times New Roman"/>
-                <w:i w:val="0"/>
-                <w:iCs w:val="0"/>
-                <w:caps w:val="0"/>
-                <w:color w:val="0F1115"/>
-                <w:spacing w:val="0"/>
-                <w:sz w:val="18"/>
-                <w:szCs w:val="18"/>
-              </w:rPr>
-            </w:pPr>
-            <w:r>
-              <w:rPr>
-                <w:rFonts w:hint="default" w:ascii="Times New Roman" w:hAnsi="Times New Roman" w:eastAsia="宋体" w:cs="Times New Roman"/>
-                <w:i w:val="0"/>
-                <w:iCs w:val="0"/>
-                <w:caps w:val="0"/>
-                <w:color w:val="0F1115"/>
-                <w:spacing w:val="0"/>
-                <w:kern w:val="0"/>
-                <w:sz w:val="18"/>
-                <w:szCs w:val="18"/>
-                <w:lang w:val="en-US" w:eastAsia="zh-CN" w:bidi="ar"/>
-              </w:rPr>
-              <w:t>露珠</w:t>
-            </w:r>
-          </w:p>
-        </w:tc>
-        <w:tc>
-          <w:tcPr>
-            <w:tcW w:w="653" w:type="pct"/>
-            <w:tcBorders>
-              <w:top w:val="single" w:color="auto" w:sz="4" w:space="0"/>
-              <w:left w:val="single" w:color="auto" w:sz="4" w:space="0"/>
-              <w:bottom w:val="single" w:color="auto" w:sz="4" w:space="0"/>
-              <w:right w:val="single" w:color="auto" w:sz="4" w:space="0"/>
-            </w:tcBorders>
-            <w:shd w:val="clear" w:color="auto" w:fill="auto"/>
-            <w:tcMar>
-              <w:top w:w="100" w:type="dxa"/>
-              <w:left w:w="160" w:type="dxa"/>
-              <w:bottom w:w="100" w:type="dxa"/>
-              <w:right w:w="0" w:type="dxa"/>
-            </w:tcMar>
-            <w:vAlign w:val="center"/>
-          </w:tcPr>
-          <w:p>
-            <w:pPr>
-              <w:keepNext w:val="0"/>
-              <w:keepLines w:val="0"/>
-              <w:widowControl/>
-              <w:suppressLineNumbers w:val="0"/>
-              <w:spacing w:line="250" w:lineRule="atLeast"/>
-              <w:jc w:val="left"/>
-              <w:rPr>
-                <w:rFonts w:hint="eastAsia" w:ascii="Times New Roman" w:hAnsi="Times New Roman" w:eastAsia="宋体" w:cs="Times New Roman"/>
-                <w:i w:val="0"/>
-                <w:iCs w:val="0"/>
-                <w:caps w:val="0"/>
-                <w:color w:val="0F1115"/>
-                <w:spacing w:val="0"/>
-                <w:sz w:val="18"/>
-                <w:szCs w:val="18"/>
-                <w:lang w:val="en-US" w:eastAsia="zh-CN"/>
-              </w:rPr>
-            </w:pPr>
-            <w:r>
-              <w:rPr>
-                <w:rFonts w:hint="eastAsia" w:ascii="Times New Roman" w:hAnsi="Times New Roman" w:eastAsia="宋体" w:cs="Times New Roman"/>
-                <w:i w:val="0"/>
-                <w:iCs w:val="0"/>
-                <w:caps w:val="0"/>
-                <w:color w:val="0F1115"/>
-                <w:spacing w:val="0"/>
-                <w:sz w:val="18"/>
-                <w:szCs w:val="18"/>
-                <w:lang w:val="en-US" w:eastAsia="zh-CN"/>
-              </w:rPr>
-              <w:t>法球</w:t>
-            </w:r>
-          </w:p>
-        </w:tc>
-        <w:tc>
-          <w:tcPr>
-            <w:tcW w:w="1070" w:type="pct"/>
-            <w:tcBorders>
-              <w:top w:val="single" w:color="auto" w:sz="4" w:space="0"/>
-              <w:left w:val="single" w:color="auto" w:sz="4" w:space="0"/>
-              <w:bottom w:val="single" w:color="auto" w:sz="4" w:space="0"/>
-              <w:right w:val="single" w:color="auto" w:sz="4" w:space="0"/>
-            </w:tcBorders>
-            <w:shd w:val="clear" w:color="auto" w:fill="auto"/>
-            <w:tcMar>
-              <w:top w:w="100" w:type="dxa"/>
-              <w:left w:w="160" w:type="dxa"/>
-              <w:bottom w:w="100" w:type="dxa"/>
-              <w:right w:w="0" w:type="dxa"/>
-            </w:tcMar>
-            <w:vAlign w:val="center"/>
-          </w:tcPr>
-          <w:p>
-            <w:pPr>
-              <w:keepNext w:val="0"/>
-              <w:keepLines w:val="0"/>
-              <w:widowControl/>
-              <w:suppressLineNumbers w:val="0"/>
-              <w:spacing w:line="250" w:lineRule="atLeast"/>
-              <w:jc w:val="left"/>
-              <w:rPr>
-                <w:rFonts w:hint="default" w:ascii="Times New Roman" w:hAnsi="Times New Roman" w:eastAsia="宋体" w:cs="Times New Roman"/>
-                <w:i w:val="0"/>
-                <w:iCs w:val="0"/>
-                <w:caps w:val="0"/>
-                <w:color w:val="0F1115"/>
-                <w:spacing w:val="0"/>
-                <w:sz w:val="18"/>
-                <w:szCs w:val="18"/>
-                <w:lang w:val="en-US" w:eastAsia="zh-CN"/>
-              </w:rPr>
-            </w:pPr>
-            <w:r>
-              <w:rPr>
-                <w:rFonts w:hint="eastAsia" w:ascii="Times New Roman" w:hAnsi="Times New Roman" w:eastAsia="宋体" w:cs="Times New Roman"/>
-                <w:i w:val="0"/>
-                <w:iCs w:val="0"/>
-                <w:caps w:val="0"/>
-                <w:color w:val="0F1115"/>
-                <w:spacing w:val="0"/>
-                <w:sz w:val="18"/>
-                <w:szCs w:val="18"/>
-                <w:lang w:val="en-US" w:eastAsia="zh-CN"/>
-              </w:rPr>
-              <w:t>生成法球环绕</w:t>
-            </w:r>
-          </w:p>
-        </w:tc>
-        <w:tc>
-          <w:tcPr>
-            <w:tcW w:w="663" w:type="pct"/>
-            <w:tcBorders>
-              <w:top w:val="single" w:color="auto" w:sz="4" w:space="0"/>
-              <w:left w:val="single" w:color="auto" w:sz="4" w:space="0"/>
-              <w:bottom w:val="single" w:color="auto" w:sz="4" w:space="0"/>
-              <w:right w:val="single" w:color="auto" w:sz="4" w:space="0"/>
-            </w:tcBorders>
-            <w:shd w:val="clear" w:color="auto" w:fill="auto"/>
-            <w:tcMar>
-              <w:top w:w="100" w:type="dxa"/>
-              <w:left w:w="160" w:type="dxa"/>
-              <w:bottom w:w="100" w:type="dxa"/>
-              <w:right w:w="0" w:type="dxa"/>
-            </w:tcMar>
-            <w:vAlign w:val="center"/>
-          </w:tcPr>
-          <w:p>
-            <w:pPr>
-              <w:keepNext w:val="0"/>
-              <w:keepLines w:val="0"/>
-              <w:widowControl/>
-              <w:suppressLineNumbers w:val="0"/>
-              <w:spacing w:line="250" w:lineRule="atLeast"/>
-              <w:jc w:val="left"/>
-              <w:rPr>
-                <w:rFonts w:hint="default" w:ascii="Times New Roman" w:hAnsi="Times New Roman" w:eastAsia="宋体" w:cs="Times New Roman"/>
-                <w:i w:val="0"/>
-                <w:iCs w:val="0"/>
-                <w:caps w:val="0"/>
-                <w:color w:val="0F1115"/>
-                <w:spacing w:val="0"/>
-                <w:sz w:val="18"/>
-                <w:szCs w:val="18"/>
-                <w:lang w:val="en-US" w:eastAsia="zh-CN"/>
-              </w:rPr>
-            </w:pPr>
-            <w:r>
-              <w:rPr>
-                <w:rFonts w:hint="eastAsia" w:ascii="Times New Roman" w:hAnsi="Times New Roman" w:eastAsia="宋体" w:cs="Times New Roman"/>
-                <w:i w:val="0"/>
-                <w:iCs w:val="0"/>
-                <w:caps w:val="0"/>
-                <w:color w:val="0F1115"/>
-                <w:spacing w:val="0"/>
-                <w:sz w:val="18"/>
-                <w:szCs w:val="18"/>
-                <w:lang w:val="en-US" w:eastAsia="zh-CN"/>
-              </w:rPr>
-              <w:t>隐身</w:t>
-            </w:r>
-          </w:p>
-        </w:tc>
-        <w:tc>
-          <w:tcPr>
-            <w:tcW w:w="1705" w:type="pct"/>
-            <w:tcBorders>
-              <w:top w:val="single" w:color="auto" w:sz="4" w:space="0"/>
-              <w:left w:val="single" w:color="auto" w:sz="4" w:space="0"/>
-              <w:bottom w:val="single" w:color="auto" w:sz="4" w:space="0"/>
-              <w:right w:val="single" w:color="auto" w:sz="4" w:space="0"/>
-            </w:tcBorders>
-            <w:shd w:val="clear" w:color="auto" w:fill="auto"/>
-            <w:tcMar>
-              <w:top w:w="100" w:type="dxa"/>
-              <w:left w:w="160" w:type="dxa"/>
-              <w:bottom w:w="100" w:type="dxa"/>
-              <w:right w:w="0" w:type="dxa"/>
-            </w:tcMar>
-            <w:vAlign w:val="center"/>
-          </w:tcPr>
-          <w:p>
-            <w:pPr>
-              <w:keepNext w:val="0"/>
-              <w:keepLines w:val="0"/>
-              <w:widowControl/>
-              <w:suppressLineNumbers w:val="0"/>
-              <w:spacing w:line="250" w:lineRule="atLeast"/>
-              <w:jc w:val="left"/>
-              <w:rPr>
-                <w:rFonts w:hint="default" w:ascii="Times New Roman" w:hAnsi="Times New Roman" w:eastAsia="宋体" w:cs="Times New Roman"/>
-                <w:i w:val="0"/>
-                <w:iCs w:val="0"/>
-                <w:caps w:val="0"/>
-                <w:color w:val="0F1115"/>
-                <w:spacing w:val="0"/>
-                <w:sz w:val="18"/>
-                <w:szCs w:val="18"/>
-                <w:lang w:val="en-US" w:eastAsia="zh-CN"/>
-              </w:rPr>
-            </w:pPr>
-            <w:r>
-              <w:rPr>
-                <w:rFonts w:hint="eastAsia" w:ascii="Times New Roman" w:hAnsi="Times New Roman" w:eastAsia="宋体" w:cs="Times New Roman"/>
-                <w:i w:val="0"/>
-                <w:iCs w:val="0"/>
-                <w:caps w:val="0"/>
-                <w:color w:val="0F1115"/>
-                <w:spacing w:val="0"/>
-                <w:sz w:val="18"/>
-                <w:szCs w:val="18"/>
-                <w:lang w:val="en-US" w:eastAsia="zh-CN"/>
-              </w:rPr>
-              <w:t>生成前可以蓄力，释放强力版</w:t>
-            </w:r>
-          </w:p>
-        </w:tc>
-      </w:tr>
-      <w:tr>
-        <w:tblPrEx>
-          <w:tblBorders>
-            <w:top w:val="none" w:color="auto" w:sz="0" w:space="0"/>
-            <w:left w:val="none" w:color="auto" w:sz="0" w:space="0"/>
-            <w:bottom w:val="none" w:color="auto" w:sz="0" w:space="0"/>
-            <w:right w:val="none" w:color="auto" w:sz="0" w:space="0"/>
-            <w:insideH w:val="none" w:color="auto" w:sz="0" w:space="0"/>
-            <w:insideV w:val="none" w:color="auto" w:sz="0" w:space="0"/>
-          </w:tblBorders>
-          <w:tblCellMar>
-            <w:top w:w="15" w:type="dxa"/>
-            <w:left w:w="15" w:type="dxa"/>
-            <w:bottom w:w="15" w:type="dxa"/>
-            <w:right w:w="15" w:type="dxa"/>
-          </w:tblCellMar>
-        </w:tblPrEx>
-        <w:tc>
-          <w:tcPr>
-            <w:tcW w:w="354" w:type="pct"/>
-            <w:tcBorders>
-              <w:top w:val="single" w:color="auto" w:sz="4" w:space="0"/>
-              <w:left w:val="single" w:color="auto" w:sz="4" w:space="0"/>
-              <w:bottom w:val="single" w:color="auto" w:sz="4" w:space="0"/>
-              <w:right w:val="single" w:color="auto" w:sz="4" w:space="0"/>
-            </w:tcBorders>
-            <w:shd w:val="clear" w:color="auto" w:fill="auto"/>
-            <w:tcMar>
-              <w:top w:w="100" w:type="dxa"/>
-              <w:left w:w="0" w:type="dxa"/>
-              <w:bottom w:w="100" w:type="dxa"/>
-              <w:right w:w="160" w:type="dxa"/>
-            </w:tcMar>
-            <w:vAlign w:val="center"/>
-          </w:tcPr>
-          <w:p>
-            <w:pPr>
-              <w:keepNext w:val="0"/>
-              <w:keepLines w:val="0"/>
-              <w:widowControl/>
-              <w:suppressLineNumbers w:val="0"/>
-              <w:spacing w:line="250" w:lineRule="atLeast"/>
-              <w:jc w:val="left"/>
-              <w:rPr>
-                <w:rFonts w:hint="default" w:ascii="Times New Roman" w:hAnsi="Times New Roman" w:eastAsia="宋体" w:cs="Times New Roman"/>
-                <w:i w:val="0"/>
-                <w:iCs w:val="0"/>
-                <w:caps w:val="0"/>
-                <w:color w:val="0F1115"/>
-                <w:spacing w:val="0"/>
-                <w:sz w:val="18"/>
-                <w:szCs w:val="18"/>
-              </w:rPr>
-            </w:pPr>
-            <w:r>
-              <w:rPr>
-                <w:rFonts w:hint="default" w:ascii="Times New Roman" w:hAnsi="Times New Roman" w:eastAsia="宋体" w:cs="Times New Roman"/>
-                <w:i w:val="0"/>
-                <w:iCs w:val="0"/>
-                <w:caps w:val="0"/>
-                <w:color w:val="0F1115"/>
-                <w:spacing w:val="0"/>
-                <w:kern w:val="0"/>
-                <w:sz w:val="18"/>
-                <w:szCs w:val="18"/>
-                <w:lang w:val="en-US" w:eastAsia="zh-CN" w:bidi="ar"/>
-              </w:rPr>
               <w:t>水</w:t>
             </w:r>
           </w:p>
@@ -27963,7 +28346,7 @@
           <w:shd w:val="clear" w:fill="FFFFFF"/>
         </w:rPr>
       </w:pPr>
-      <w:bookmarkStart w:id="39" w:name="_Toc31347"/>
+      <w:bookmarkStart w:id="39" w:name="_Toc17237"/>
       <w:r>
         <w:rPr>
           <w:rFonts w:hint="default" w:ascii="Times New Roman" w:hAnsi="Times New Roman" w:eastAsia="宋体" w:cs="Times New Roman"/>
@@ -28014,7 +28397,7 @@
           <w:shd w:val="clear" w:fill="FFFFFF"/>
         </w:rPr>
       </w:pPr>
-      <w:bookmarkStart w:id="40" w:name="_Toc12251"/>
+      <w:bookmarkStart w:id="40" w:name="_Toc13080"/>
       <w:r>
         <w:rPr>
           <w:rFonts w:hint="default" w:ascii="Times New Roman" w:hAnsi="Times New Roman" w:eastAsia="宋体" w:cs="Times New Roman"/>
@@ -28097,6 +28480,7 @@
             <w:insideH w:val="none" w:color="auto" w:sz="0" w:space="0"/>
             <w:insideV w:val="none" w:color="auto" w:sz="0" w:space="0"/>
           </w:tblBorders>
+          <w:shd w:val="clear" w:color="auto" w:fill="FFFFFF"/>
           <w:tblCellMar>
             <w:top w:w="15" w:type="dxa"/>
             <w:left w:w="15" w:type="dxa"/>
@@ -28280,6 +28664,7 @@
             <w:insideH w:val="none" w:color="auto" w:sz="0" w:space="0"/>
             <w:insideV w:val="none" w:color="auto" w:sz="0" w:space="0"/>
           </w:tblBorders>
+          <w:shd w:val="clear" w:color="auto" w:fill="FFFFFF"/>
           <w:tblCellMar>
             <w:top w:w="15" w:type="dxa"/>
             <w:left w:w="15" w:type="dxa"/>
@@ -28460,6 +28845,7 @@
             <w:insideH w:val="none" w:color="auto" w:sz="0" w:space="0"/>
             <w:insideV w:val="none" w:color="auto" w:sz="0" w:space="0"/>
           </w:tblBorders>
+          <w:shd w:val="clear" w:color="auto" w:fill="FFFFFF"/>
           <w:tblCellMar>
             <w:top w:w="15" w:type="dxa"/>
             <w:left w:w="15" w:type="dxa"/>
@@ -28640,180 +29026,7 @@
             <w:insideH w:val="none" w:color="auto" w:sz="0" w:space="0"/>
             <w:insideV w:val="none" w:color="auto" w:sz="0" w:space="0"/>
           </w:tblBorders>
-        </w:tblPrEx>
-        <w:tc>
-          <w:tcPr>
-            <w:tcW w:w="447" w:type="pct"/>
-            <w:tcBorders>
-              <w:top w:val="single" w:color="auto" w:sz="4" w:space="0"/>
-              <w:left w:val="single" w:color="auto" w:sz="4" w:space="0"/>
-              <w:bottom w:val="single" w:color="auto" w:sz="4" w:space="0"/>
-              <w:right w:val="single" w:color="auto" w:sz="4" w:space="0"/>
-            </w:tcBorders>
-            <w:shd w:val="clear" w:color="auto" w:fill="auto"/>
-            <w:tcMar>
-              <w:top w:w="100" w:type="dxa"/>
-              <w:left w:w="0" w:type="dxa"/>
-              <w:bottom w:w="100" w:type="dxa"/>
-              <w:right w:w="160" w:type="dxa"/>
-            </w:tcMar>
-            <w:vAlign w:val="center"/>
-          </w:tcPr>
-          <w:p>
-            <w:pPr>
-              <w:keepNext w:val="0"/>
-              <w:keepLines w:val="0"/>
-              <w:widowControl/>
-              <w:suppressLineNumbers w:val="0"/>
-              <w:spacing w:line="250" w:lineRule="atLeast"/>
-              <w:jc w:val="center"/>
-              <w:rPr>
-                <w:rFonts w:hint="default" w:ascii="Times New Roman" w:hAnsi="Times New Roman" w:eastAsia="宋体" w:cs="Times New Roman"/>
-                <w:i w:val="0"/>
-                <w:iCs w:val="0"/>
-                <w:caps w:val="0"/>
-                <w:color w:val="0F1115"/>
-                <w:spacing w:val="0"/>
-                <w:sz w:val="18"/>
-                <w:szCs w:val="18"/>
-              </w:rPr>
-            </w:pPr>
-            <w:r>
-              <w:rPr>
-                <w:rFonts w:hint="default" w:ascii="Times New Roman" w:hAnsi="Times New Roman" w:eastAsia="宋体" w:cs="Times New Roman"/>
-                <w:i w:val="0"/>
-                <w:iCs w:val="0"/>
-                <w:caps w:val="0"/>
-                <w:color w:val="0F1115"/>
-                <w:spacing w:val="0"/>
-                <w:kern w:val="0"/>
-                <w:sz w:val="18"/>
-                <w:szCs w:val="18"/>
-                <w:lang w:val="en-US" w:eastAsia="zh-CN" w:bidi="ar"/>
-              </w:rPr>
-              <w:t>F-03</w:t>
-            </w:r>
-          </w:p>
-        </w:tc>
-        <w:tc>
-          <w:tcPr>
-            <w:tcW w:w="1040" w:type="pct"/>
-            <w:tcBorders>
-              <w:top w:val="single" w:color="auto" w:sz="4" w:space="0"/>
-              <w:left w:val="single" w:color="auto" w:sz="4" w:space="0"/>
-              <w:bottom w:val="single" w:color="auto" w:sz="4" w:space="0"/>
-              <w:right w:val="single" w:color="auto" w:sz="4" w:space="0"/>
-            </w:tcBorders>
-            <w:shd w:val="clear" w:color="auto" w:fill="auto"/>
-            <w:tcMar>
-              <w:top w:w="100" w:type="dxa"/>
-              <w:left w:w="160" w:type="dxa"/>
-              <w:bottom w:w="100" w:type="dxa"/>
-              <w:right w:w="160" w:type="dxa"/>
-            </w:tcMar>
-            <w:vAlign w:val="center"/>
-          </w:tcPr>
-          <w:p>
-            <w:pPr>
-              <w:keepNext w:val="0"/>
-              <w:keepLines w:val="0"/>
-              <w:widowControl/>
-              <w:suppressLineNumbers w:val="0"/>
-              <w:spacing w:line="250" w:lineRule="atLeast"/>
-              <w:jc w:val="center"/>
-              <w:rPr>
-                <w:rFonts w:hint="default" w:ascii="Times New Roman" w:hAnsi="Times New Roman" w:eastAsia="宋体" w:cs="Times New Roman"/>
-                <w:i w:val="0"/>
-                <w:iCs w:val="0"/>
-                <w:caps w:val="0"/>
-                <w:color w:val="0F1115"/>
-                <w:spacing w:val="0"/>
-                <w:sz w:val="18"/>
-                <w:szCs w:val="18"/>
-              </w:rPr>
-            </w:pPr>
-            <w:r>
-              <w:rPr>
-                <w:rFonts w:hint="default" w:ascii="Times New Roman" w:hAnsi="Times New Roman" w:eastAsia="宋体" w:cs="Times New Roman"/>
-                <w:i w:val="0"/>
-                <w:iCs w:val="0"/>
-                <w:caps w:val="0"/>
-                <w:color w:val="0F1115"/>
-                <w:spacing w:val="0"/>
-                <w:kern w:val="0"/>
-                <w:sz w:val="18"/>
-                <w:szCs w:val="18"/>
-                <w:lang w:val="en-US" w:eastAsia="zh-CN" w:bidi="ar"/>
-              </w:rPr>
-              <w:t>事件通信</w:t>
-            </w:r>
-          </w:p>
-        </w:tc>
-        <w:tc>
-          <w:tcPr>
-            <w:tcW w:w="3512" w:type="pct"/>
-            <w:tcBorders>
-              <w:top w:val="single" w:color="auto" w:sz="4" w:space="0"/>
-              <w:left w:val="single" w:color="auto" w:sz="4" w:space="0"/>
-              <w:bottom w:val="single" w:color="auto" w:sz="4" w:space="0"/>
-              <w:right w:val="single" w:color="auto" w:sz="4" w:space="0"/>
-            </w:tcBorders>
-            <w:shd w:val="clear" w:color="auto" w:fill="auto"/>
-            <w:tcMar>
-              <w:top w:w="100" w:type="dxa"/>
-              <w:left w:w="160" w:type="dxa"/>
-              <w:bottom w:w="100" w:type="dxa"/>
-              <w:right w:w="0" w:type="dxa"/>
-            </w:tcMar>
-            <w:vAlign w:val="center"/>
-          </w:tcPr>
-          <w:p>
-            <w:pPr>
-              <w:keepNext w:val="0"/>
-              <w:keepLines w:val="0"/>
-              <w:widowControl/>
-              <w:suppressLineNumbers w:val="0"/>
-              <w:spacing w:line="250" w:lineRule="atLeast"/>
-              <w:jc w:val="center"/>
-              <w:rPr>
-                <w:rFonts w:hint="default" w:ascii="Times New Roman" w:hAnsi="Times New Roman" w:eastAsia="宋体" w:cs="Times New Roman"/>
-                <w:i w:val="0"/>
-                <w:iCs w:val="0"/>
-                <w:caps w:val="0"/>
-                <w:color w:val="0F1115"/>
-                <w:spacing w:val="0"/>
-                <w:sz w:val="18"/>
-                <w:szCs w:val="18"/>
-              </w:rPr>
-            </w:pPr>
-            <w:r>
-              <w:rPr>
-                <w:rFonts w:hint="default" w:ascii="Times New Roman" w:hAnsi="Times New Roman" w:eastAsia="宋体" w:cs="Times New Roman"/>
-                <w:i w:val="0"/>
-                <w:iCs w:val="0"/>
-                <w:caps w:val="0"/>
-                <w:color w:val="0F1115"/>
-                <w:spacing w:val="0"/>
-                <w:kern w:val="0"/>
-                <w:sz w:val="18"/>
-                <w:szCs w:val="18"/>
-                <w:lang w:val="en-US" w:eastAsia="zh-CN" w:bidi="ar"/>
-              </w:rPr>
-              <w:t>本位事件正确触发变位响应</w:t>
-            </w:r>
-          </w:p>
-        </w:tc>
-      </w:tr>
-      <w:tr>
-        <w:tblPrEx>
-          <w:tblBorders>
-            <w:top w:val="none" w:color="auto" w:sz="0" w:space="0"/>
-            <w:left w:val="none" w:color="auto" w:sz="0" w:space="0"/>
-            <w:bottom w:val="none" w:color="auto" w:sz="0" w:space="0"/>
-            <w:right w:val="none" w:color="auto" w:sz="0" w:space="0"/>
-            <w:insideH w:val="none" w:color="auto" w:sz="0" w:space="0"/>
-            <w:insideV w:val="none" w:color="auto" w:sz="0" w:space="0"/>
-          </w:tblBorders>
+          <w:shd w:val="clear" w:color="auto" w:fill="FFFFFF"/>
           <w:tblCellMar>
             <w:top w:w="15" w:type="dxa"/>
             <w:left w:w="15" w:type="dxa"/>
@@ -28871,7 +29084,7 @@
                 <w:szCs w:val="18"/>
                 <w:lang w:val="en-US" w:eastAsia="zh-CN" w:bidi="ar"/>
               </w:rPr>
-              <w:t>F-04</w:t>
+              <w:t>F-03</w:t>
             </w:r>
           </w:p>
         </w:tc>
@@ -28925,7 +29138,7 @@
                 <w:szCs w:val="18"/>
                 <w:lang w:val="en-US" w:eastAsia="zh-CN" w:bidi="ar"/>
               </w:rPr>
-              <w:t>战斗基础</w:t>
+              <w:t>事件通信</w:t>
             </w:r>
           </w:p>
         </w:tc>
@@ -28979,7 +29192,7 @@
                 <w:szCs w:val="18"/>
                 <w:lang w:val="en-US" w:eastAsia="zh-CN" w:bidi="ar"/>
               </w:rPr>
-              <w:t>角色可移动、攻击、使用技能，敌人可被击杀</w:t>
+              <w:t>本位事件正确触发变位响应</w:t>
             </w:r>
           </w:p>
         </w:tc>
@@ -28994,6 +29207,7 @@
             <w:insideH w:val="none" w:color="auto" w:sz="0" w:space="0"/>
             <w:insideV w:val="none" w:color="auto" w:sz="0" w:space="0"/>
           </w:tblBorders>
+          <w:shd w:val="clear" w:color="auto" w:fill="FFFFFF"/>
           <w:tblCellMar>
             <w:top w:w="15" w:type="dxa"/>
             <w:left w:w="15" w:type="dxa"/>
@@ -29051,7 +29265,7 @@
                 <w:szCs w:val="18"/>
                 <w:lang w:val="en-US" w:eastAsia="zh-CN" w:bidi="ar"/>
               </w:rPr>
-              <w:t>F-05</w:t>
+              <w:t>F-04</w:t>
             </w:r>
           </w:p>
         </w:tc>
@@ -29105,7 +29319,7 @@
                 <w:szCs w:val="18"/>
                 <w:lang w:val="en-US" w:eastAsia="zh-CN" w:bidi="ar"/>
               </w:rPr>
-              <w:t>库容管理</w:t>
+              <w:t>战斗基础</w:t>
             </w:r>
           </w:p>
         </w:tc>
@@ -29159,7 +29373,7 @@
                 <w:szCs w:val="18"/>
                 <w:lang w:val="en-US" w:eastAsia="zh-CN" w:bidi="ar"/>
               </w:rPr>
-              <w:t>八格库容正常显示，库满时获取新刻印弹出舍弃选择</w:t>
+              <w:t>角色可移动、攻击、使用技能，敌人可被击杀</w:t>
             </w:r>
           </w:p>
         </w:tc>
@@ -29174,6 +29388,7 @@
             <w:insideH w:val="none" w:color="auto" w:sz="0" w:space="0"/>
             <w:insideV w:val="none" w:color="auto" w:sz="0" w:space="0"/>
           </w:tblBorders>
+          <w:shd w:val="clear" w:color="auto" w:fill="FFFFFF"/>
           <w:tblCellMar>
             <w:top w:w="15" w:type="dxa"/>
             <w:left w:w="15" w:type="dxa"/>
@@ -29231,6 +29446,187 @@
                 <w:szCs w:val="18"/>
                 <w:lang w:val="en-US" w:eastAsia="zh-CN" w:bidi="ar"/>
               </w:rPr>
+              <w:t>F-05</w:t>
+            </w:r>
+          </w:p>
+        </w:tc>
+        <w:tc>
+          <w:tcPr>
+            <w:tcW w:w="1040" w:type="pct"/>
+            <w:tcBorders>
+              <w:top w:val="single" w:color="auto" w:sz="4" w:space="0"/>
+              <w:left w:val="single" w:color="auto" w:sz="4" w:space="0"/>
+              <w:bottom w:val="single" w:color="auto" w:sz="4" w:space="0"/>
+              <w:right w:val="single" w:color="auto" w:sz="4" w:space="0"/>
+            </w:tcBorders>
+            <w:shd w:val="clear" w:color="auto" w:fill="auto"/>
+            <w:tcMar>
+              <w:top w:w="100" w:type="dxa"/>
+              <w:left w:w="160" w:type="dxa"/>
+              <w:bottom w:w="100" w:type="dxa"/>
+              <w:right w:w="160" w:type="dxa"/>
+            </w:tcMar>
+            <w:vAlign w:val="center"/>
+          </w:tcPr>
+          <w:p>
+            <w:pPr>
+              <w:keepNext w:val="0"/>
+              <w:keepLines w:val="0"/>
+              <w:widowControl/>
+              <w:suppressLineNumbers w:val="0"/>
+              <w:spacing w:line="250" w:lineRule="atLeast"/>
+              <w:jc w:val="center"/>
+              <w:rPr>
+                <w:rFonts w:hint="default" w:ascii="Times New Roman" w:hAnsi="Times New Roman" w:eastAsia="宋体" w:cs="Times New Roman"/>
+                <w:i w:val="0"/>
+                <w:iCs w:val="0"/>
+                <w:caps w:val="0"/>
+                <w:color w:val="0F1115"/>
+                <w:spacing w:val="0"/>
+                <w:sz w:val="18"/>
+                <w:szCs w:val="18"/>
+              </w:rPr>
+            </w:pPr>
+            <w:r>
+              <w:rPr>
+                <w:rFonts w:hint="default" w:ascii="Times New Roman" w:hAnsi="Times New Roman" w:eastAsia="宋体" w:cs="Times New Roman"/>
+                <w:i w:val="0"/>
+                <w:iCs w:val="0"/>
+                <w:caps w:val="0"/>
+                <w:color w:val="0F1115"/>
+                <w:spacing w:val="0"/>
+                <w:kern w:val="0"/>
+                <w:sz w:val="18"/>
+                <w:szCs w:val="18"/>
+                <w:lang w:val="en-US" w:eastAsia="zh-CN" w:bidi="ar"/>
+              </w:rPr>
+              <w:t>库容管理</w:t>
+            </w:r>
+          </w:p>
+        </w:tc>
+        <w:tc>
+          <w:tcPr>
+            <w:tcW w:w="3512" w:type="pct"/>
+            <w:tcBorders>
+              <w:top w:val="single" w:color="auto" w:sz="4" w:space="0"/>
+              <w:left w:val="single" w:color="auto" w:sz="4" w:space="0"/>
+              <w:bottom w:val="single" w:color="auto" w:sz="4" w:space="0"/>
+              <w:right w:val="single" w:color="auto" w:sz="4" w:space="0"/>
+            </w:tcBorders>
+            <w:shd w:val="clear" w:color="auto" w:fill="auto"/>
+            <w:tcMar>
+              <w:top w:w="100" w:type="dxa"/>
+              <w:left w:w="160" w:type="dxa"/>
+              <w:bottom w:w="100" w:type="dxa"/>
+              <w:right w:w="0" w:type="dxa"/>
+            </w:tcMar>
+            <w:vAlign w:val="center"/>
+          </w:tcPr>
+          <w:p>
+            <w:pPr>
+              <w:keepNext w:val="0"/>
+              <w:keepLines w:val="0"/>
+              <w:widowControl/>
+              <w:suppressLineNumbers w:val="0"/>
+              <w:spacing w:line="250" w:lineRule="atLeast"/>
+              <w:jc w:val="center"/>
+              <w:rPr>
+                <w:rFonts w:hint="default" w:ascii="Times New Roman" w:hAnsi="Times New Roman" w:eastAsia="宋体" w:cs="Times New Roman"/>
+                <w:i w:val="0"/>
+                <w:iCs w:val="0"/>
+                <w:caps w:val="0"/>
+                <w:color w:val="0F1115"/>
+                <w:spacing w:val="0"/>
+                <w:sz w:val="18"/>
+                <w:szCs w:val="18"/>
+              </w:rPr>
+            </w:pPr>
+            <w:r>
+              <w:rPr>
+                <w:rFonts w:hint="default" w:ascii="Times New Roman" w:hAnsi="Times New Roman" w:eastAsia="宋体" w:cs="Times New Roman"/>
+                <w:i w:val="0"/>
+                <w:iCs w:val="0"/>
+                <w:caps w:val="0"/>
+                <w:color w:val="0F1115"/>
+                <w:spacing w:val="0"/>
+                <w:kern w:val="0"/>
+                <w:sz w:val="18"/>
+                <w:szCs w:val="18"/>
+                <w:lang w:val="en-US" w:eastAsia="zh-CN" w:bidi="ar"/>
+              </w:rPr>
+              <w:t>八格库容正常显示，库满时获取新刻印弹出舍弃选择</w:t>
+            </w:r>
+          </w:p>
+        </w:tc>
+      </w:tr>
+      <w:tr>
+        <w:tblPrEx>
+          <w:tblBorders>
+            <w:top w:val="none" w:color="auto" w:sz="0" w:space="0"/>
+            <w:left w:val="none" w:color="auto" w:sz="0" w:space="0"/>
+            <w:bottom w:val="none" w:color="auto" w:sz="0" w:space="0"/>
+            <w:right w:val="none" w:color="auto" w:sz="0" w:space="0"/>
+            <w:insideH w:val="none" w:color="auto" w:sz="0" w:space="0"/>
+            <w:insideV w:val="none" w:color="auto" w:sz="0" w:space="0"/>
+          </w:tblBorders>
+          <w:shd w:val="clear" w:color="auto" w:fill="FFFFFF"/>
+          <w:tblCellMar>
+            <w:top w:w="15" w:type="dxa"/>
+            <w:left w:w="15" w:type="dxa"/>
+            <w:bottom w:w="15" w:type="dxa"/>
+            <w:right w:w="15" w:type="dxa"/>
+          </w:tblCellMar>
+        </w:tblPrEx>
+        <w:tc>
+          <w:tcPr>
+            <w:tcW w:w="447" w:type="pct"/>
+            <w:tcBorders>
+              <w:top w:val="single" w:color="auto" w:sz="4" w:space="0"/>
+              <w:left w:val="single" w:color="auto" w:sz="4" w:space="0"/>
+              <w:bottom w:val="single" w:color="auto" w:sz="4" w:space="0"/>
+              <w:right w:val="single" w:color="auto" w:sz="4" w:space="0"/>
+            </w:tcBorders>
+            <w:shd w:val="clear" w:color="auto" w:fill="auto"/>
+            <w:tcMar>
+              <w:top w:w="100" w:type="dxa"/>
+              <w:left w:w="0" w:type="dxa"/>
+              <w:bottom w:w="100" w:type="dxa"/>
+              <w:right w:w="160" w:type="dxa"/>
+            </w:tcMar>
+            <w:vAlign w:val="center"/>
+          </w:tcPr>
+          <w:p>
+            <w:pPr>
+              <w:keepNext w:val="0"/>
+              <w:keepLines w:val="0"/>
+              <w:widowControl/>
+              <w:suppressLineNumbers w:val="0"/>
+              <w:spacing w:line="250" w:lineRule="atLeast"/>
+              <w:jc w:val="center"/>
+              <w:rPr>
+                <w:rFonts w:hint="default" w:ascii="Times New Roman" w:hAnsi="Times New Roman" w:eastAsia="宋体" w:cs="Times New Roman"/>
+                <w:i w:val="0"/>
+                <w:iCs w:val="0"/>
+                <w:caps w:val="0"/>
+                <w:color w:val="0F1115"/>
+                <w:spacing w:val="0"/>
+                <w:sz w:val="18"/>
+                <w:szCs w:val="18"/>
+              </w:rPr>
+            </w:pPr>
+            <w:r>
+              <w:rPr>
+                <w:rFonts w:hint="default" w:ascii="Times New Roman" w:hAnsi="Times New Roman" w:eastAsia="宋体" w:cs="Times New Roman"/>
+                <w:i w:val="0"/>
+                <w:iCs w:val="0"/>
+                <w:caps w:val="0"/>
+                <w:color w:val="0F1115"/>
+                <w:spacing w:val="0"/>
+                <w:kern w:val="0"/>
+                <w:sz w:val="18"/>
+                <w:szCs w:val="18"/>
+                <w:lang w:val="en-US" w:eastAsia="zh-CN" w:bidi="ar"/>
+              </w:rPr>
               <w:t>F-06</w:t>
             </w:r>
           </w:p>
@@ -29354,6 +29750,7 @@
             <w:insideH w:val="none" w:color="auto" w:sz="0" w:space="0"/>
             <w:insideV w:val="none" w:color="auto" w:sz="0" w:space="0"/>
           </w:tblBorders>
+          <w:shd w:val="clear" w:color="auto" w:fill="FFFFFF"/>
           <w:tblCellMar>
             <w:top w:w="15" w:type="dxa"/>
             <w:left w:w="15" w:type="dxa"/>
@@ -29715,6 +30112,7 @@
             <w:insideH w:val="none" w:color="auto" w:sz="0" w:space="0"/>
             <w:insideV w:val="none" w:color="auto" w:sz="0" w:space="0"/>
           </w:tblBorders>
+          <w:shd w:val="clear" w:color="auto" w:fill="FFFFFF"/>
           <w:tblCellMar>
             <w:top w:w="15" w:type="dxa"/>
             <w:left w:w="15" w:type="dxa"/>
@@ -29895,6 +30293,7 @@
             <w:insideH w:val="none" w:color="auto" w:sz="0" w:space="0"/>
             <w:insideV w:val="none" w:color="auto" w:sz="0" w:space="0"/>
           </w:tblBorders>
+          <w:shd w:val="clear" w:color="auto" w:fill="FFFFFF"/>
           <w:tblCellMar>
             <w:top w:w="15" w:type="dxa"/>
             <w:left w:w="15" w:type="dxa"/>
@@ -30075,6 +30474,7 @@
             <w:insideH w:val="none" w:color="auto" w:sz="0" w:space="0"/>
             <w:insideV w:val="none" w:color="auto" w:sz="0" w:space="0"/>
           </w:tblBorders>
+          <w:shd w:val="clear" w:color="auto" w:fill="FFFFFF"/>
           <w:tblCellMar>
             <w:top w:w="15" w:type="dxa"/>
             <w:left w:w="15" w:type="dxa"/>
@@ -30255,6 +30655,7 @@
             <w:insideH w:val="none" w:color="auto" w:sz="0" w:space="0"/>
             <w:insideV w:val="none" w:color="auto" w:sz="0" w:space="0"/>
           </w:tblBorders>
+          <w:shd w:val="clear" w:color="auto" w:fill="FFFFFF"/>
           <w:tblCellMar>
             <w:top w:w="15" w:type="dxa"/>
             <w:left w:w="15" w:type="dxa"/>
@@ -30435,6 +30836,7 @@
             <w:insideH w:val="none" w:color="auto" w:sz="0" w:space="0"/>
             <w:insideV w:val="none" w:color="auto" w:sz="0" w:space="0"/>
           </w:tblBorders>
+          <w:shd w:val="clear" w:color="auto" w:fill="FFFFFF"/>
           <w:tblCellMar>
             <w:top w:w="15" w:type="dxa"/>
             <w:left w:w="15" w:type="dxa"/>
@@ -30673,7 +31075,7 @@
           <w:szCs w:val="28"/>
         </w:rPr>
       </w:pPr>
-      <w:bookmarkStart w:id="41" w:name="_Toc21087"/>
+      <w:bookmarkStart w:id="41" w:name="_Toc30157"/>
       <w:r>
         <w:rPr>
           <w:rFonts w:hint="default" w:ascii="Times New Roman" w:hAnsi="Times New Roman" w:eastAsia="宋体" w:cs="Times New Roman"/>
@@ -31659,6 +32061,7 @@
             <w:insideH w:val="none" w:color="auto" w:sz="0" w:space="0"/>
             <w:insideV w:val="none" w:color="auto" w:sz="0" w:space="0"/>
           </w:tblBorders>
+          <w:shd w:val="clear" w:color="auto" w:fill="FFFFFF"/>
           <w:tblCellMar>
             <w:top w:w="15" w:type="dxa"/>
             <w:left w:w="15" w:type="dxa"/>
@@ -32090,7 +32493,7 @@
           <w:shd w:val="clear" w:fill="FFFFFF"/>
         </w:rPr>
       </w:pPr>
-      <w:bookmarkStart w:id="42" w:name="_Toc2765"/>
+      <w:bookmarkStart w:id="42" w:name="_Toc1186"/>
       <w:r>
         <w:rPr>
           <w:rFonts w:hint="default" w:ascii="Times New Roman" w:hAnsi="Times New Roman" w:eastAsia="宋体" w:cs="Times New Roman"/>
@@ -32140,7 +32543,7 @@
           <w:szCs w:val="28"/>
         </w:rPr>
       </w:pPr>
-      <w:bookmarkStart w:id="43" w:name="_Toc2304"/>
+      <w:bookmarkStart w:id="43" w:name="_Toc27766"/>
       <w:r>
         <w:rPr>
           <w:rFonts w:hint="default" w:ascii="Times New Roman" w:hAnsi="Times New Roman" w:eastAsia="宋体" w:cs="Times New Roman"/>
@@ -32360,6 +32763,7 @@
             <w:insideH w:val="none" w:color="auto" w:sz="0" w:space="0"/>
             <w:insideV w:val="none" w:color="auto" w:sz="0" w:space="0"/>
           </w:tblBorders>
+          <w:shd w:val="clear" w:color="auto" w:fill="FFFFFF"/>
           <w:tblCellMar>
             <w:top w:w="15" w:type="dxa"/>
             <w:left w:w="15" w:type="dxa"/>
@@ -32494,6 +32898,7 @@
             <w:insideH w:val="none" w:color="auto" w:sz="0" w:space="0"/>
             <w:insideV w:val="none" w:color="auto" w:sz="0" w:space="0"/>
           </w:tblBorders>
+          <w:shd w:val="clear" w:color="auto" w:fill="FFFFFF"/>
           <w:tblCellMar>
             <w:top w:w="15" w:type="dxa"/>
             <w:left w:w="15" w:type="dxa"/>
@@ -32762,6 +33167,7 @@
             <w:insideH w:val="none" w:color="auto" w:sz="0" w:space="0"/>
             <w:insideV w:val="none" w:color="auto" w:sz="0" w:space="0"/>
           </w:tblBorders>
+          <w:shd w:val="clear" w:color="auto" w:fill="FFFFFF"/>
           <w:tblCellMar>
             <w:top w:w="15" w:type="dxa"/>
             <w:left w:w="15" w:type="dxa"/>
@@ -32896,6 +33302,7 @@
             <w:insideH w:val="none" w:color="auto" w:sz="0" w:space="0"/>
             <w:insideV w:val="none" w:color="auto" w:sz="0" w:space="0"/>
           </w:tblBorders>
+          <w:shd w:val="clear" w:color="auto" w:fill="FFFFFF"/>
           <w:tblCellMar>
             <w:top w:w="15" w:type="dxa"/>
             <w:left w:w="15" w:type="dxa"/>
@@ -33566,7 +33973,6 @@
             <w:insideH w:val="none" w:color="auto" w:sz="0" w:space="0"/>
             <w:insideV w:val="none" w:color="auto" w:sz="0" w:space="0"/>
           </w:tblBorders>
-          <w:shd w:val="clear" w:color="auto" w:fill="FFFFFF"/>
           <w:tblCellMar>
             <w:top w:w="15" w:type="dxa"/>
             <w:left w:w="15" w:type="dxa"/>
@@ -33687,6 +34093,274 @@
                 <w:lang w:val="en-US" w:eastAsia="zh-CN" w:bidi="ar"/>
               </w:rPr>
               <w:t>将两枚刻印合并为一枚，压缩库容</w:t>
+            </w:r>
+          </w:p>
+        </w:tc>
+      </w:tr>
+      <w:tr>
+        <w:tblPrEx>
+          <w:tblBorders>
+            <w:top w:val="none" w:color="auto" w:sz="0" w:space="0"/>
+            <w:left w:val="none" w:color="auto" w:sz="0" w:space="0"/>
+            <w:bottom w:val="none" w:color="auto" w:sz="0" w:space="0"/>
+            <w:right w:val="none" w:color="auto" w:sz="0" w:space="0"/>
+            <w:insideH w:val="none" w:color="auto" w:sz="0" w:space="0"/>
+            <w:insideV w:val="none" w:color="auto" w:sz="0" w:space="0"/>
+          </w:tblBorders>
+          <w:tblCellMar>
+            <w:top w:w="15" w:type="dxa"/>
+            <w:left w:w="15" w:type="dxa"/>
+            <w:bottom w:w="15" w:type="dxa"/>
+            <w:right w:w="15" w:type="dxa"/>
+          </w:tblCellMar>
+        </w:tblPrEx>
+        <w:tc>
+          <w:tcPr>
+            <w:tcW w:w="790" w:type="pct"/>
+            <w:tcBorders>
+              <w:top w:val="single" w:color="auto" w:sz="4" w:space="0"/>
+              <w:left w:val="single" w:color="auto" w:sz="4" w:space="0"/>
+              <w:bottom w:val="single" w:color="auto" w:sz="4" w:space="0"/>
+              <w:right w:val="single" w:color="auto" w:sz="4" w:space="0"/>
+            </w:tcBorders>
+            <w:shd w:val="clear" w:color="auto" w:fill="auto"/>
+            <w:tcMar>
+              <w:top w:w="100" w:type="dxa"/>
+              <w:left w:w="0" w:type="dxa"/>
+              <w:bottom w:w="100" w:type="dxa"/>
+              <w:right w:w="160" w:type="dxa"/>
+            </w:tcMar>
+            <w:vAlign w:val="center"/>
+          </w:tcPr>
+          <w:p>
+            <w:pPr>
+              <w:keepNext w:val="0"/>
+              <w:keepLines w:val="0"/>
+              <w:widowControl/>
+              <w:suppressLineNumbers w:val="0"/>
+              <w:spacing w:line="250" w:lineRule="atLeast"/>
+              <w:jc w:val="center"/>
+              <w:rPr>
+                <w:rFonts w:hint="default" w:ascii="Times New Roman" w:hAnsi="Times New Roman" w:eastAsia="宋体" w:cs="Times New Roman"/>
+                <w:b w:val="0"/>
+                <w:bCs w:val="0"/>
+                <w:i w:val="0"/>
+                <w:iCs w:val="0"/>
+                <w:caps w:val="0"/>
+                <w:color w:val="0F1115"/>
+                <w:spacing w:val="0"/>
+                <w:kern w:val="0"/>
+                <w:sz w:val="18"/>
+                <w:szCs w:val="18"/>
+                <w:lang w:val="en-US" w:eastAsia="zh-CN" w:bidi="ar"/>
+              </w:rPr>
+            </w:pPr>
+            <w:r>
+              <w:rPr>
+                <w:rFonts w:hint="default" w:ascii="Times New Roman" w:hAnsi="Times New Roman" w:eastAsia="宋体" w:cs="Times New Roman"/>
+                <w:i w:val="0"/>
+                <w:iCs w:val="0"/>
+                <w:caps w:val="0"/>
+                <w:color w:val="0F1115"/>
+                <w:spacing w:val="0"/>
+                <w:kern w:val="0"/>
+                <w:sz w:val="18"/>
+                <w:szCs w:val="18"/>
+                <w:lang w:val="en-US" w:eastAsia="zh-CN" w:bidi="ar"/>
+              </w:rPr>
+              <w:t>信息素</w:t>
+            </w:r>
+          </w:p>
+        </w:tc>
+        <w:tc>
+          <w:tcPr>
+            <w:tcW w:w="4209" w:type="pct"/>
+            <w:tcBorders>
+              <w:top w:val="single" w:color="auto" w:sz="4" w:space="0"/>
+              <w:left w:val="single" w:color="auto" w:sz="4" w:space="0"/>
+              <w:bottom w:val="single" w:color="auto" w:sz="4" w:space="0"/>
+              <w:right w:val="single" w:color="auto" w:sz="4" w:space="0"/>
+            </w:tcBorders>
+            <w:shd w:val="clear" w:color="auto" w:fill="auto"/>
+            <w:tcMar>
+              <w:top w:w="100" w:type="dxa"/>
+              <w:left w:w="160" w:type="dxa"/>
+              <w:bottom w:w="100" w:type="dxa"/>
+              <w:right w:w="0" w:type="dxa"/>
+            </w:tcMar>
+            <w:vAlign w:val="center"/>
+          </w:tcPr>
+          <w:p>
+            <w:pPr>
+              <w:keepNext w:val="0"/>
+              <w:keepLines w:val="0"/>
+              <w:widowControl/>
+              <w:suppressLineNumbers w:val="0"/>
+              <w:spacing w:line="250" w:lineRule="atLeast"/>
+              <w:jc w:val="center"/>
+              <w:rPr>
+                <w:rFonts w:hint="default" w:ascii="Times New Roman" w:hAnsi="Times New Roman" w:eastAsia="宋体" w:cs="Times New Roman"/>
+                <w:b w:val="0"/>
+                <w:bCs w:val="0"/>
+                <w:i w:val="0"/>
+                <w:iCs w:val="0"/>
+                <w:caps w:val="0"/>
+                <w:color w:val="0F1115"/>
+                <w:spacing w:val="0"/>
+                <w:kern w:val="0"/>
+                <w:sz w:val="18"/>
+                <w:szCs w:val="18"/>
+                <w:lang w:val="en-US" w:eastAsia="zh-CN" w:bidi="ar"/>
+              </w:rPr>
+            </w:pPr>
+            <w:r>
+              <w:rPr>
+                <w:rFonts w:hint="default" w:ascii="Times New Roman" w:hAnsi="Times New Roman" w:eastAsia="宋体" w:cs="Times New Roman"/>
+                <w:i w:val="0"/>
+                <w:iCs w:val="0"/>
+                <w:caps w:val="0"/>
+                <w:color w:val="0F1115"/>
+                <w:spacing w:val="0"/>
+                <w:kern w:val="0"/>
+                <w:sz w:val="18"/>
+                <w:szCs w:val="18"/>
+                <w:lang w:val="en-US" w:eastAsia="zh-CN" w:bidi="ar"/>
+              </w:rPr>
+              <w:t>敌人死亡时留下，引导后续敌人配置</w:t>
+            </w:r>
+          </w:p>
+        </w:tc>
+      </w:tr>
+      <w:tr>
+        <w:tblPrEx>
+          <w:tblBorders>
+            <w:top w:val="none" w:color="auto" w:sz="0" w:space="0"/>
+            <w:left w:val="none" w:color="auto" w:sz="0" w:space="0"/>
+            <w:bottom w:val="none" w:color="auto" w:sz="0" w:space="0"/>
+            <w:right w:val="none" w:color="auto" w:sz="0" w:space="0"/>
+            <w:insideH w:val="none" w:color="auto" w:sz="0" w:space="0"/>
+            <w:insideV w:val="none" w:color="auto" w:sz="0" w:space="0"/>
+          </w:tblBorders>
+          <w:tblCellMar>
+            <w:top w:w="15" w:type="dxa"/>
+            <w:left w:w="15" w:type="dxa"/>
+            <w:bottom w:w="15" w:type="dxa"/>
+            <w:right w:w="15" w:type="dxa"/>
+          </w:tblCellMar>
+        </w:tblPrEx>
+        <w:tc>
+          <w:tcPr>
+            <w:tcW w:w="790" w:type="pct"/>
+            <w:tcBorders>
+              <w:top w:val="single" w:color="auto" w:sz="4" w:space="0"/>
+              <w:left w:val="single" w:color="auto" w:sz="4" w:space="0"/>
+              <w:bottom w:val="single" w:color="auto" w:sz="4" w:space="0"/>
+              <w:right w:val="single" w:color="auto" w:sz="4" w:space="0"/>
+            </w:tcBorders>
+            <w:shd w:val="clear" w:color="auto" w:fill="auto"/>
+            <w:tcMar>
+              <w:top w:w="100" w:type="dxa"/>
+              <w:left w:w="0" w:type="dxa"/>
+              <w:bottom w:w="100" w:type="dxa"/>
+              <w:right w:w="160" w:type="dxa"/>
+            </w:tcMar>
+            <w:vAlign w:val="center"/>
+          </w:tcPr>
+          <w:p>
+            <w:pPr>
+              <w:keepNext w:val="0"/>
+              <w:keepLines w:val="0"/>
+              <w:widowControl/>
+              <w:suppressLineNumbers w:val="0"/>
+              <w:spacing w:line="250" w:lineRule="atLeast"/>
+              <w:jc w:val="center"/>
+              <w:rPr>
+                <w:rFonts w:hint="default" w:ascii="Times New Roman" w:hAnsi="Times New Roman" w:eastAsia="宋体" w:cs="Times New Roman"/>
+                <w:b w:val="0"/>
+                <w:bCs w:val="0"/>
+                <w:i w:val="0"/>
+                <w:iCs w:val="0"/>
+                <w:caps w:val="0"/>
+                <w:color w:val="0F1115"/>
+                <w:spacing w:val="0"/>
+                <w:kern w:val="0"/>
+                <w:sz w:val="18"/>
+                <w:szCs w:val="18"/>
+                <w:lang w:val="en-US" w:eastAsia="zh-CN" w:bidi="ar"/>
+              </w:rPr>
+            </w:pPr>
+            <w:r>
+              <w:rPr>
+                <w:rFonts w:hint="default" w:ascii="Times New Roman" w:hAnsi="Times New Roman" w:eastAsia="宋体" w:cs="Times New Roman"/>
+                <w:i w:val="0"/>
+                <w:iCs w:val="0"/>
+                <w:caps w:val="0"/>
+                <w:color w:val="0F1115"/>
+                <w:spacing w:val="0"/>
+                <w:kern w:val="0"/>
+                <w:sz w:val="18"/>
+                <w:szCs w:val="18"/>
+                <w:lang w:val="en-US" w:eastAsia="zh-CN" w:bidi="ar"/>
+              </w:rPr>
+              <w:t>残响</w:t>
+            </w:r>
+          </w:p>
+        </w:tc>
+        <w:tc>
+          <w:tcPr>
+            <w:tcW w:w="4209" w:type="pct"/>
+            <w:tcBorders>
+              <w:top w:val="single" w:color="auto" w:sz="4" w:space="0"/>
+              <w:left w:val="single" w:color="auto" w:sz="4" w:space="0"/>
+              <w:bottom w:val="single" w:color="auto" w:sz="4" w:space="0"/>
+              <w:right w:val="single" w:color="auto" w:sz="4" w:space="0"/>
+            </w:tcBorders>
+            <w:shd w:val="clear" w:color="auto" w:fill="auto"/>
+            <w:tcMar>
+              <w:top w:w="100" w:type="dxa"/>
+              <w:left w:w="160" w:type="dxa"/>
+              <w:bottom w:w="100" w:type="dxa"/>
+              <w:right w:w="0" w:type="dxa"/>
+            </w:tcMar>
+            <w:vAlign w:val="center"/>
+          </w:tcPr>
+          <w:p>
+            <w:pPr>
+              <w:keepNext w:val="0"/>
+              <w:keepLines w:val="0"/>
+              <w:widowControl/>
+              <w:suppressLineNumbers w:val="0"/>
+              <w:spacing w:line="250" w:lineRule="atLeast"/>
+              <w:jc w:val="center"/>
+              <w:rPr>
+                <w:rFonts w:hint="default" w:ascii="Times New Roman" w:hAnsi="Times New Roman" w:eastAsia="宋体" w:cs="Times New Roman"/>
+                <w:b w:val="0"/>
+                <w:bCs w:val="0"/>
+                <w:i w:val="0"/>
+                <w:iCs w:val="0"/>
+                <w:caps w:val="0"/>
+                <w:color w:val="0F1115"/>
+                <w:spacing w:val="0"/>
+                <w:kern w:val="0"/>
+                <w:sz w:val="18"/>
+                <w:szCs w:val="18"/>
+                <w:lang w:val="en-US" w:eastAsia="zh-CN" w:bidi="ar"/>
+              </w:rPr>
+            </w:pPr>
+            <w:r>
+              <w:rPr>
+                <w:rFonts w:hint="default" w:ascii="Times New Roman" w:hAnsi="Times New Roman" w:eastAsia="宋体" w:cs="Times New Roman"/>
+                <w:i w:val="0"/>
+                <w:iCs w:val="0"/>
+                <w:caps w:val="0"/>
+                <w:color w:val="0F1115"/>
+                <w:spacing w:val="0"/>
+                <w:kern w:val="0"/>
+                <w:sz w:val="18"/>
+                <w:szCs w:val="18"/>
+                <w:lang w:val="en-US" w:eastAsia="zh-CN" w:bidi="ar"/>
+              </w:rPr>
+              <w:t>舍弃刻印后录入图鉴，用于跨局解锁</w:t>
             </w:r>
           </w:p>
         </w:tc>
@@ -33737,274 +34411,6 @@
               <w:jc w:val="center"/>
               <w:rPr>
                 <w:rFonts w:hint="default" w:ascii="Times New Roman" w:hAnsi="Times New Roman" w:eastAsia="宋体" w:cs="Times New Roman"/>
-                <w:b w:val="0"/>
-                <w:bCs w:val="0"/>
-                <w:i w:val="0"/>
-                <w:iCs w:val="0"/>
-                <w:caps w:val="0"/>
-                <w:color w:val="0F1115"/>
-                <w:spacing w:val="0"/>
-                <w:kern w:val="0"/>
-                <w:sz w:val="18"/>
-                <w:szCs w:val="18"/>
-                <w:lang w:val="en-US" w:eastAsia="zh-CN" w:bidi="ar"/>
-              </w:rPr>
-            </w:pPr>
-            <w:r>
-              <w:rPr>
-                <w:rFonts w:hint="default" w:ascii="Times New Roman" w:hAnsi="Times New Roman" w:eastAsia="宋体" w:cs="Times New Roman"/>
-                <w:i w:val="0"/>
-                <w:iCs w:val="0"/>
-                <w:caps w:val="0"/>
-                <w:color w:val="0F1115"/>
-                <w:spacing w:val="0"/>
-                <w:kern w:val="0"/>
-                <w:sz w:val="18"/>
-                <w:szCs w:val="18"/>
-                <w:lang w:val="en-US" w:eastAsia="zh-CN" w:bidi="ar"/>
-              </w:rPr>
-              <w:t>信息素</w:t>
-            </w:r>
-          </w:p>
-        </w:tc>
-        <w:tc>
-          <w:tcPr>
-            <w:tcW w:w="4209" w:type="pct"/>
-            <w:tcBorders>
-              <w:top w:val="single" w:color="auto" w:sz="4" w:space="0"/>
-              <w:left w:val="single" w:color="auto" w:sz="4" w:space="0"/>
-              <w:bottom w:val="single" w:color="auto" w:sz="4" w:space="0"/>
-              <w:right w:val="single" w:color="auto" w:sz="4" w:space="0"/>
-            </w:tcBorders>
-            <w:shd w:val="clear" w:color="auto" w:fill="auto"/>
-            <w:tcMar>
-              <w:top w:w="100" w:type="dxa"/>
-              <w:left w:w="160" w:type="dxa"/>
-              <w:bottom w:w="100" w:type="dxa"/>
-              <w:right w:w="0" w:type="dxa"/>
-            </w:tcMar>
-            <w:vAlign w:val="center"/>
-          </w:tcPr>
-          <w:p>
-            <w:pPr>
-              <w:keepNext w:val="0"/>
-              <w:keepLines w:val="0"/>
-              <w:widowControl/>
-              <w:suppressLineNumbers w:val="0"/>
-              <w:spacing w:line="250" w:lineRule="atLeast"/>
-              <w:jc w:val="center"/>
-              <w:rPr>
-                <w:rFonts w:hint="default" w:ascii="Times New Roman" w:hAnsi="Times New Roman" w:eastAsia="宋体" w:cs="Times New Roman"/>
-                <w:b w:val="0"/>
-                <w:bCs w:val="0"/>
-                <w:i w:val="0"/>
-                <w:iCs w:val="0"/>
-                <w:caps w:val="0"/>
-                <w:color w:val="0F1115"/>
-                <w:spacing w:val="0"/>
-                <w:kern w:val="0"/>
-                <w:sz w:val="18"/>
-                <w:szCs w:val="18"/>
-                <w:lang w:val="en-US" w:eastAsia="zh-CN" w:bidi="ar"/>
-              </w:rPr>
-            </w:pPr>
-            <w:r>
-              <w:rPr>
-                <w:rFonts w:hint="default" w:ascii="Times New Roman" w:hAnsi="Times New Roman" w:eastAsia="宋体" w:cs="Times New Roman"/>
-                <w:i w:val="0"/>
-                <w:iCs w:val="0"/>
-                <w:caps w:val="0"/>
-                <w:color w:val="0F1115"/>
-                <w:spacing w:val="0"/>
-                <w:kern w:val="0"/>
-                <w:sz w:val="18"/>
-                <w:szCs w:val="18"/>
-                <w:lang w:val="en-US" w:eastAsia="zh-CN" w:bidi="ar"/>
-              </w:rPr>
-              <w:t>敌人死亡时留下，引导后续敌人配置</w:t>
-            </w:r>
-          </w:p>
-        </w:tc>
-      </w:tr>
-      <w:tr>
-        <w:tblPrEx>
-          <w:tblBorders>
-            <w:top w:val="none" w:color="auto" w:sz="0" w:space="0"/>
-            <w:left w:val="none" w:color="auto" w:sz="0" w:space="0"/>
-            <w:bottom w:val="none" w:color="auto" w:sz="0" w:space="0"/>
-            <w:right w:val="none" w:color="auto" w:sz="0" w:space="0"/>
-            <w:insideH w:val="none" w:color="auto" w:sz="0" w:space="0"/>
-            <w:insideV w:val="none" w:color="auto" w:sz="0" w:space="0"/>
-          </w:tblBorders>
-          <w:tblCellMar>
-            <w:top w:w="15" w:type="dxa"/>
-            <w:left w:w="15" w:type="dxa"/>
-            <w:bottom w:w="15" w:type="dxa"/>
-            <w:right w:w="15" w:type="dxa"/>
-          </w:tblCellMar>
-        </w:tblPrEx>
-        <w:tc>
-          <w:tcPr>
-            <w:tcW w:w="790" w:type="pct"/>
-            <w:tcBorders>
-              <w:top w:val="single" w:color="auto" w:sz="4" w:space="0"/>
-              <w:left w:val="single" w:color="auto" w:sz="4" w:space="0"/>
-              <w:bottom w:val="single" w:color="auto" w:sz="4" w:space="0"/>
-              <w:right w:val="single" w:color="auto" w:sz="4" w:space="0"/>
-            </w:tcBorders>
-            <w:shd w:val="clear" w:color="auto" w:fill="auto"/>
-            <w:tcMar>
-              <w:top w:w="100" w:type="dxa"/>
-              <w:left w:w="0" w:type="dxa"/>
-              <w:bottom w:w="100" w:type="dxa"/>
-              <w:right w:w="160" w:type="dxa"/>
-            </w:tcMar>
-            <w:vAlign w:val="center"/>
-          </w:tcPr>
-          <w:p>
-            <w:pPr>
-              <w:keepNext w:val="0"/>
-              <w:keepLines w:val="0"/>
-              <w:widowControl/>
-              <w:suppressLineNumbers w:val="0"/>
-              <w:spacing w:line="250" w:lineRule="atLeast"/>
-              <w:jc w:val="center"/>
-              <w:rPr>
-                <w:rFonts w:hint="default" w:ascii="Times New Roman" w:hAnsi="Times New Roman" w:eastAsia="宋体" w:cs="Times New Roman"/>
-                <w:b w:val="0"/>
-                <w:bCs w:val="0"/>
-                <w:i w:val="0"/>
-                <w:iCs w:val="0"/>
-                <w:caps w:val="0"/>
-                <w:color w:val="0F1115"/>
-                <w:spacing w:val="0"/>
-                <w:kern w:val="0"/>
-                <w:sz w:val="18"/>
-                <w:szCs w:val="18"/>
-                <w:lang w:val="en-US" w:eastAsia="zh-CN" w:bidi="ar"/>
-              </w:rPr>
-            </w:pPr>
-            <w:r>
-              <w:rPr>
-                <w:rFonts w:hint="default" w:ascii="Times New Roman" w:hAnsi="Times New Roman" w:eastAsia="宋体" w:cs="Times New Roman"/>
-                <w:i w:val="0"/>
-                <w:iCs w:val="0"/>
-                <w:caps w:val="0"/>
-                <w:color w:val="0F1115"/>
-                <w:spacing w:val="0"/>
-                <w:kern w:val="0"/>
-                <w:sz w:val="18"/>
-                <w:szCs w:val="18"/>
-                <w:lang w:val="en-US" w:eastAsia="zh-CN" w:bidi="ar"/>
-              </w:rPr>
-              <w:t>残响</w:t>
-            </w:r>
-          </w:p>
-        </w:tc>
-        <w:tc>
-          <w:tcPr>
-            <w:tcW w:w="4209" w:type="pct"/>
-            <w:tcBorders>
-              <w:top w:val="single" w:color="auto" w:sz="4" w:space="0"/>
-              <w:left w:val="single" w:color="auto" w:sz="4" w:space="0"/>
-              <w:bottom w:val="single" w:color="auto" w:sz="4" w:space="0"/>
-              <w:right w:val="single" w:color="auto" w:sz="4" w:space="0"/>
-            </w:tcBorders>
-            <w:shd w:val="clear" w:color="auto" w:fill="auto"/>
-            <w:tcMar>
-              <w:top w:w="100" w:type="dxa"/>
-              <w:left w:w="160" w:type="dxa"/>
-              <w:bottom w:w="100" w:type="dxa"/>
-              <w:right w:w="0" w:type="dxa"/>
-            </w:tcMar>
-            <w:vAlign w:val="center"/>
-          </w:tcPr>
-          <w:p>
-            <w:pPr>
-              <w:keepNext w:val="0"/>
-              <w:keepLines w:val="0"/>
-              <w:widowControl/>
-              <w:suppressLineNumbers w:val="0"/>
-              <w:spacing w:line="250" w:lineRule="atLeast"/>
-              <w:jc w:val="center"/>
-              <w:rPr>
-                <w:rFonts w:hint="default" w:ascii="Times New Roman" w:hAnsi="Times New Roman" w:eastAsia="宋体" w:cs="Times New Roman"/>
-                <w:b w:val="0"/>
-                <w:bCs w:val="0"/>
-                <w:i w:val="0"/>
-                <w:iCs w:val="0"/>
-                <w:caps w:val="0"/>
-                <w:color w:val="0F1115"/>
-                <w:spacing w:val="0"/>
-                <w:kern w:val="0"/>
-                <w:sz w:val="18"/>
-                <w:szCs w:val="18"/>
-                <w:lang w:val="en-US" w:eastAsia="zh-CN" w:bidi="ar"/>
-              </w:rPr>
-            </w:pPr>
-            <w:r>
-              <w:rPr>
-                <w:rFonts w:hint="default" w:ascii="Times New Roman" w:hAnsi="Times New Roman" w:eastAsia="宋体" w:cs="Times New Roman"/>
-                <w:i w:val="0"/>
-                <w:iCs w:val="0"/>
-                <w:caps w:val="0"/>
-                <w:color w:val="0F1115"/>
-                <w:spacing w:val="0"/>
-                <w:kern w:val="0"/>
-                <w:sz w:val="18"/>
-                <w:szCs w:val="18"/>
-                <w:lang w:val="en-US" w:eastAsia="zh-CN" w:bidi="ar"/>
-              </w:rPr>
-              <w:t>舍弃刻印后录入图鉴，用于跨局解锁</w:t>
-            </w:r>
-          </w:p>
-        </w:tc>
-      </w:tr>
-      <w:tr>
-        <w:tblPrEx>
-          <w:tblBorders>
-            <w:top w:val="none" w:color="auto" w:sz="0" w:space="0"/>
-            <w:left w:val="none" w:color="auto" w:sz="0" w:space="0"/>
-            <w:bottom w:val="none" w:color="auto" w:sz="0" w:space="0"/>
-            <w:right w:val="none" w:color="auto" w:sz="0" w:space="0"/>
-            <w:insideH w:val="none" w:color="auto" w:sz="0" w:space="0"/>
-            <w:insideV w:val="none" w:color="auto" w:sz="0" w:space="0"/>
-          </w:tblBorders>
-          <w:tblCellMar>
-            <w:top w:w="15" w:type="dxa"/>
-            <w:left w:w="15" w:type="dxa"/>
-            <w:bottom w:w="15" w:type="dxa"/>
-            <w:right w:w="15" w:type="dxa"/>
-          </w:tblCellMar>
-        </w:tblPrEx>
-        <w:tc>
-          <w:tcPr>
-            <w:tcW w:w="790" w:type="pct"/>
-            <w:tcBorders>
-              <w:top w:val="single" w:color="auto" w:sz="4" w:space="0"/>
-              <w:left w:val="single" w:color="auto" w:sz="4" w:space="0"/>
-              <w:bottom w:val="single" w:color="auto" w:sz="4" w:space="0"/>
-              <w:right w:val="single" w:color="auto" w:sz="4" w:space="0"/>
-            </w:tcBorders>
-            <w:shd w:val="clear" w:color="auto" w:fill="auto"/>
-            <w:tcMar>
-              <w:top w:w="100" w:type="dxa"/>
-              <w:left w:w="0" w:type="dxa"/>
-              <w:bottom w:w="100" w:type="dxa"/>
-              <w:right w:w="160" w:type="dxa"/>
-            </w:tcMar>
-            <w:vAlign w:val="center"/>
-          </w:tcPr>
-          <w:p>
-            <w:pPr>
-              <w:keepNext w:val="0"/>
-              <w:keepLines w:val="0"/>
-              <w:widowControl/>
-              <w:suppressLineNumbers w:val="0"/>
-              <w:spacing w:line="250" w:lineRule="atLeast"/>
-              <w:jc w:val="center"/>
-              <w:rPr>
-                <w:rFonts w:hint="default" w:ascii="Times New Roman" w:hAnsi="Times New Roman" w:eastAsia="宋体" w:cs="Times New Roman"/>
                 <w:i w:val="0"/>
                 <w:iCs w:val="0"/>
                 <w:caps w:val="0"/>
@@ -34153,7 +34559,7 @@
           <w:szCs w:val="28"/>
         </w:rPr>
       </w:pPr>
-      <w:bookmarkStart w:id="44" w:name="_Toc16796"/>
+      <w:bookmarkStart w:id="44" w:name="_Toc27763"/>
       <w:r>
         <w:rPr>
           <w:rFonts w:hint="default" w:ascii="Times New Roman" w:hAnsi="Times New Roman" w:eastAsia="宋体" w:cs="Times New Roman"/>
@@ -34248,7 +34654,7 @@
           <w:lang w:val="en-US"/>
         </w:rPr>
       </w:pPr>
-      <w:bookmarkStart w:id="45" w:name="_Toc16670"/>
+      <w:bookmarkStart w:id="45" w:name="_Toc10432"/>
       <w:r>
         <w:rPr>
           <w:rFonts w:hint="eastAsia" w:ascii="Times New Roman" w:hAnsi="Times New Roman" w:cs="Times New Roman"/>
@@ -34468,7 +34874,7 @@
           <w:lang w:val="en-US" w:eastAsia="zh-CN"/>
         </w:rPr>
       </w:pPr>
-      <w:bookmarkStart w:id="46" w:name="_Toc15819"/>
+      <w:bookmarkStart w:id="46" w:name="_Toc22266"/>
       <w:r>
         <w:rPr>
           <w:rFonts w:hint="eastAsia" w:ascii="Times New Roman" w:hAnsi="Times New Roman" w:cs="Times New Roman"/>
@@ -34676,7 +35082,7 @@
           <w:lang w:val="en-US" w:eastAsia="zh-CN"/>
         </w:rPr>
       </w:pPr>
-      <w:bookmarkStart w:id="47" w:name="_Toc12439"/>
+      <w:bookmarkStart w:id="47" w:name="_Toc6940"/>
       <w:r>
         <w:rPr>
           <w:rFonts w:hint="eastAsia" w:ascii="Times New Roman" w:hAnsi="Times New Roman" w:cs="Times New Roman"/>
@@ -34882,7 +35288,7 @@
           <w:lang w:val="en-US"/>
         </w:rPr>
       </w:pPr>
-      <w:bookmarkStart w:id="48" w:name="_Toc20070"/>
+      <w:bookmarkStart w:id="48" w:name="_Toc14777"/>
       <w:r>
         <w:rPr>
           <w:rFonts w:hint="default" w:ascii="Times New Roman" w:hAnsi="Times New Roman" w:eastAsia="宋体" w:cs="Times New Roman"/>
@@ -35011,7 +35417,7 @@
           <w:lang w:val="en-US"/>
         </w:rPr>
       </w:pPr>
-      <w:bookmarkStart w:id="49" w:name="_Toc16466"/>
+      <w:bookmarkStart w:id="49" w:name="_Toc22152"/>
       <w:r>
         <w:rPr>
           <w:rFonts w:hint="default" w:ascii="Times New Roman" w:hAnsi="Times New Roman" w:eastAsia="宋体" w:cs="Times New Roman"/>
@@ -35102,6 +35508,95 @@
           <w:szCs w:val="24"/>
         </w:rPr>
       </w:pPr>
+    </w:p>
+    <w:p>
+      <w:pPr>
+        <w:keepNext w:val="0"/>
+        <w:keepLines w:val="0"/>
+        <w:pageBreakBefore w:val="0"/>
+        <w:widowControl/>
+        <w:suppressLineNumbers w:val="0"/>
+        <w:shd w:val="clear" w:fill="FFFFFF"/>
+        <w:kinsoku/>
+        <w:wordWrap w:val="0"/>
+        <w:overflowPunct/>
+        <w:topLinePunct w:val="0"/>
+        <w:autoSpaceDE/>
+        <w:autoSpaceDN/>
+        <w:bidi w:val="0"/>
+        <w:adjustRightInd/>
+        <w:snapToGrid/>
+        <w:spacing w:before="0" w:beforeAutospacing="0" w:after="0" w:afterAutospacing="0" w:line="240" w:lineRule="auto"/>
+        <w:ind w:right="0"/>
+        <w:textAlignment w:val="auto"/>
+        <w:outlineLvl w:val="2"/>
+        <w:rPr>
+          <w:rFonts w:hint="default" w:ascii="Times New Roman" w:hAnsi="Times New Roman" w:eastAsia="宋体" w:cs="Times New Roman"/>
+          <w:b/>
+          <w:bCs/>
+          <w:caps w:val="0"/>
+          <w:color w:val="0F1115"/>
+          <w:spacing w:val="0"/>
+          <w:sz w:val="24"/>
+          <w:szCs w:val="24"/>
+          <w:lang w:val="en-US"/>
+        </w:rPr>
+      </w:pPr>
+      <w:bookmarkStart w:id="50" w:name="_Toc10515"/>
+      <w:r>
+        <w:rPr>
+          <w:rFonts w:hint="default" w:ascii="Times New Roman" w:hAnsi="Times New Roman" w:eastAsia="宋体" w:cs="Times New Roman"/>
+          <w:b/>
+          <w:bCs/>
+          <w:caps w:val="0"/>
+          <w:color w:val="0F1115"/>
+          <w:spacing w:val="0"/>
+          <w:sz w:val="24"/>
+          <w:szCs w:val="24"/>
+          <w:lang w:val="en-US"/>
+        </w:rPr>
+        <w:t>8.2.6.变位影响本位的三层优先级设计</w:t>
+      </w:r>
+      <w:bookmarkEnd w:id="50"/>
+    </w:p>
+    <w:p>
+      <w:pPr>
+        <w:keepNext w:val="0"/>
+        <w:keepLines w:val="0"/>
+        <w:pageBreakBefore w:val="0"/>
+        <w:widowControl w:val="0"/>
+        <w:numPr>
+          <w:ilvl w:val="0"/>
+          <w:numId w:val="0"/>
+        </w:numPr>
+        <w:kinsoku/>
+        <w:wordWrap w:val="0"/>
+        <w:overflowPunct/>
+        <w:topLinePunct w:val="0"/>
+        <w:autoSpaceDE/>
+        <w:autoSpaceDN/>
+        <w:bidi w:val="0"/>
+        <w:adjustRightInd/>
+        <w:snapToGrid/>
+        <w:spacing w:line="240" w:lineRule="auto"/>
+        <w:ind w:leftChars="0" w:firstLine="420" w:firstLineChars="0"/>
+        <w:textAlignment w:val="auto"/>
+        <w:rPr>
+          <w:rFonts w:hint="eastAsia" w:ascii="Times New Roman" w:hAnsi="Times New Roman" w:eastAsia="宋体" w:cs="Times New Roman"/>
+          <w:sz w:val="24"/>
+          <w:szCs w:val="24"/>
+          <w:lang w:val="en-US" w:eastAsia="zh-CN"/>
+        </w:rPr>
+      </w:pPr>
+      <w:r>
+        <w:rPr>
+          <w:rFonts w:hint="eastAsia" w:ascii="Times New Roman" w:hAnsi="Times New Roman" w:eastAsia="宋体" w:cs="Times New Roman"/>
+          <w:sz w:val="24"/>
+          <w:szCs w:val="24"/>
+          <w:lang w:val="en-US" w:eastAsia="zh-CN"/>
+        </w:rPr>
+        <w:t>变位对本位的影响遵循三层优先级设计。第一优先为数据修改，变位通过修改 FBaseEventContext 中的数值字段（如伤害倍率、投射物数量、速度倍率、投射物类覆盖等）影响本位的执行结果，覆盖约 80% 的变位需求，本位只读取 Context 数据，完全不知道变位的存在。第二优先为事件挂载增量逻辑，变位通过监听本位广播的事件（OnCast、OnHit、OnFinish 等），在 OnEventReceived 中执行额外逻辑（如命中后挂 DOT、触发爆炸、播放特效等），覆盖约 15% 的变位需求。第三优先为管理层覆盖，在极少数需要完全改变本位行为的情况下（约 5%），由 UGlyphInventoryComponent 在 ExecuteSlot 中判断是否由变位接管执行。设计原则是：本位不持有变位引用且不预留逻辑分支；变位通过修改数据或响应事件来影响本位，不直接调用本位内部函数；管理层负责路由决策但不参与业务逻辑；第三优先当前阶段暂不实现，待后续有真实需求时再根据实际案例引入合适的结构（阶段划分或链式结构）。</w:t>
+      </w:r>
     </w:p>
     <w:sectPr>
       <w:footerReference r:id="rId3" w:type="default"/>

</xml_diff>

<commit_message>
fix: TaskActivation and ChargeMontage
</commit_message>
<xml_diff>
--- a/GDD.docx
+++ b/GDD.docx
@@ -1,6 +1,6 @@
 
 <file path=word/document.xml><?xml version="1.0" encoding="utf-8"?>
-<w:document xmlns:wpc="http://schemas.microsoft.com/office/word/2010/wordprocessingCanvas" xmlns:mc="http://schemas.openxmlformats.org/markup-compatibility/2006" xmlns:o="urn:schemas-microsoft-com:office:office" xmlns:r="http://schemas.openxmlformats.org/officeDocument/2006/relationships" xmlns:m="http://schemas.openxmlformats.org/officeDocument/2006/math" xmlns:v="urn:schemas-microsoft-com:vml" xmlns:wp14="http://schemas.microsoft.com/office/word/2010/wordprocessingDrawing" xmlns:wp="http://schemas.openxmlformats.org/drawingml/2006/wordprocessingDrawing" xmlns:w="http://schemas.openxmlformats.org/wordprocessingml/2006/main" xmlns:w14="http://schemas.microsoft.com/office/word/2010/wordml" xmlns:w10="urn:schemas-microsoft-com:office:word" xmlns:w15="http://schemas.microsoft.com/office/word/2012/wordml" xmlns:wpg="http://schemas.microsoft.com/office/word/2010/wordprocessingGroup" xmlns:wpi="http://schemas.microsoft.com/office/word/2010/wordprocessingInk" xmlns:wne="http://schemas.microsoft.com/office/word/2006/wordml" xmlns:wps="http://schemas.microsoft.com/office/word/2010/wordprocessingShape" xmlns:wpsCustomData="http://www.wps.cn/officeDocument/2013/wpsCustomData" mc:Ignorable="w14 w15 wp14">
+<w:document xmlns:wpc="http://schemas.microsoft.com/office/word/2010/wordprocessingCanvas" xmlns:cx="http://schemas.microsoft.com/office/drawing/2014/chartex" xmlns:cx1="http://schemas.microsoft.com/office/drawing/2015/9/8/chartex" xmlns:cx2="http://schemas.microsoft.com/office/drawing/2015/10/21/chartex" xmlns:cx3="http://schemas.microsoft.com/office/drawing/2016/5/9/chartex" xmlns:cx4="http://schemas.microsoft.com/office/drawing/2016/5/10/chartex" xmlns:cx5="http://schemas.microsoft.com/office/drawing/2016/5/11/chartex" xmlns:cx6="http://schemas.microsoft.com/office/drawing/2016/5/12/chartex" xmlns:cx7="http://schemas.microsoft.com/office/drawing/2016/5/13/chartex" xmlns:cx8="http://schemas.microsoft.com/office/drawing/2016/5/14/chartex" xmlns:mc="http://schemas.openxmlformats.org/markup-compatibility/2006" xmlns:o="urn:schemas-microsoft-com:office:office" xmlns:r="http://schemas.openxmlformats.org/officeDocument/2006/relationships" xmlns:m="http://schemas.openxmlformats.org/officeDocument/2006/math" xmlns:v="urn:schemas-microsoft-com:vml" xmlns:wp14="http://schemas.microsoft.com/office/word/2010/wordprocessingDrawing" xmlns:wp="http://schemas.openxmlformats.org/drawingml/2006/wordprocessingDrawing" xmlns:w="http://schemas.openxmlformats.org/wordprocessingml/2006/main" xmlns:w14="http://schemas.microsoft.com/office/word/2010/wordml" xmlns:w10="urn:schemas-microsoft-com:office:word" xmlns:w15="http://schemas.microsoft.com/office/word/2012/wordml" xmlns:wpg="http://schemas.microsoft.com/office/word/2010/wordprocessingGroup" xmlns:wpi="http://schemas.microsoft.com/office/word/2010/wordprocessingInk" xmlns:wne="http://schemas.microsoft.com/office/word/2006/wordml" xmlns:wps="http://schemas.microsoft.com/office/word/2010/wordprocessingShape" xmlns:wpsCustomData="http://www.wps.cn/officeDocument/2013/wpsCustomData" mc:Ignorable="w14 w15 wp14">
   <w:body>
     <w:p>
       <w:pPr>
@@ -1126,8 +1126,8 @@
             <w:jc w:val="center"/>
             <w:textAlignment w:val="auto"/>
           </w:pPr>
-          <w:bookmarkStart w:id="53" w:name="_GoBack"/>
-          <w:bookmarkEnd w:id="53"/>
+          <w:bookmarkStart w:id="56" w:name="_GoBack"/>
+          <w:bookmarkEnd w:id="56"/>
           <w:r>
             <w:rPr>
               <w:rFonts w:ascii="宋体" w:hAnsi="宋体" w:eastAsia="宋体"/>
@@ -1156,7 +1156,7 @@
             <w:fldChar w:fldCharType="begin"/>
           </w:r>
           <w:r>
-            <w:instrText xml:space="preserve"> HYPERLINK \l _Toc10381 </w:instrText>
+            <w:instrText xml:space="preserve"> HYPERLINK \l _Toc22989 </w:instrText>
           </w:r>
           <w:r>
             <w:fldChar w:fldCharType="separate"/>
@@ -1176,7 +1176,7 @@
             <w:fldChar w:fldCharType="begin"/>
           </w:r>
           <w:r>
-            <w:instrText xml:space="preserve"> PAGEREF _Toc10381 \h </w:instrText>
+            <w:instrText xml:space="preserve"> PAGEREF _Toc22989 \h </w:instrText>
           </w:r>
           <w:r>
             <w:fldChar w:fldCharType="separate"/>
@@ -1202,7 +1202,7 @@
             <w:fldChar w:fldCharType="begin"/>
           </w:r>
           <w:r>
-            <w:instrText xml:space="preserve"> HYPERLINK \l _Toc2339 </w:instrText>
+            <w:instrText xml:space="preserve"> HYPERLINK \l _Toc29118 </w:instrText>
           </w:r>
           <w:r>
             <w:fldChar w:fldCharType="separate"/>
@@ -1239,7 +1239,7 @@
             <w:fldChar w:fldCharType="begin"/>
           </w:r>
           <w:r>
-            <w:instrText xml:space="preserve"> PAGEREF _Toc2339 \h </w:instrText>
+            <w:instrText xml:space="preserve"> PAGEREF _Toc29118 \h </w:instrText>
           </w:r>
           <w:r>
             <w:fldChar w:fldCharType="separate"/>
@@ -1265,7 +1265,7 @@
             <w:fldChar w:fldCharType="begin"/>
           </w:r>
           <w:r>
-            <w:instrText xml:space="preserve"> HYPERLINK \l _Toc24978 </w:instrText>
+            <w:instrText xml:space="preserve"> HYPERLINK \l _Toc28226 </w:instrText>
           </w:r>
           <w:r>
             <w:fldChar w:fldCharType="separate"/>
@@ -1302,7 +1302,7 @@
             <w:fldChar w:fldCharType="begin"/>
           </w:r>
           <w:r>
-            <w:instrText xml:space="preserve"> PAGEREF _Toc24978 \h </w:instrText>
+            <w:instrText xml:space="preserve"> PAGEREF _Toc28226 \h </w:instrText>
           </w:r>
           <w:r>
             <w:fldChar w:fldCharType="separate"/>
@@ -1328,7 +1328,7 @@
             <w:fldChar w:fldCharType="begin"/>
           </w:r>
           <w:r>
-            <w:instrText xml:space="preserve"> HYPERLINK \l _Toc31398 </w:instrText>
+            <w:instrText xml:space="preserve"> HYPERLINK \l _Toc3675 </w:instrText>
           </w:r>
           <w:r>
             <w:fldChar w:fldCharType="separate"/>
@@ -1365,7 +1365,7 @@
             <w:fldChar w:fldCharType="begin"/>
           </w:r>
           <w:r>
-            <w:instrText xml:space="preserve"> PAGEREF _Toc31398 \h </w:instrText>
+            <w:instrText xml:space="preserve"> PAGEREF _Toc3675 \h </w:instrText>
           </w:r>
           <w:r>
             <w:fldChar w:fldCharType="separate"/>
@@ -1391,7 +1391,7 @@
             <w:fldChar w:fldCharType="begin"/>
           </w:r>
           <w:r>
-            <w:instrText xml:space="preserve"> HYPERLINK \l _Toc21877 </w:instrText>
+            <w:instrText xml:space="preserve"> HYPERLINK \l _Toc1298 </w:instrText>
           </w:r>
           <w:r>
             <w:fldChar w:fldCharType="separate"/>
@@ -1420,7 +1420,7 @@
             <w:fldChar w:fldCharType="begin"/>
           </w:r>
           <w:r>
-            <w:instrText xml:space="preserve"> PAGEREF _Toc21877 \h </w:instrText>
+            <w:instrText xml:space="preserve"> PAGEREF _Toc1298 \h </w:instrText>
           </w:r>
           <w:r>
             <w:fldChar w:fldCharType="separate"/>
@@ -1446,7 +1446,7 @@
             <w:fldChar w:fldCharType="begin"/>
           </w:r>
           <w:r>
-            <w:instrText xml:space="preserve"> HYPERLINK \l _Toc27477 </w:instrText>
+            <w:instrText xml:space="preserve"> HYPERLINK \l _Toc5147 </w:instrText>
           </w:r>
           <w:r>
             <w:fldChar w:fldCharType="separate"/>
@@ -1475,7 +1475,7 @@
             <w:fldChar w:fldCharType="begin"/>
           </w:r>
           <w:r>
-            <w:instrText xml:space="preserve"> PAGEREF _Toc27477 \h </w:instrText>
+            <w:instrText xml:space="preserve"> PAGEREF _Toc5147 \h </w:instrText>
           </w:r>
           <w:r>
             <w:fldChar w:fldCharType="separate"/>
@@ -1501,7 +1501,7 @@
             <w:fldChar w:fldCharType="begin"/>
           </w:r>
           <w:r>
-            <w:instrText xml:space="preserve"> HYPERLINK \l _Toc11645 </w:instrText>
+            <w:instrText xml:space="preserve"> HYPERLINK \l _Toc25827 </w:instrText>
           </w:r>
           <w:r>
             <w:fldChar w:fldCharType="separate"/>
@@ -1522,7 +1522,7 @@
             <w:fldChar w:fldCharType="begin"/>
           </w:r>
           <w:r>
-            <w:instrText xml:space="preserve"> PAGEREF _Toc11645 \h </w:instrText>
+            <w:instrText xml:space="preserve"> PAGEREF _Toc25827 \h </w:instrText>
           </w:r>
           <w:r>
             <w:fldChar w:fldCharType="separate"/>
@@ -1548,7 +1548,7 @@
             <w:fldChar w:fldCharType="begin"/>
           </w:r>
           <w:r>
-            <w:instrText xml:space="preserve"> HYPERLINK \l _Toc14242 </w:instrText>
+            <w:instrText xml:space="preserve"> HYPERLINK \l _Toc12947 </w:instrText>
           </w:r>
           <w:r>
             <w:fldChar w:fldCharType="separate"/>
@@ -1594,7 +1594,7 @@
             <w:fldChar w:fldCharType="begin"/>
           </w:r>
           <w:r>
-            <w:instrText xml:space="preserve"> PAGEREF _Toc14242 \h </w:instrText>
+            <w:instrText xml:space="preserve"> PAGEREF _Toc12947 \h </w:instrText>
           </w:r>
           <w:r>
             <w:fldChar w:fldCharType="separate"/>
@@ -1620,7 +1620,7 @@
             <w:fldChar w:fldCharType="begin"/>
           </w:r>
           <w:r>
-            <w:instrText xml:space="preserve"> HYPERLINK \l _Toc21387 </w:instrText>
+            <w:instrText xml:space="preserve"> HYPERLINK \l _Toc7259 </w:instrText>
           </w:r>
           <w:r>
             <w:fldChar w:fldCharType="separate"/>
@@ -1666,7 +1666,7 @@
             <w:fldChar w:fldCharType="begin"/>
           </w:r>
           <w:r>
-            <w:instrText xml:space="preserve"> PAGEREF _Toc21387 \h </w:instrText>
+            <w:instrText xml:space="preserve"> PAGEREF _Toc7259 \h </w:instrText>
           </w:r>
           <w:r>
             <w:fldChar w:fldCharType="separate"/>
@@ -1692,7 +1692,7 @@
             <w:fldChar w:fldCharType="begin"/>
           </w:r>
           <w:r>
-            <w:instrText xml:space="preserve"> HYPERLINK \l _Toc3128 </w:instrText>
+            <w:instrText xml:space="preserve"> HYPERLINK \l _Toc28074 </w:instrText>
           </w:r>
           <w:r>
             <w:fldChar w:fldCharType="separate"/>
@@ -1738,7 +1738,7 @@
             <w:fldChar w:fldCharType="begin"/>
           </w:r>
           <w:r>
-            <w:instrText xml:space="preserve"> PAGEREF _Toc3128 \h </w:instrText>
+            <w:instrText xml:space="preserve"> PAGEREF _Toc28074 \h </w:instrText>
           </w:r>
           <w:r>
             <w:fldChar w:fldCharType="separate"/>
@@ -1764,7 +1764,7 @@
             <w:fldChar w:fldCharType="begin"/>
           </w:r>
           <w:r>
-            <w:instrText xml:space="preserve"> HYPERLINK \l _Toc19113 </w:instrText>
+            <w:instrText xml:space="preserve"> HYPERLINK \l _Toc30775 </w:instrText>
           </w:r>
           <w:r>
             <w:fldChar w:fldCharType="separate"/>
@@ -1810,7 +1810,7 @@
             <w:fldChar w:fldCharType="begin"/>
           </w:r>
           <w:r>
-            <w:instrText xml:space="preserve"> PAGEREF _Toc19113 \h </w:instrText>
+            <w:instrText xml:space="preserve"> PAGEREF _Toc30775 \h </w:instrText>
           </w:r>
           <w:r>
             <w:fldChar w:fldCharType="separate"/>
@@ -1836,7 +1836,7 @@
             <w:fldChar w:fldCharType="begin"/>
           </w:r>
           <w:r>
-            <w:instrText xml:space="preserve"> HYPERLINK \l _Toc27868 </w:instrText>
+            <w:instrText xml:space="preserve"> HYPERLINK \l _Toc7639 </w:instrText>
           </w:r>
           <w:r>
             <w:fldChar w:fldCharType="separate"/>
@@ -1882,7 +1882,7 @@
             <w:fldChar w:fldCharType="begin"/>
           </w:r>
           <w:r>
-            <w:instrText xml:space="preserve"> PAGEREF _Toc27868 \h </w:instrText>
+            <w:instrText xml:space="preserve"> PAGEREF _Toc7639 \h </w:instrText>
           </w:r>
           <w:r>
             <w:fldChar w:fldCharType="separate"/>
@@ -1908,7 +1908,7 @@
             <w:fldChar w:fldCharType="begin"/>
           </w:r>
           <w:r>
-            <w:instrText xml:space="preserve"> HYPERLINK \l _Toc26851 </w:instrText>
+            <w:instrText xml:space="preserve"> HYPERLINK \l _Toc23314 </w:instrText>
           </w:r>
           <w:r>
             <w:fldChar w:fldCharType="separate"/>
@@ -1932,7 +1932,7 @@
             <w:fldChar w:fldCharType="begin"/>
           </w:r>
           <w:r>
-            <w:instrText xml:space="preserve"> PAGEREF _Toc26851 \h </w:instrText>
+            <w:instrText xml:space="preserve"> PAGEREF _Toc23314 \h </w:instrText>
           </w:r>
           <w:r>
             <w:fldChar w:fldCharType="separate"/>
@@ -1958,7 +1958,7 @@
             <w:fldChar w:fldCharType="begin"/>
           </w:r>
           <w:r>
-            <w:instrText xml:space="preserve"> HYPERLINK \l _Toc7002 </w:instrText>
+            <w:instrText xml:space="preserve"> HYPERLINK \l _Toc24382 </w:instrText>
           </w:r>
           <w:r>
             <w:fldChar w:fldCharType="separate"/>
@@ -1982,7 +1982,7 @@
             <w:fldChar w:fldCharType="begin"/>
           </w:r>
           <w:r>
-            <w:instrText xml:space="preserve"> PAGEREF _Toc7002 \h </w:instrText>
+            <w:instrText xml:space="preserve"> PAGEREF _Toc24382 \h </w:instrText>
           </w:r>
           <w:r>
             <w:fldChar w:fldCharType="separate"/>
@@ -2008,7 +2008,7 @@
             <w:fldChar w:fldCharType="begin"/>
           </w:r>
           <w:r>
-            <w:instrText xml:space="preserve"> HYPERLINK \l _Toc25853 </w:instrText>
+            <w:instrText xml:space="preserve"> HYPERLINK \l _Toc3219 </w:instrText>
           </w:r>
           <w:r>
             <w:fldChar w:fldCharType="separate"/>
@@ -2032,7 +2032,7 @@
             <w:fldChar w:fldCharType="begin"/>
           </w:r>
           <w:r>
-            <w:instrText xml:space="preserve"> PAGEREF _Toc25853 \h </w:instrText>
+            <w:instrText xml:space="preserve"> PAGEREF _Toc3219 \h </w:instrText>
           </w:r>
           <w:r>
             <w:fldChar w:fldCharType="separate"/>
@@ -2058,7 +2058,7 @@
             <w:fldChar w:fldCharType="begin"/>
           </w:r>
           <w:r>
-            <w:instrText xml:space="preserve"> HYPERLINK \l _Toc9964 </w:instrText>
+            <w:instrText xml:space="preserve"> HYPERLINK \l _Toc20150 </w:instrText>
           </w:r>
           <w:r>
             <w:fldChar w:fldCharType="separate"/>
@@ -2082,7 +2082,7 @@
             <w:fldChar w:fldCharType="begin"/>
           </w:r>
           <w:r>
-            <w:instrText xml:space="preserve"> PAGEREF _Toc9964 \h </w:instrText>
+            <w:instrText xml:space="preserve"> PAGEREF _Toc20150 \h </w:instrText>
           </w:r>
           <w:r>
             <w:fldChar w:fldCharType="separate"/>
@@ -2108,7 +2108,7 @@
             <w:fldChar w:fldCharType="begin"/>
           </w:r>
           <w:r>
-            <w:instrText xml:space="preserve"> HYPERLINK \l _Toc32454 </w:instrText>
+            <w:instrText xml:space="preserve"> HYPERLINK \l _Toc728 </w:instrText>
           </w:r>
           <w:r>
             <w:fldChar w:fldCharType="separate"/>
@@ -2154,7 +2154,7 @@
             <w:fldChar w:fldCharType="begin"/>
           </w:r>
           <w:r>
-            <w:instrText xml:space="preserve"> PAGEREF _Toc32454 \h </w:instrText>
+            <w:instrText xml:space="preserve"> PAGEREF _Toc728 \h </w:instrText>
           </w:r>
           <w:r>
             <w:fldChar w:fldCharType="separate"/>
@@ -2180,7 +2180,7 @@
             <w:fldChar w:fldCharType="begin"/>
           </w:r>
           <w:r>
-            <w:instrText xml:space="preserve"> HYPERLINK \l _Toc28599 </w:instrText>
+            <w:instrText xml:space="preserve"> HYPERLINK \l _Toc11264 </w:instrText>
           </w:r>
           <w:r>
             <w:fldChar w:fldCharType="separate"/>
@@ -2203,7 +2203,7 @@
             <w:fldChar w:fldCharType="begin"/>
           </w:r>
           <w:r>
-            <w:instrText xml:space="preserve"> PAGEREF _Toc28599 \h </w:instrText>
+            <w:instrText xml:space="preserve"> PAGEREF _Toc11264 \h </w:instrText>
           </w:r>
           <w:r>
             <w:fldChar w:fldCharType="separate"/>
@@ -2229,7 +2229,7 @@
             <w:fldChar w:fldCharType="begin"/>
           </w:r>
           <w:r>
-            <w:instrText xml:space="preserve"> HYPERLINK \l _Toc32533 </w:instrText>
+            <w:instrText xml:space="preserve"> HYPERLINK \l _Toc81 </w:instrText>
           </w:r>
           <w:r>
             <w:fldChar w:fldCharType="separate"/>
@@ -2275,7 +2275,7 @@
             <w:fldChar w:fldCharType="begin"/>
           </w:r>
           <w:r>
-            <w:instrText xml:space="preserve"> PAGEREF _Toc32533 \h </w:instrText>
+            <w:instrText xml:space="preserve"> PAGEREF _Toc81 \h </w:instrText>
           </w:r>
           <w:r>
             <w:fldChar w:fldCharType="separate"/>
@@ -2301,7 +2301,7 @@
             <w:fldChar w:fldCharType="begin"/>
           </w:r>
           <w:r>
-            <w:instrText xml:space="preserve"> HYPERLINK \l _Toc1876 </w:instrText>
+            <w:instrText xml:space="preserve"> HYPERLINK \l _Toc29366 </w:instrText>
           </w:r>
           <w:r>
             <w:fldChar w:fldCharType="separate"/>
@@ -2359,7 +2359,7 @@
             <w:fldChar w:fldCharType="begin"/>
           </w:r>
           <w:r>
-            <w:instrText xml:space="preserve"> PAGEREF _Toc1876 \h </w:instrText>
+            <w:instrText xml:space="preserve"> PAGEREF _Toc29366 \h </w:instrText>
           </w:r>
           <w:r>
             <w:fldChar w:fldCharType="separate"/>
@@ -2385,7 +2385,7 @@
             <w:fldChar w:fldCharType="begin"/>
           </w:r>
           <w:r>
-            <w:instrText xml:space="preserve"> HYPERLINK \l _Toc29885 </w:instrText>
+            <w:instrText xml:space="preserve"> HYPERLINK \l _Toc29038 </w:instrText>
           </w:r>
           <w:r>
             <w:fldChar w:fldCharType="separate"/>
@@ -2443,7 +2443,7 @@
             <w:fldChar w:fldCharType="begin"/>
           </w:r>
           <w:r>
-            <w:instrText xml:space="preserve"> PAGEREF _Toc29885 \h </w:instrText>
+            <w:instrText xml:space="preserve"> PAGEREF _Toc29038 \h </w:instrText>
           </w:r>
           <w:r>
             <w:fldChar w:fldCharType="separate"/>
@@ -2469,7 +2469,7 @@
             <w:fldChar w:fldCharType="begin"/>
           </w:r>
           <w:r>
-            <w:instrText xml:space="preserve"> HYPERLINK \l _Toc24192 </w:instrText>
+            <w:instrText xml:space="preserve"> HYPERLINK \l _Toc18366 </w:instrText>
           </w:r>
           <w:r>
             <w:fldChar w:fldCharType="separate"/>
@@ -2527,7 +2527,7 @@
             <w:fldChar w:fldCharType="begin"/>
           </w:r>
           <w:r>
-            <w:instrText xml:space="preserve"> PAGEREF _Toc24192 \h </w:instrText>
+            <w:instrText xml:space="preserve"> PAGEREF _Toc18366 \h </w:instrText>
           </w:r>
           <w:r>
             <w:fldChar w:fldCharType="separate"/>
@@ -2553,7 +2553,7 @@
             <w:fldChar w:fldCharType="begin"/>
           </w:r>
           <w:r>
-            <w:instrText xml:space="preserve"> HYPERLINK \l _Toc32240 </w:instrText>
+            <w:instrText xml:space="preserve"> HYPERLINK \l _Toc4304 </w:instrText>
           </w:r>
           <w:r>
             <w:fldChar w:fldCharType="separate"/>
@@ -2611,7 +2611,7 @@
             <w:fldChar w:fldCharType="begin"/>
           </w:r>
           <w:r>
-            <w:instrText xml:space="preserve"> PAGEREF _Toc32240 \h </w:instrText>
+            <w:instrText xml:space="preserve"> PAGEREF _Toc4304 \h </w:instrText>
           </w:r>
           <w:r>
             <w:fldChar w:fldCharType="separate"/>
@@ -2637,7 +2637,7 @@
             <w:fldChar w:fldCharType="begin"/>
           </w:r>
           <w:r>
-            <w:instrText xml:space="preserve"> HYPERLINK \l _Toc29028 </w:instrText>
+            <w:instrText xml:space="preserve"> HYPERLINK \l _Toc18245 </w:instrText>
           </w:r>
           <w:r>
             <w:fldChar w:fldCharType="separate"/>
@@ -2660,7 +2660,7 @@
             <w:fldChar w:fldCharType="begin"/>
           </w:r>
           <w:r>
-            <w:instrText xml:space="preserve"> PAGEREF _Toc29028 \h </w:instrText>
+            <w:instrText xml:space="preserve"> PAGEREF _Toc18245 \h </w:instrText>
           </w:r>
           <w:r>
             <w:fldChar w:fldCharType="separate"/>
@@ -2686,7 +2686,7 @@
             <w:fldChar w:fldCharType="begin"/>
           </w:r>
           <w:r>
-            <w:instrText xml:space="preserve"> HYPERLINK \l _Toc10732 </w:instrText>
+            <w:instrText xml:space="preserve"> HYPERLINK \l _Toc19926 </w:instrText>
           </w:r>
           <w:r>
             <w:fldChar w:fldCharType="separate"/>
@@ -2732,7 +2732,7 @@
             <w:fldChar w:fldCharType="begin"/>
           </w:r>
           <w:r>
-            <w:instrText xml:space="preserve"> PAGEREF _Toc10732 \h </w:instrText>
+            <w:instrText xml:space="preserve"> PAGEREF _Toc19926 \h </w:instrText>
           </w:r>
           <w:r>
             <w:fldChar w:fldCharType="separate"/>
@@ -2758,7 +2758,7 @@
             <w:fldChar w:fldCharType="begin"/>
           </w:r>
           <w:r>
-            <w:instrText xml:space="preserve"> HYPERLINK \l _Toc28443 </w:instrText>
+            <w:instrText xml:space="preserve"> HYPERLINK \l _Toc24454 </w:instrText>
           </w:r>
           <w:r>
             <w:fldChar w:fldCharType="separate"/>
@@ -2804,7 +2804,7 @@
             <w:fldChar w:fldCharType="begin"/>
           </w:r>
           <w:r>
-            <w:instrText xml:space="preserve"> PAGEREF _Toc28443 \h </w:instrText>
+            <w:instrText xml:space="preserve"> PAGEREF _Toc24454 \h </w:instrText>
           </w:r>
           <w:r>
             <w:fldChar w:fldCharType="separate"/>
@@ -2830,7 +2830,7 @@
             <w:fldChar w:fldCharType="begin"/>
           </w:r>
           <w:r>
-            <w:instrText xml:space="preserve"> HYPERLINK \l _Toc7401 </w:instrText>
+            <w:instrText xml:space="preserve"> HYPERLINK \l _Toc4285 </w:instrText>
           </w:r>
           <w:r>
             <w:fldChar w:fldCharType="separate"/>
@@ -2876,7 +2876,7 @@
             <w:fldChar w:fldCharType="begin"/>
           </w:r>
           <w:r>
-            <w:instrText xml:space="preserve"> PAGEREF _Toc7401 \h </w:instrText>
+            <w:instrText xml:space="preserve"> PAGEREF _Toc4285 \h </w:instrText>
           </w:r>
           <w:r>
             <w:fldChar w:fldCharType="separate"/>
@@ -2902,7 +2902,7 @@
             <w:fldChar w:fldCharType="begin"/>
           </w:r>
           <w:r>
-            <w:instrText xml:space="preserve"> HYPERLINK \l _Toc32347 </w:instrText>
+            <w:instrText xml:space="preserve"> HYPERLINK \l _Toc1778 </w:instrText>
           </w:r>
           <w:r>
             <w:fldChar w:fldCharType="separate"/>
@@ -2925,7 +2925,7 @@
             <w:fldChar w:fldCharType="begin"/>
           </w:r>
           <w:r>
-            <w:instrText xml:space="preserve"> PAGEREF _Toc32347 \h </w:instrText>
+            <w:instrText xml:space="preserve"> PAGEREF _Toc1778 \h </w:instrText>
           </w:r>
           <w:r>
             <w:fldChar w:fldCharType="separate"/>
@@ -2951,7 +2951,7 @@
             <w:fldChar w:fldCharType="begin"/>
           </w:r>
           <w:r>
-            <w:instrText xml:space="preserve"> HYPERLINK \l _Toc12449 </w:instrText>
+            <w:instrText xml:space="preserve"> HYPERLINK \l _Toc4277 </w:instrText>
           </w:r>
           <w:r>
             <w:fldChar w:fldCharType="separate"/>
@@ -2997,7 +2997,7 @@
             <w:fldChar w:fldCharType="begin"/>
           </w:r>
           <w:r>
-            <w:instrText xml:space="preserve"> PAGEREF _Toc12449 \h </w:instrText>
+            <w:instrText xml:space="preserve"> PAGEREF _Toc4277 \h </w:instrText>
           </w:r>
           <w:r>
             <w:fldChar w:fldCharType="separate"/>
@@ -3023,7 +3023,7 @@
             <w:fldChar w:fldCharType="begin"/>
           </w:r>
           <w:r>
-            <w:instrText xml:space="preserve"> HYPERLINK \l _Toc4203 </w:instrText>
+            <w:instrText xml:space="preserve"> HYPERLINK \l _Toc20596 </w:instrText>
           </w:r>
           <w:r>
             <w:fldChar w:fldCharType="separate"/>
@@ -3069,7 +3069,7 @@
             <w:fldChar w:fldCharType="begin"/>
           </w:r>
           <w:r>
-            <w:instrText xml:space="preserve"> PAGEREF _Toc4203 \h </w:instrText>
+            <w:instrText xml:space="preserve"> PAGEREF _Toc20596 \h </w:instrText>
           </w:r>
           <w:r>
             <w:fldChar w:fldCharType="separate"/>
@@ -3095,7 +3095,7 @@
             <w:fldChar w:fldCharType="begin"/>
           </w:r>
           <w:r>
-            <w:instrText xml:space="preserve"> HYPERLINK \l _Toc24041 </w:instrText>
+            <w:instrText xml:space="preserve"> HYPERLINK \l _Toc21393 </w:instrText>
           </w:r>
           <w:r>
             <w:fldChar w:fldCharType="separate"/>
@@ -3141,7 +3141,7 @@
             <w:fldChar w:fldCharType="begin"/>
           </w:r>
           <w:r>
-            <w:instrText xml:space="preserve"> PAGEREF _Toc24041 \h </w:instrText>
+            <w:instrText xml:space="preserve"> PAGEREF _Toc21393 \h </w:instrText>
           </w:r>
           <w:r>
             <w:fldChar w:fldCharType="separate"/>
@@ -3167,7 +3167,7 @@
             <w:fldChar w:fldCharType="begin"/>
           </w:r>
           <w:r>
-            <w:instrText xml:space="preserve"> HYPERLINK \l _Toc31951 </w:instrText>
+            <w:instrText xml:space="preserve"> HYPERLINK \l _Toc14045 </w:instrText>
           </w:r>
           <w:r>
             <w:fldChar w:fldCharType="separate"/>
@@ -3236,7 +3236,7 @@
             <w:fldChar w:fldCharType="begin"/>
           </w:r>
           <w:r>
-            <w:instrText xml:space="preserve"> PAGEREF _Toc31951 \h </w:instrText>
+            <w:instrText xml:space="preserve"> PAGEREF _Toc14045 \h </w:instrText>
           </w:r>
           <w:r>
             <w:fldChar w:fldCharType="separate"/>
@@ -3262,7 +3262,7 @@
             <w:fldChar w:fldCharType="begin"/>
           </w:r>
           <w:r>
-            <w:instrText xml:space="preserve"> HYPERLINK \l _Toc24621 </w:instrText>
+            <w:instrText xml:space="preserve"> HYPERLINK \l _Toc27644 </w:instrText>
           </w:r>
           <w:r>
             <w:fldChar w:fldCharType="separate"/>
@@ -3320,7 +3320,7 @@
             <w:fldChar w:fldCharType="begin"/>
           </w:r>
           <w:r>
-            <w:instrText xml:space="preserve"> PAGEREF _Toc24621 \h </w:instrText>
+            <w:instrText xml:space="preserve"> PAGEREF _Toc27644 \h </w:instrText>
           </w:r>
           <w:r>
             <w:fldChar w:fldCharType="separate"/>
@@ -3346,7 +3346,7 @@
             <w:fldChar w:fldCharType="begin"/>
           </w:r>
           <w:r>
-            <w:instrText xml:space="preserve"> HYPERLINK \l _Toc13137 </w:instrText>
+            <w:instrText xml:space="preserve"> HYPERLINK \l _Toc200 </w:instrText>
           </w:r>
           <w:r>
             <w:fldChar w:fldCharType="separate"/>
@@ -3392,7 +3392,7 @@
             <w:fldChar w:fldCharType="begin"/>
           </w:r>
           <w:r>
-            <w:instrText xml:space="preserve"> PAGEREF _Toc13137 \h </w:instrText>
+            <w:instrText xml:space="preserve"> PAGEREF _Toc200 \h </w:instrText>
           </w:r>
           <w:r>
             <w:fldChar w:fldCharType="separate"/>
@@ -3418,7 +3418,7 @@
             <w:fldChar w:fldCharType="begin"/>
           </w:r>
           <w:r>
-            <w:instrText xml:space="preserve"> HYPERLINK \l _Toc18906 </w:instrText>
+            <w:instrText xml:space="preserve"> HYPERLINK \l _Toc29275 </w:instrText>
           </w:r>
           <w:r>
             <w:fldChar w:fldCharType="separate"/>
@@ -3469,7 +3469,7 @@
             <w:fldChar w:fldCharType="begin"/>
           </w:r>
           <w:r>
-            <w:instrText xml:space="preserve"> PAGEREF _Toc18906 \h </w:instrText>
+            <w:instrText xml:space="preserve"> PAGEREF _Toc29275 \h </w:instrText>
           </w:r>
           <w:r>
             <w:fldChar w:fldCharType="separate"/>
@@ -3495,7 +3495,7 @@
             <w:fldChar w:fldCharType="begin"/>
           </w:r>
           <w:r>
-            <w:instrText xml:space="preserve"> HYPERLINK \l _Toc32591 </w:instrText>
+            <w:instrText xml:space="preserve"> HYPERLINK \l _Toc26732 </w:instrText>
           </w:r>
           <w:r>
             <w:fldChar w:fldCharType="separate"/>
@@ -3553,7 +3553,7 @@
             <w:fldChar w:fldCharType="begin"/>
           </w:r>
           <w:r>
-            <w:instrText xml:space="preserve"> PAGEREF _Toc32591 \h </w:instrText>
+            <w:instrText xml:space="preserve"> PAGEREF _Toc26732 \h </w:instrText>
           </w:r>
           <w:r>
             <w:fldChar w:fldCharType="separate"/>
@@ -3579,7 +3579,7 @@
             <w:fldChar w:fldCharType="begin"/>
           </w:r>
           <w:r>
-            <w:instrText xml:space="preserve"> HYPERLINK \l _Toc14579 </w:instrText>
+            <w:instrText xml:space="preserve"> HYPERLINK \l _Toc21959 </w:instrText>
           </w:r>
           <w:r>
             <w:fldChar w:fldCharType="separate"/>
@@ -3637,7 +3637,7 @@
             <w:fldChar w:fldCharType="begin"/>
           </w:r>
           <w:r>
-            <w:instrText xml:space="preserve"> PAGEREF _Toc14579 \h </w:instrText>
+            <w:instrText xml:space="preserve"> PAGEREF _Toc21959 \h </w:instrText>
           </w:r>
           <w:r>
             <w:fldChar w:fldCharType="separate"/>
@@ -3663,7 +3663,7 @@
             <w:fldChar w:fldCharType="begin"/>
           </w:r>
           <w:r>
-            <w:instrText xml:space="preserve"> HYPERLINK \l _Toc28275 </w:instrText>
+            <w:instrText xml:space="preserve"> HYPERLINK \l _Toc20283 </w:instrText>
           </w:r>
           <w:r>
             <w:fldChar w:fldCharType="separate"/>
@@ -3686,7 +3686,7 @@
             <w:fldChar w:fldCharType="begin"/>
           </w:r>
           <w:r>
-            <w:instrText xml:space="preserve"> PAGEREF _Toc28275 \h </w:instrText>
+            <w:instrText xml:space="preserve"> PAGEREF _Toc20283 \h </w:instrText>
           </w:r>
           <w:r>
             <w:fldChar w:fldCharType="separate"/>
@@ -3712,7 +3712,7 @@
             <w:fldChar w:fldCharType="begin"/>
           </w:r>
           <w:r>
-            <w:instrText xml:space="preserve"> HYPERLINK \l _Toc5471 </w:instrText>
+            <w:instrText xml:space="preserve"> HYPERLINK \l _Toc19904 </w:instrText>
           </w:r>
           <w:r>
             <w:fldChar w:fldCharType="separate"/>
@@ -3758,7 +3758,7 @@
             <w:fldChar w:fldCharType="begin"/>
           </w:r>
           <w:r>
-            <w:instrText xml:space="preserve"> PAGEREF _Toc5471 \h </w:instrText>
+            <w:instrText xml:space="preserve"> PAGEREF _Toc19904 \h </w:instrText>
           </w:r>
           <w:r>
             <w:fldChar w:fldCharType="separate"/>
@@ -3784,7 +3784,7 @@
             <w:fldChar w:fldCharType="begin"/>
           </w:r>
           <w:r>
-            <w:instrText xml:space="preserve"> HYPERLINK \l _Toc15942 </w:instrText>
+            <w:instrText xml:space="preserve"> HYPERLINK \l _Toc17216 </w:instrText>
           </w:r>
           <w:r>
             <w:fldChar w:fldCharType="separate"/>
@@ -3830,7 +3830,7 @@
             <w:fldChar w:fldCharType="begin"/>
           </w:r>
           <w:r>
-            <w:instrText xml:space="preserve"> PAGEREF _Toc15942 \h </w:instrText>
+            <w:instrText xml:space="preserve"> PAGEREF _Toc17216 \h </w:instrText>
           </w:r>
           <w:r>
             <w:fldChar w:fldCharType="separate"/>
@@ -3856,7 +3856,7 @@
             <w:fldChar w:fldCharType="begin"/>
           </w:r>
           <w:r>
-            <w:instrText xml:space="preserve"> HYPERLINK \l _Toc20158 </w:instrText>
+            <w:instrText xml:space="preserve"> HYPERLINK \l _Toc14982 </w:instrText>
           </w:r>
           <w:r>
             <w:fldChar w:fldCharType="separate"/>
@@ -3879,7 +3879,7 @@
             <w:fldChar w:fldCharType="begin"/>
           </w:r>
           <w:r>
-            <w:instrText xml:space="preserve"> PAGEREF _Toc20158 \h </w:instrText>
+            <w:instrText xml:space="preserve"> PAGEREF _Toc14982 \h </w:instrText>
           </w:r>
           <w:r>
             <w:fldChar w:fldCharType="separate"/>
@@ -3905,7 +3905,7 @@
             <w:fldChar w:fldCharType="begin"/>
           </w:r>
           <w:r>
-            <w:instrText xml:space="preserve"> HYPERLINK \l _Toc3900 </w:instrText>
+            <w:instrText xml:space="preserve"> HYPERLINK \l _Toc3220 </w:instrText>
           </w:r>
           <w:r>
             <w:fldChar w:fldCharType="separate"/>
@@ -3951,7 +3951,7 @@
             <w:fldChar w:fldCharType="begin"/>
           </w:r>
           <w:r>
-            <w:instrText xml:space="preserve"> PAGEREF _Toc3900 \h </w:instrText>
+            <w:instrText xml:space="preserve"> PAGEREF _Toc3220 \h </w:instrText>
           </w:r>
           <w:r>
             <w:fldChar w:fldCharType="separate"/>
@@ -3977,7 +3977,7 @@
             <w:fldChar w:fldCharType="begin"/>
           </w:r>
           <w:r>
-            <w:instrText xml:space="preserve"> HYPERLINK \l _Toc32194 </w:instrText>
+            <w:instrText xml:space="preserve"> HYPERLINK \l _Toc28992 </w:instrText>
           </w:r>
           <w:r>
             <w:fldChar w:fldCharType="separate"/>
@@ -4023,7 +4023,7 @@
             <w:fldChar w:fldCharType="begin"/>
           </w:r>
           <w:r>
-            <w:instrText xml:space="preserve"> PAGEREF _Toc32194 \h </w:instrText>
+            <w:instrText xml:space="preserve"> PAGEREF _Toc28992 \h </w:instrText>
           </w:r>
           <w:r>
             <w:fldChar w:fldCharType="separate"/>
@@ -4049,7 +4049,7 @@
             <w:fldChar w:fldCharType="begin"/>
           </w:r>
           <w:r>
-            <w:instrText xml:space="preserve"> HYPERLINK \l _Toc20770 </w:instrText>
+            <w:instrText xml:space="preserve"> HYPERLINK \l _Toc27496 </w:instrText>
           </w:r>
           <w:r>
             <w:fldChar w:fldCharType="separate"/>
@@ -4072,7 +4072,7 @@
             <w:fldChar w:fldCharType="begin"/>
           </w:r>
           <w:r>
-            <w:instrText xml:space="preserve"> PAGEREF _Toc20770 \h </w:instrText>
+            <w:instrText xml:space="preserve"> PAGEREF _Toc27496 \h </w:instrText>
           </w:r>
           <w:r>
             <w:fldChar w:fldCharType="separate"/>
@@ -4098,7 +4098,7 @@
             <w:fldChar w:fldCharType="begin"/>
           </w:r>
           <w:r>
-            <w:instrText xml:space="preserve"> HYPERLINK \l _Toc11608 </w:instrText>
+            <w:instrText xml:space="preserve"> HYPERLINK \l _Toc6746 </w:instrText>
           </w:r>
           <w:r>
             <w:fldChar w:fldCharType="separate"/>
@@ -4144,7 +4144,7 @@
             <w:fldChar w:fldCharType="begin"/>
           </w:r>
           <w:r>
-            <w:instrText xml:space="preserve"> PAGEREF _Toc11608 \h </w:instrText>
+            <w:instrText xml:space="preserve"> PAGEREF _Toc6746 \h </w:instrText>
           </w:r>
           <w:r>
             <w:fldChar w:fldCharType="separate"/>
@@ -4170,7 +4170,7 @@
             <w:fldChar w:fldCharType="begin"/>
           </w:r>
           <w:r>
-            <w:instrText xml:space="preserve"> HYPERLINK \l _Toc15396 </w:instrText>
+            <w:instrText xml:space="preserve"> HYPERLINK \l _Toc13174 </w:instrText>
           </w:r>
           <w:r>
             <w:fldChar w:fldCharType="separate"/>
@@ -4228,7 +4228,7 @@
             <w:fldChar w:fldCharType="begin"/>
           </w:r>
           <w:r>
-            <w:instrText xml:space="preserve"> PAGEREF _Toc15396 \h </w:instrText>
+            <w:instrText xml:space="preserve"> PAGEREF _Toc13174 \h </w:instrText>
           </w:r>
           <w:r>
             <w:fldChar w:fldCharType="separate"/>
@@ -4254,7 +4254,7 @@
             <w:fldChar w:fldCharType="begin"/>
           </w:r>
           <w:r>
-            <w:instrText xml:space="preserve"> HYPERLINK \l _Toc29230 </w:instrText>
+            <w:instrText xml:space="preserve"> HYPERLINK \l _Toc15291 </w:instrText>
           </w:r>
           <w:r>
             <w:fldChar w:fldCharType="separate"/>
@@ -4348,7 +4348,7 @@
             <w:fldChar w:fldCharType="begin"/>
           </w:r>
           <w:r>
-            <w:instrText xml:space="preserve"> PAGEREF _Toc29230 \h </w:instrText>
+            <w:instrText xml:space="preserve"> PAGEREF _Toc15291 \h </w:instrText>
           </w:r>
           <w:r>
             <w:fldChar w:fldCharType="separate"/>
@@ -4374,7 +4374,7 @@
             <w:fldChar w:fldCharType="begin"/>
           </w:r>
           <w:r>
-            <w:instrText xml:space="preserve"> HYPERLINK \l _Toc694 </w:instrText>
+            <w:instrText xml:space="preserve"> HYPERLINK \l _Toc6100 </w:instrText>
           </w:r>
           <w:r>
             <w:fldChar w:fldCharType="separate"/>
@@ -4456,7 +4456,7 @@
             <w:fldChar w:fldCharType="begin"/>
           </w:r>
           <w:r>
-            <w:instrText xml:space="preserve"> PAGEREF _Toc694 \h </w:instrText>
+            <w:instrText xml:space="preserve"> PAGEREF _Toc6100 \h </w:instrText>
           </w:r>
           <w:r>
             <w:fldChar w:fldCharType="separate"/>
@@ -4482,7 +4482,7 @@
             <w:fldChar w:fldCharType="begin"/>
           </w:r>
           <w:r>
-            <w:instrText xml:space="preserve"> HYPERLINK \l _Toc27480 </w:instrText>
+            <w:instrText xml:space="preserve"> HYPERLINK \l _Toc5570 </w:instrText>
           </w:r>
           <w:r>
             <w:fldChar w:fldCharType="separate"/>
@@ -4564,7 +4564,7 @@
             <w:fldChar w:fldCharType="begin"/>
           </w:r>
           <w:r>
-            <w:instrText xml:space="preserve"> PAGEREF _Toc27480 \h </w:instrText>
+            <w:instrText xml:space="preserve"> PAGEREF _Toc5570 \h </w:instrText>
           </w:r>
           <w:r>
             <w:fldChar w:fldCharType="separate"/>
@@ -4590,7 +4590,7 @@
             <w:fldChar w:fldCharType="begin"/>
           </w:r>
           <w:r>
-            <w:instrText xml:space="preserve"> HYPERLINK \l _Toc3121 </w:instrText>
+            <w:instrText xml:space="preserve"> HYPERLINK \l _Toc21116 </w:instrText>
           </w:r>
           <w:r>
             <w:fldChar w:fldCharType="separate"/>
@@ -4613,7 +4613,7 @@
             <w:fldChar w:fldCharType="begin"/>
           </w:r>
           <w:r>
-            <w:instrText xml:space="preserve"> PAGEREF _Toc3121 \h </w:instrText>
+            <w:instrText xml:space="preserve"> PAGEREF _Toc21116 \h </w:instrText>
           </w:r>
           <w:r>
             <w:fldChar w:fldCharType="separate"/>
@@ -4639,7 +4639,7 @@
             <w:fldChar w:fldCharType="begin"/>
           </w:r>
           <w:r>
-            <w:instrText xml:space="preserve"> HYPERLINK \l _Toc23838 </w:instrText>
+            <w:instrText xml:space="preserve"> HYPERLINK \l _Toc28979 </w:instrText>
           </w:r>
           <w:r>
             <w:fldChar w:fldCharType="separate"/>
@@ -4662,7 +4662,7 @@
             <w:fldChar w:fldCharType="begin"/>
           </w:r>
           <w:r>
-            <w:instrText xml:space="preserve"> PAGEREF _Toc23838 \h </w:instrText>
+            <w:instrText xml:space="preserve"> PAGEREF _Toc28979 \h </w:instrText>
           </w:r>
           <w:r>
             <w:fldChar w:fldCharType="separate"/>
@@ -4688,7 +4688,7 @@
             <w:fldChar w:fldCharType="begin"/>
           </w:r>
           <w:r>
-            <w:instrText xml:space="preserve"> HYPERLINK \l _Toc17629 </w:instrText>
+            <w:instrText xml:space="preserve"> HYPERLINK \l _Toc27916 </w:instrText>
           </w:r>
           <w:r>
             <w:fldChar w:fldCharType="separate"/>
@@ -4711,7 +4711,7 @@
             <w:fldChar w:fldCharType="begin"/>
           </w:r>
           <w:r>
-            <w:instrText xml:space="preserve"> PAGEREF _Toc17629 \h </w:instrText>
+            <w:instrText xml:space="preserve"> PAGEREF _Toc27916 \h </w:instrText>
           </w:r>
           <w:r>
             <w:fldChar w:fldCharType="separate"/>
@@ -4737,7 +4737,7 @@
             <w:fldChar w:fldCharType="begin"/>
           </w:r>
           <w:r>
-            <w:instrText xml:space="preserve"> HYPERLINK \l _Toc24379 </w:instrText>
+            <w:instrText xml:space="preserve"> HYPERLINK \l _Toc11638 </w:instrText>
           </w:r>
           <w:r>
             <w:fldChar w:fldCharType="separate"/>
@@ -4782,13 +4782,337 @@
             <w:fldChar w:fldCharType="begin"/>
           </w:r>
           <w:r>
-            <w:instrText xml:space="preserve"> PAGEREF _Toc24379 \h </w:instrText>
+            <w:instrText xml:space="preserve"> PAGEREF _Toc11638 \h </w:instrText>
           </w:r>
           <w:r>
             <w:fldChar w:fldCharType="separate"/>
           </w:r>
           <w:r>
             <w:t>14</w:t>
+          </w:r>
+          <w:r>
+            <w:fldChar w:fldCharType="end"/>
+          </w:r>
+          <w:r>
+            <w:fldChar w:fldCharType="end"/>
+          </w:r>
+        </w:p>
+        <w:p>
+          <w:pPr>
+            <w:pStyle w:val="10"/>
+            <w:tabs>
+              <w:tab w:val="right" w:leader="dot" w:pos="8306"/>
+            </w:tabs>
+          </w:pPr>
+          <w:r>
+            <w:fldChar w:fldCharType="begin"/>
+          </w:r>
+          <w:r>
+            <w:instrText xml:space="preserve"> HYPERLINK \l _Toc23688 </w:instrText>
+          </w:r>
+          <w:r>
+            <w:fldChar w:fldCharType="separate"/>
+          </w:r>
+          <w:r>
+            <w:rPr>
+              <w:rFonts w:hint="default" w:ascii="Times New Roman" w:hAnsi="Times New Roman" w:eastAsia="宋体" w:cs="Times New Roman"/>
+              <w:bCs/>
+              <w:caps w:val="0"/>
+              <w:spacing w:val="0"/>
+              <w:szCs w:val="28"/>
+              <w:shd w:val="clear" w:fill="FFFFFF"/>
+            </w:rPr>
+            <w:t>8.</w:t>
+          </w:r>
+          <w:r>
+            <w:rPr>
+              <w:rFonts w:hint="eastAsia" w:ascii="Times New Roman" w:hAnsi="Times New Roman" w:cs="Times New Roman"/>
+              <w:bCs/>
+              <w:caps w:val="0"/>
+              <w:spacing w:val="0"/>
+              <w:szCs w:val="28"/>
+              <w:shd w:val="clear" w:fill="FFFFFF"/>
+              <w:lang w:val="en-US" w:eastAsia="zh-CN"/>
+            </w:rPr>
+            <w:t>3</w:t>
+          </w:r>
+          <w:r>
+            <w:rPr>
+              <w:rFonts w:hint="default" w:ascii="Times New Roman" w:hAnsi="Times New Roman" w:eastAsia="宋体" w:cs="Times New Roman"/>
+              <w:bCs/>
+              <w:caps w:val="0"/>
+              <w:spacing w:val="0"/>
+              <w:szCs w:val="28"/>
+              <w:shd w:val="clear" w:fill="FFFFFF"/>
+              <w:lang w:val="en-US" w:eastAsia="zh-CN"/>
+            </w:rPr>
+            <w:t>.</w:t>
+          </w:r>
+          <w:r>
+            <w:rPr>
+              <w:rFonts w:hint="default" w:ascii="Times New Roman" w:hAnsi="Times New Roman" w:eastAsia="宋体" w:cs="Times New Roman"/>
+              <w:bCs/>
+              <w:caps w:val="0"/>
+              <w:spacing w:val="0"/>
+              <w:szCs w:val="28"/>
+              <w:shd w:val="clear" w:fill="FFFFFF"/>
+            </w:rPr>
+            <w:t>问题修复</w:t>
+          </w:r>
+          <w:r>
+            <w:rPr>
+              <w:rFonts w:hint="eastAsia" w:ascii="Times New Roman" w:hAnsi="Times New Roman" w:cs="Times New Roman"/>
+              <w:bCs/>
+              <w:caps w:val="0"/>
+              <w:spacing w:val="0"/>
+              <w:szCs w:val="28"/>
+              <w:shd w:val="clear" w:fill="FFFFFF"/>
+              <w:lang w:val="en-US" w:eastAsia="zh-CN"/>
+            </w:rPr>
+            <w:t>记录</w:t>
+          </w:r>
+          <w:r>
+            <w:tab/>
+          </w:r>
+          <w:r>
+            <w:fldChar w:fldCharType="begin"/>
+          </w:r>
+          <w:r>
+            <w:instrText xml:space="preserve"> PAGEREF _Toc23688 \h </w:instrText>
+          </w:r>
+          <w:r>
+            <w:fldChar w:fldCharType="separate"/>
+          </w:r>
+          <w:r>
+            <w:t>15</w:t>
+          </w:r>
+          <w:r>
+            <w:fldChar w:fldCharType="end"/>
+          </w:r>
+          <w:r>
+            <w:fldChar w:fldCharType="end"/>
+          </w:r>
+        </w:p>
+        <w:p>
+          <w:pPr>
+            <w:pStyle w:val="6"/>
+            <w:tabs>
+              <w:tab w:val="right" w:leader="dot" w:pos="8306"/>
+            </w:tabs>
+          </w:pPr>
+          <w:r>
+            <w:fldChar w:fldCharType="begin"/>
+          </w:r>
+          <w:r>
+            <w:instrText xml:space="preserve"> HYPERLINK \l _Toc6611 </w:instrText>
+          </w:r>
+          <w:r>
+            <w:fldChar w:fldCharType="separate"/>
+          </w:r>
+          <w:r>
+            <w:rPr>
+              <w:rFonts w:hint="eastAsia" w:ascii="Times New Roman" w:hAnsi="Times New Roman" w:cs="Times New Roman"/>
+              <w:bCs/>
+              <w:caps w:val="0"/>
+              <w:spacing w:val="0"/>
+              <w:szCs w:val="24"/>
+              <w:shd w:val="clear" w:fill="FFFFFF"/>
+              <w:lang w:val="en-US" w:eastAsia="zh-CN"/>
+            </w:rPr>
+            <w:t>8</w:t>
+          </w:r>
+          <w:r>
+            <w:rPr>
+              <w:rFonts w:hint="default" w:ascii="Times New Roman" w:hAnsi="Times New Roman" w:eastAsia="宋体" w:cs="Times New Roman"/>
+              <w:bCs/>
+              <w:caps w:val="0"/>
+              <w:spacing w:val="0"/>
+              <w:szCs w:val="24"/>
+              <w:shd w:val="clear" w:fill="FFFFFF"/>
+            </w:rPr>
+            <w:t>.</w:t>
+          </w:r>
+          <w:r>
+            <w:rPr>
+              <w:rFonts w:hint="eastAsia" w:ascii="Times New Roman" w:hAnsi="Times New Roman" w:cs="Times New Roman"/>
+              <w:bCs/>
+              <w:caps w:val="0"/>
+              <w:spacing w:val="0"/>
+              <w:szCs w:val="24"/>
+              <w:shd w:val="clear" w:fill="FFFFFF"/>
+              <w:lang w:val="en-US" w:eastAsia="zh-CN"/>
+            </w:rPr>
+            <w:t>3</w:t>
+          </w:r>
+          <w:r>
+            <w:rPr>
+              <w:rFonts w:hint="default" w:ascii="Times New Roman" w:hAnsi="Times New Roman" w:eastAsia="宋体" w:cs="Times New Roman"/>
+              <w:bCs/>
+              <w:caps w:val="0"/>
+              <w:spacing w:val="0"/>
+              <w:szCs w:val="24"/>
+              <w:shd w:val="clear" w:fill="FFFFFF"/>
+            </w:rPr>
+            <w:t>.</w:t>
+          </w:r>
+          <w:r>
+            <w:rPr>
+              <w:rFonts w:hint="eastAsia" w:ascii="Times New Roman" w:hAnsi="Times New Roman" w:cs="Times New Roman"/>
+              <w:bCs/>
+              <w:caps w:val="0"/>
+              <w:spacing w:val="0"/>
+              <w:szCs w:val="24"/>
+              <w:shd w:val="clear" w:fill="FFFFFF"/>
+              <w:lang w:val="en-US" w:eastAsia="zh-CN"/>
+            </w:rPr>
+            <w:t>1</w:t>
+          </w:r>
+          <w:r>
+            <w:rPr>
+              <w:rFonts w:hint="default" w:ascii="Times New Roman" w:hAnsi="Times New Roman" w:eastAsia="宋体" w:cs="Times New Roman"/>
+              <w:bCs/>
+              <w:caps w:val="0"/>
+              <w:spacing w:val="0"/>
+              <w:szCs w:val="24"/>
+              <w:shd w:val="clear" w:fill="FFFFFF"/>
+              <w:lang w:val="en-US" w:eastAsia="zh-CN"/>
+            </w:rPr>
+            <w:t>.</w:t>
+          </w:r>
+          <w:r>
+            <w:rPr>
+              <w:rFonts w:hint="eastAsia" w:ascii="Times New Roman" w:hAnsi="Times New Roman" w:cs="Times New Roman"/>
+              <w:bCs/>
+              <w:caps w:val="0"/>
+              <w:spacing w:val="0"/>
+              <w:szCs w:val="24"/>
+              <w:shd w:val="clear" w:fill="FFFFFF"/>
+              <w:lang w:val="en-US" w:eastAsia="zh-CN"/>
+            </w:rPr>
+            <w:t>AbilityTask 激活与清理问题</w:t>
+          </w:r>
+          <w:r>
+            <w:tab/>
+          </w:r>
+          <w:r>
+            <w:fldChar w:fldCharType="begin"/>
+          </w:r>
+          <w:r>
+            <w:instrText xml:space="preserve"> PAGEREF _Toc6611 \h </w:instrText>
+          </w:r>
+          <w:r>
+            <w:fldChar w:fldCharType="separate"/>
+          </w:r>
+          <w:r>
+            <w:t>15</w:t>
+          </w:r>
+          <w:r>
+            <w:fldChar w:fldCharType="end"/>
+          </w:r>
+          <w:r>
+            <w:fldChar w:fldCharType="end"/>
+          </w:r>
+        </w:p>
+        <w:p>
+          <w:pPr>
+            <w:pStyle w:val="6"/>
+            <w:tabs>
+              <w:tab w:val="right" w:leader="dot" w:pos="8306"/>
+            </w:tabs>
+          </w:pPr>
+          <w:r>
+            <w:fldChar w:fldCharType="begin"/>
+          </w:r>
+          <w:r>
+            <w:instrText xml:space="preserve"> HYPERLINK \l _Toc28706 </w:instrText>
+          </w:r>
+          <w:r>
+            <w:fldChar w:fldCharType="separate"/>
+          </w:r>
+          <w:r>
+            <w:rPr>
+              <w:rFonts w:hint="eastAsia" w:ascii="Times New Roman" w:hAnsi="Times New Roman" w:cs="Times New Roman"/>
+              <w:bCs/>
+              <w:caps w:val="0"/>
+              <w:spacing w:val="0"/>
+              <w:szCs w:val="24"/>
+              <w:shd w:val="clear" w:fill="FFFFFF"/>
+              <w:lang w:val="en-US" w:eastAsia="zh-CN"/>
+            </w:rPr>
+            <w:t>8</w:t>
+          </w:r>
+          <w:r>
+            <w:rPr>
+              <w:rFonts w:hint="default" w:ascii="Times New Roman" w:hAnsi="Times New Roman" w:eastAsia="宋体" w:cs="Times New Roman"/>
+              <w:bCs/>
+              <w:caps w:val="0"/>
+              <w:spacing w:val="0"/>
+              <w:szCs w:val="24"/>
+              <w:shd w:val="clear" w:fill="FFFFFF"/>
+            </w:rPr>
+            <w:t>.</w:t>
+          </w:r>
+          <w:r>
+            <w:rPr>
+              <w:rFonts w:hint="eastAsia" w:ascii="Times New Roman" w:hAnsi="Times New Roman" w:cs="Times New Roman"/>
+              <w:bCs/>
+              <w:caps w:val="0"/>
+              <w:spacing w:val="0"/>
+              <w:szCs w:val="24"/>
+              <w:shd w:val="clear" w:fill="FFFFFF"/>
+              <w:lang w:val="en-US" w:eastAsia="zh-CN"/>
+            </w:rPr>
+            <w:t>3</w:t>
+          </w:r>
+          <w:r>
+            <w:rPr>
+              <w:rFonts w:hint="default" w:ascii="Times New Roman" w:hAnsi="Times New Roman" w:eastAsia="宋体" w:cs="Times New Roman"/>
+              <w:bCs/>
+              <w:caps w:val="0"/>
+              <w:spacing w:val="0"/>
+              <w:szCs w:val="24"/>
+              <w:shd w:val="clear" w:fill="FFFFFF"/>
+            </w:rPr>
+            <w:t>.</w:t>
+          </w:r>
+          <w:r>
+            <w:rPr>
+              <w:rFonts w:hint="eastAsia" w:ascii="Times New Roman" w:hAnsi="Times New Roman" w:cs="Times New Roman"/>
+              <w:bCs/>
+              <w:caps w:val="0"/>
+              <w:spacing w:val="0"/>
+              <w:szCs w:val="24"/>
+              <w:shd w:val="clear" w:fill="FFFFFF"/>
+              <w:lang w:val="en-US" w:eastAsia="zh-CN"/>
+            </w:rPr>
+            <w:t>2</w:t>
+          </w:r>
+          <w:r>
+            <w:rPr>
+              <w:rFonts w:hint="default" w:ascii="Times New Roman" w:hAnsi="Times New Roman" w:eastAsia="宋体" w:cs="Times New Roman"/>
+              <w:bCs/>
+              <w:caps w:val="0"/>
+              <w:spacing w:val="0"/>
+              <w:szCs w:val="24"/>
+              <w:shd w:val="clear" w:fill="FFFFFF"/>
+              <w:lang w:val="en-US" w:eastAsia="zh-CN"/>
+            </w:rPr>
+            <w:t>.第一次播放蓄力蒙太奇无动画</w:t>
+          </w:r>
+          <w:r>
+            <w:tab/>
+          </w:r>
+          <w:r>
+            <w:fldChar w:fldCharType="begin"/>
+          </w:r>
+          <w:r>
+            <w:instrText xml:space="preserve"> PAGEREF _Toc28706 \h </w:instrText>
+          </w:r>
+          <w:r>
+            <w:fldChar w:fldCharType="separate"/>
+          </w:r>
+          <w:r>
+            <w:t>15</w:t>
           </w:r>
           <w:r>
             <w:fldChar w:fldCharType="end"/>
@@ -4970,7 +5294,7 @@
           <w:szCs w:val="30"/>
         </w:rPr>
       </w:pPr>
-      <w:bookmarkStart w:id="0" w:name="_Toc10381"/>
+      <w:bookmarkStart w:id="0" w:name="_Toc22989"/>
       <w:r>
         <w:rPr>
           <w:rFonts w:hint="default" w:ascii="Times New Roman" w:hAnsi="Times New Roman" w:eastAsia="宋体" w:cs="Times New Roman"/>
@@ -5009,7 +5333,7 @@
           <w:szCs w:val="28"/>
         </w:rPr>
       </w:pPr>
-      <w:bookmarkStart w:id="1" w:name="_Toc2339"/>
+      <w:bookmarkStart w:id="1" w:name="_Toc29118"/>
       <w:r>
         <w:rPr>
           <w:rFonts w:hint="default" w:ascii="Times New Roman" w:hAnsi="Times New Roman" w:eastAsia="宋体" w:cs="Times New Roman"/>
@@ -5127,7 +5451,7 @@
           <w:szCs w:val="28"/>
         </w:rPr>
       </w:pPr>
-      <w:bookmarkStart w:id="2" w:name="_Toc24978"/>
+      <w:bookmarkStart w:id="2" w:name="_Toc28226"/>
       <w:r>
         <w:rPr>
           <w:rFonts w:hint="default" w:ascii="Times New Roman" w:hAnsi="Times New Roman" w:eastAsia="宋体" w:cs="Times New Roman"/>
@@ -5251,7 +5575,7 @@
           <w:szCs w:val="28"/>
         </w:rPr>
       </w:pPr>
-      <w:bookmarkStart w:id="3" w:name="_Toc31398"/>
+      <w:bookmarkStart w:id="3" w:name="_Toc3675"/>
       <w:r>
         <w:rPr>
           <w:rFonts w:hint="default" w:ascii="Times New Roman" w:hAnsi="Times New Roman" w:eastAsia="宋体" w:cs="Times New Roman"/>
@@ -5323,12 +5647,6 @@
             <w:insideV w:val="single" w:color="000000" w:sz="4" w:space="0"/>
           </w:tblBorders>
           <w:shd w:val="clear" w:color="auto" w:fill="FFFFFF"/>
-          <w:tblCellMar>
-            <w:top w:w="15" w:type="dxa"/>
-            <w:left w:w="15" w:type="dxa"/>
-            <w:bottom w:w="15" w:type="dxa"/>
-            <w:right w:w="15" w:type="dxa"/>
-          </w:tblCellMar>
         </w:tblPrEx>
         <w:trPr>
           <w:tblHeader/>
@@ -5539,6 +5857,7 @@
             <w:insideH w:val="single" w:color="000000" w:sz="4" w:space="0"/>
             <w:insideV w:val="single" w:color="000000" w:sz="4" w:space="0"/>
           </w:tblBorders>
+          <w:shd w:val="clear" w:color="auto" w:fill="FFFFFF"/>
           <w:tblCellMar>
             <w:top w:w="15" w:type="dxa"/>
             <w:left w:w="15" w:type="dxa"/>
@@ -7129,7 +7448,7 @@
           <w:szCs w:val="30"/>
         </w:rPr>
       </w:pPr>
-      <w:bookmarkStart w:id="4" w:name="_Toc21877"/>
+      <w:bookmarkStart w:id="4" w:name="_Toc1298"/>
       <w:r>
         <w:rPr>
           <w:rFonts w:hint="default" w:ascii="Times New Roman" w:hAnsi="Times New Roman" w:eastAsia="宋体" w:cs="Times New Roman"/>
@@ -7184,7 +7503,7 @@
           <w:szCs w:val="28"/>
         </w:rPr>
       </w:pPr>
-      <w:bookmarkStart w:id="5" w:name="_Toc27477"/>
+      <w:bookmarkStart w:id="5" w:name="_Toc5147"/>
       <w:r>
         <w:rPr>
           <w:rFonts w:hint="default" w:ascii="Times New Roman" w:hAnsi="Times New Roman" w:eastAsia="宋体" w:cs="Times New Roman"/>
@@ -7308,7 +7627,7 @@
           <w:lang w:val="en-US" w:eastAsia="zh-CN"/>
         </w:rPr>
       </w:pPr>
-      <w:bookmarkStart w:id="6" w:name="_Toc11645"/>
+      <w:bookmarkStart w:id="6" w:name="_Toc25827"/>
       <w:r>
         <w:rPr>
           <w:rFonts w:hint="default" w:ascii="Times New Roman" w:hAnsi="Times New Roman" w:eastAsia="宋体" w:cs="Times New Roman"/>
@@ -7355,7 +7674,7 @@
           <w:szCs w:val="24"/>
         </w:rPr>
       </w:pPr>
-      <w:bookmarkStart w:id="7" w:name="_Toc14242"/>
+      <w:bookmarkStart w:id="7" w:name="_Toc12947"/>
       <w:r>
         <w:rPr>
           <w:rFonts w:hint="default" w:ascii="Times New Roman" w:hAnsi="Times New Roman" w:eastAsia="宋体" w:cs="Times New Roman"/>
@@ -7805,7 +8124,7 @@
           <w:shd w:val="clear" w:fill="FFFFFF"/>
         </w:rPr>
       </w:pPr>
-      <w:bookmarkStart w:id="8" w:name="_Toc21387"/>
+      <w:bookmarkStart w:id="8" w:name="_Toc7259"/>
       <w:r>
         <w:rPr>
           <w:rFonts w:hint="default" w:ascii="Times New Roman" w:hAnsi="Times New Roman" w:eastAsia="宋体" w:cs="Times New Roman"/>
@@ -8037,7 +8356,7 @@
           <w:shd w:val="clear" w:fill="FFFFFF"/>
         </w:rPr>
       </w:pPr>
-      <w:bookmarkStart w:id="9" w:name="_Toc3128"/>
+      <w:bookmarkStart w:id="9" w:name="_Toc28074"/>
       <w:r>
         <w:rPr>
           <w:rFonts w:hint="default" w:ascii="Times New Roman" w:hAnsi="Times New Roman" w:eastAsia="宋体" w:cs="Times New Roman"/>
@@ -8246,7 +8565,7 @@
           <w:szCs w:val="24"/>
         </w:rPr>
       </w:pPr>
-      <w:bookmarkStart w:id="10" w:name="_Toc19113"/>
+      <w:bookmarkStart w:id="10" w:name="_Toc30775"/>
       <w:r>
         <w:rPr>
           <w:rFonts w:hint="default" w:ascii="Times New Roman" w:hAnsi="Times New Roman" w:eastAsia="宋体" w:cs="Times New Roman"/>
@@ -8580,7 +8899,7 @@
           <w:szCs w:val="28"/>
         </w:rPr>
       </w:pPr>
-      <w:bookmarkStart w:id="11" w:name="_Toc27868"/>
+      <w:bookmarkStart w:id="11" w:name="_Toc7639"/>
       <w:r>
         <w:rPr>
           <w:rFonts w:hint="default" w:ascii="Times New Roman" w:hAnsi="Times New Roman" w:eastAsia="宋体" w:cs="Times New Roman"/>
@@ -8747,7 +9066,7 @@
           <w:lang w:val="en-US" w:eastAsia="zh-CN" w:bidi="ar"/>
         </w:rPr>
       </w:pPr>
-      <w:bookmarkStart w:id="12" w:name="_Toc26851"/>
+      <w:bookmarkStart w:id="12" w:name="_Toc23314"/>
       <w:r>
         <w:rPr>
           <w:rFonts w:hint="default" w:ascii="Times New Roman" w:hAnsi="Times New Roman" w:eastAsia="宋体" w:cs="Times New Roman"/>
@@ -11148,7 +11467,7 @@
           <w:lang w:val="en-US" w:eastAsia="zh-CN" w:bidi="ar"/>
         </w:rPr>
       </w:pPr>
-      <w:bookmarkStart w:id="13" w:name="_Toc7002"/>
+      <w:bookmarkStart w:id="13" w:name="_Toc24382"/>
       <w:r>
         <w:rPr>
           <w:rFonts w:hint="default" w:ascii="Times New Roman" w:hAnsi="Times New Roman" w:eastAsia="宋体" w:cs="Times New Roman"/>
@@ -13858,7 +14177,7 @@
           <w:lang w:val="en-US" w:eastAsia="zh-CN" w:bidi="ar"/>
         </w:rPr>
       </w:pPr>
-      <w:bookmarkStart w:id="14" w:name="_Toc25853"/>
+      <w:bookmarkStart w:id="14" w:name="_Toc3219"/>
       <w:r>
         <w:rPr>
           <w:rFonts w:hint="default" w:ascii="Times New Roman" w:hAnsi="Times New Roman" w:eastAsia="宋体" w:cs="Times New Roman"/>
@@ -14043,7 +14362,7 @@
           <w:lang w:val="en-US" w:eastAsia="zh-CN" w:bidi="ar"/>
         </w:rPr>
       </w:pPr>
-      <w:bookmarkStart w:id="15" w:name="_Toc9964"/>
+      <w:bookmarkStart w:id="15" w:name="_Toc20150"/>
       <w:r>
         <w:rPr>
           <w:rFonts w:hint="default" w:ascii="Times New Roman" w:hAnsi="Times New Roman" w:eastAsia="宋体" w:cs="Times New Roman"/>
@@ -14180,7 +14499,7 @@
           <w:szCs w:val="28"/>
         </w:rPr>
       </w:pPr>
-      <w:bookmarkStart w:id="16" w:name="_Toc32454"/>
+      <w:bookmarkStart w:id="16" w:name="_Toc728"/>
       <w:r>
         <w:rPr>
           <w:rFonts w:hint="default" w:ascii="Times New Roman" w:hAnsi="Times New Roman" w:eastAsia="宋体" w:cs="Times New Roman"/>
@@ -14347,7 +14666,7 @@
           <w:szCs w:val="30"/>
         </w:rPr>
       </w:pPr>
-      <w:bookmarkStart w:id="17" w:name="_Toc28599"/>
+      <w:bookmarkStart w:id="17" w:name="_Toc11264"/>
       <w:r>
         <w:rPr>
           <w:rFonts w:hint="default" w:ascii="Times New Roman" w:hAnsi="Times New Roman" w:eastAsia="宋体" w:cs="Times New Roman"/>
@@ -14397,7 +14716,7 @@
           <w:szCs w:val="28"/>
         </w:rPr>
       </w:pPr>
-      <w:bookmarkStart w:id="18" w:name="_Toc32533"/>
+      <w:bookmarkStart w:id="18" w:name="_Toc81"/>
       <w:r>
         <w:rPr>
           <w:rFonts w:hint="default" w:ascii="Times New Roman" w:hAnsi="Times New Roman" w:eastAsia="宋体" w:cs="Times New Roman"/>
@@ -14928,6 +15247,7 @@
             <w:insideH w:val="none" w:color="auto" w:sz="0" w:space="0"/>
             <w:insideV w:val="none" w:color="auto" w:sz="0" w:space="0"/>
           </w:tblBorders>
+          <w:shd w:val="clear" w:color="auto" w:fill="FFFFFF"/>
           <w:tblCellMar>
             <w:top w:w="15" w:type="dxa"/>
             <w:left w:w="15" w:type="dxa"/>
@@ -15355,6 +15675,7 @@
             <w:insideH w:val="none" w:color="auto" w:sz="0" w:space="0"/>
             <w:insideV w:val="none" w:color="auto" w:sz="0" w:space="0"/>
           </w:tblBorders>
+          <w:shd w:val="clear" w:color="auto" w:fill="FFFFFF"/>
           <w:tblCellMar>
             <w:top w:w="15" w:type="dxa"/>
             <w:left w:w="15" w:type="dxa"/>
@@ -15568,6 +15889,7 @@
             <w:insideH w:val="none" w:color="auto" w:sz="0" w:space="0"/>
             <w:insideV w:val="none" w:color="auto" w:sz="0" w:space="0"/>
           </w:tblBorders>
+          <w:shd w:val="clear" w:color="auto" w:fill="FFFFFF"/>
           <w:tblCellMar>
             <w:top w:w="15" w:type="dxa"/>
             <w:left w:w="15" w:type="dxa"/>
@@ -15781,6 +16103,7 @@
             <w:insideH w:val="none" w:color="auto" w:sz="0" w:space="0"/>
             <w:insideV w:val="none" w:color="auto" w:sz="0" w:space="0"/>
           </w:tblBorders>
+          <w:shd w:val="clear" w:color="auto" w:fill="FFFFFF"/>
           <w:tblCellMar>
             <w:top w:w="15" w:type="dxa"/>
             <w:left w:w="15" w:type="dxa"/>
@@ -16262,7 +16585,7 @@
           <w:szCs w:val="28"/>
         </w:rPr>
       </w:pPr>
-      <w:bookmarkStart w:id="19" w:name="_Toc1876"/>
+      <w:bookmarkStart w:id="19" w:name="_Toc29366"/>
       <w:r>
         <w:rPr>
           <w:rFonts w:hint="default" w:ascii="Times New Roman" w:hAnsi="Times New Roman" w:eastAsia="宋体" w:cs="Times New Roman"/>
@@ -16496,7 +16819,7 @@
           <w:szCs w:val="28"/>
         </w:rPr>
       </w:pPr>
-      <w:bookmarkStart w:id="20" w:name="_Toc29885"/>
+      <w:bookmarkStart w:id="20" w:name="_Toc29038"/>
       <w:r>
         <w:rPr>
           <w:rFonts w:hint="default" w:ascii="Times New Roman" w:hAnsi="Times New Roman" w:eastAsia="宋体" w:cs="Times New Roman"/>
@@ -16731,7 +17054,7 @@
           <w:shd w:val="clear" w:fill="FFFFFF"/>
         </w:rPr>
       </w:pPr>
-      <w:bookmarkStart w:id="21" w:name="_Toc24192"/>
+      <w:bookmarkStart w:id="21" w:name="_Toc18366"/>
       <w:r>
         <w:rPr>
           <w:rFonts w:hint="default" w:ascii="Times New Roman" w:hAnsi="Times New Roman" w:eastAsia="宋体" w:cs="Times New Roman"/>
@@ -17330,6 +17653,7 @@
             <w:insideH w:val="none" w:color="auto" w:sz="0" w:space="0"/>
             <w:insideV w:val="none" w:color="auto" w:sz="0" w:space="0"/>
           </w:tblBorders>
+          <w:shd w:val="clear" w:color="auto" w:fill="FFFFFF"/>
           <w:tblCellMar>
             <w:top w:w="15" w:type="dxa"/>
             <w:left w:w="15" w:type="dxa"/>
@@ -18090,7 +18414,7 @@
           <w:shd w:val="clear" w:fill="FFFFFF"/>
         </w:rPr>
       </w:pPr>
-      <w:bookmarkStart w:id="22" w:name="_Toc32240"/>
+      <w:bookmarkStart w:id="22" w:name="_Toc4304"/>
       <w:r>
         <w:rPr>
           <w:rFonts w:hint="default" w:ascii="Times New Roman" w:hAnsi="Times New Roman" w:eastAsia="宋体" w:cs="Times New Roman"/>
@@ -18272,7 +18596,7 @@
           <w:szCs w:val="30"/>
         </w:rPr>
       </w:pPr>
-      <w:bookmarkStart w:id="23" w:name="_Toc29028"/>
+      <w:bookmarkStart w:id="23" w:name="_Toc18245"/>
       <w:r>
         <w:rPr>
           <w:rFonts w:hint="default" w:ascii="Times New Roman" w:hAnsi="Times New Roman" w:eastAsia="宋体" w:cs="Times New Roman"/>
@@ -18322,7 +18646,7 @@
           <w:szCs w:val="28"/>
         </w:rPr>
       </w:pPr>
-      <w:bookmarkStart w:id="24" w:name="_Toc10732"/>
+      <w:bookmarkStart w:id="24" w:name="_Toc19926"/>
       <w:r>
         <w:rPr>
           <w:rFonts w:hint="default" w:ascii="Times New Roman" w:hAnsi="Times New Roman" w:eastAsia="宋体" w:cs="Times New Roman"/>
@@ -18483,7 +18807,7 @@
           <w:szCs w:val="28"/>
         </w:rPr>
       </w:pPr>
-      <w:bookmarkStart w:id="25" w:name="_Toc28443"/>
+      <w:bookmarkStart w:id="25" w:name="_Toc24454"/>
       <w:r>
         <w:rPr>
           <w:rFonts w:hint="default" w:ascii="Times New Roman" w:hAnsi="Times New Roman" w:eastAsia="宋体" w:cs="Times New Roman"/>
@@ -18692,7 +19016,7 @@
           <w:szCs w:val="28"/>
         </w:rPr>
       </w:pPr>
-      <w:bookmarkStart w:id="26" w:name="_Toc7401"/>
+      <w:bookmarkStart w:id="26" w:name="_Toc4285"/>
       <w:r>
         <w:rPr>
           <w:rFonts w:hint="default" w:ascii="Times New Roman" w:hAnsi="Times New Roman" w:eastAsia="宋体" w:cs="Times New Roman"/>
@@ -18887,7 +19211,7 @@
           <w:szCs w:val="24"/>
         </w:rPr>
       </w:pPr>
-      <w:bookmarkStart w:id="27" w:name="_Toc32347"/>
+      <w:bookmarkStart w:id="27" w:name="_Toc1778"/>
       <w:r>
         <w:rPr>
           <w:rFonts w:hint="default" w:ascii="Times New Roman" w:hAnsi="Times New Roman" w:eastAsia="宋体" w:cs="Times New Roman"/>
@@ -18937,7 +19261,7 @@
           <w:szCs w:val="28"/>
         </w:rPr>
       </w:pPr>
-      <w:bookmarkStart w:id="28" w:name="_Toc12449"/>
+      <w:bookmarkStart w:id="28" w:name="_Toc4277"/>
       <w:r>
         <w:rPr>
           <w:rFonts w:hint="default" w:ascii="Times New Roman" w:hAnsi="Times New Roman" w:eastAsia="宋体" w:cs="Times New Roman"/>
@@ -20789,7 +21113,7 @@
           <w:szCs w:val="28"/>
         </w:rPr>
       </w:pPr>
-      <w:bookmarkStart w:id="29" w:name="_Toc4203"/>
+      <w:bookmarkStart w:id="29" w:name="_Toc20596"/>
       <w:r>
         <w:rPr>
           <w:rFonts w:hint="default" w:ascii="Times New Roman" w:hAnsi="Times New Roman" w:eastAsia="宋体" w:cs="Times New Roman"/>
@@ -21462,6 +21786,7 @@
             <w:insideH w:val="none" w:color="auto" w:sz="0" w:space="0"/>
             <w:insideV w:val="none" w:color="auto" w:sz="0" w:space="0"/>
           </w:tblBorders>
+          <w:shd w:val="clear" w:color="auto" w:fill="FFFFFF"/>
           <w:tblCellMar>
             <w:top w:w="15" w:type="dxa"/>
             <w:left w:w="15" w:type="dxa"/>
@@ -21852,6 +22177,7 @@
             <w:insideH w:val="none" w:color="auto" w:sz="0" w:space="0"/>
             <w:insideV w:val="none" w:color="auto" w:sz="0" w:space="0"/>
           </w:tblBorders>
+          <w:shd w:val="clear" w:color="auto" w:fill="FFFFFF"/>
           <w:tblCellMar>
             <w:top w:w="15" w:type="dxa"/>
             <w:left w:w="15" w:type="dxa"/>
@@ -22213,6 +22539,7 @@
             <w:insideH w:val="none" w:color="auto" w:sz="0" w:space="0"/>
             <w:insideV w:val="none" w:color="auto" w:sz="0" w:space="0"/>
           </w:tblBorders>
+          <w:shd w:val="clear" w:color="auto" w:fill="FFFFFF"/>
           <w:tblCellMar>
             <w:top w:w="15" w:type="dxa"/>
             <w:left w:w="15" w:type="dxa"/>
@@ -22393,6 +22720,7 @@
             <w:insideH w:val="none" w:color="auto" w:sz="0" w:space="0"/>
             <w:insideV w:val="none" w:color="auto" w:sz="0" w:space="0"/>
           </w:tblBorders>
+          <w:shd w:val="clear" w:color="auto" w:fill="FFFFFF"/>
           <w:tblCellMar>
             <w:top w:w="15" w:type="dxa"/>
             <w:left w:w="15" w:type="dxa"/>
@@ -22631,7 +22959,7 @@
           <w:szCs w:val="28"/>
         </w:rPr>
       </w:pPr>
-      <w:bookmarkStart w:id="30" w:name="_Toc24041"/>
+      <w:bookmarkStart w:id="30" w:name="_Toc21393"/>
       <w:r>
         <w:rPr>
           <w:rFonts w:hint="default" w:ascii="Times New Roman" w:hAnsi="Times New Roman" w:eastAsia="宋体" w:cs="Times New Roman"/>
@@ -22711,7 +23039,7 @@
           <w:shd w:val="clear" w:fill="FFFFFF"/>
         </w:rPr>
       </w:pPr>
-      <w:bookmarkStart w:id="31" w:name="_Toc31951"/>
+      <w:bookmarkStart w:id="31" w:name="_Toc14045"/>
       <w:r>
         <w:rPr>
           <w:rFonts w:hint="default" w:ascii="Times New Roman" w:hAnsi="Times New Roman" w:eastAsia="宋体" w:cs="Times New Roman"/>
@@ -22958,7 +23286,7 @@
           <w:szCs w:val="24"/>
         </w:rPr>
       </w:pPr>
-      <w:bookmarkStart w:id="32" w:name="_Toc24621"/>
+      <w:bookmarkStart w:id="32" w:name="_Toc27644"/>
       <w:r>
         <w:rPr>
           <w:rFonts w:hint="default" w:ascii="Times New Roman" w:hAnsi="Times New Roman" w:eastAsia="宋体" w:cs="Times New Roman"/>
@@ -23218,7 +23546,7 @@
           <w:szCs w:val="24"/>
         </w:rPr>
       </w:pPr>
-      <w:bookmarkStart w:id="33" w:name="_Toc13137"/>
+      <w:bookmarkStart w:id="33" w:name="_Toc200"/>
       <w:r>
         <w:rPr>
           <w:rFonts w:hint="default" w:ascii="Times New Roman" w:hAnsi="Times New Roman" w:eastAsia="宋体" w:cs="Times New Roman"/>
@@ -23361,7 +23689,7 @@
           <w:lang w:val="en-US" w:eastAsia="zh-CN" w:bidi="ar"/>
         </w:rPr>
       </w:pPr>
-      <w:bookmarkStart w:id="34" w:name="_Toc18906"/>
+      <w:bookmarkStart w:id="34" w:name="_Toc29275"/>
       <w:r>
         <w:rPr>
           <w:rFonts w:hint="default" w:ascii="Times New Roman" w:hAnsi="Times New Roman" w:eastAsia="宋体" w:cs="Times New Roman"/>
@@ -23522,7 +23850,7 @@
           <w:szCs w:val="28"/>
         </w:rPr>
       </w:pPr>
-      <w:bookmarkStart w:id="35" w:name="_Toc32591"/>
+      <w:bookmarkStart w:id="35" w:name="_Toc26732"/>
       <w:r>
         <w:rPr>
           <w:rFonts w:hint="default" w:ascii="Times New Roman" w:hAnsi="Times New Roman" w:eastAsia="宋体" w:cs="Times New Roman"/>
@@ -23686,7 +24014,7 @@
           <w:shd w:val="clear" w:fill="FFFFFF"/>
         </w:rPr>
       </w:pPr>
-      <w:bookmarkStart w:id="36" w:name="_Toc14579"/>
+      <w:bookmarkStart w:id="36" w:name="_Toc21959"/>
       <w:r>
         <w:rPr>
           <w:rFonts w:hint="default" w:ascii="Times New Roman" w:hAnsi="Times New Roman" w:eastAsia="宋体" w:cs="Times New Roman"/>
@@ -23882,7 +24210,7 @@
           <w:szCs w:val="30"/>
         </w:rPr>
       </w:pPr>
-      <w:bookmarkStart w:id="37" w:name="_Toc28275"/>
+      <w:bookmarkStart w:id="37" w:name="_Toc20283"/>
       <w:r>
         <w:rPr>
           <w:rFonts w:hint="default" w:ascii="Times New Roman" w:hAnsi="Times New Roman" w:eastAsia="宋体" w:cs="Times New Roman"/>
@@ -23933,7 +24261,7 @@
           <w:shd w:val="clear" w:fill="FFFFFF"/>
         </w:rPr>
       </w:pPr>
-      <w:bookmarkStart w:id="38" w:name="_Toc5471"/>
+      <w:bookmarkStart w:id="38" w:name="_Toc19904"/>
       <w:r>
         <w:rPr>
           <w:rFonts w:hint="default" w:ascii="Times New Roman" w:hAnsi="Times New Roman" w:eastAsia="宋体" w:cs="Times New Roman"/>
@@ -24017,7 +24345,6 @@
             <w:insideH w:val="none" w:color="auto" w:sz="0" w:space="0"/>
             <w:insideV w:val="none" w:color="auto" w:sz="0" w:space="0"/>
           </w:tblBorders>
-          <w:shd w:val="clear" w:color="auto" w:fill="FFFFFF"/>
           <w:tblCellMar>
             <w:top w:w="15" w:type="dxa"/>
             <w:left w:w="15" w:type="dxa"/>
@@ -25275,7 +25602,6 @@
             <w:insideH w:val="none" w:color="auto" w:sz="0" w:space="0"/>
             <w:insideV w:val="none" w:color="auto" w:sz="0" w:space="0"/>
           </w:tblBorders>
-          <w:shd w:val="clear" w:color="auto" w:fill="FFFFFF"/>
           <w:tblCellMar>
             <w:top w:w="15" w:type="dxa"/>
             <w:left w:w="15" w:type="dxa"/>
@@ -25584,7 +25910,7 @@
           <w:szCs w:val="28"/>
         </w:rPr>
       </w:pPr>
-      <w:bookmarkStart w:id="39" w:name="_Toc15942"/>
+      <w:bookmarkStart w:id="39" w:name="_Toc17216"/>
       <w:r>
         <w:rPr>
           <w:rFonts w:hint="default" w:ascii="Times New Roman" w:hAnsi="Times New Roman" w:eastAsia="宋体" w:cs="Times New Roman"/>
@@ -25698,7 +26024,7 @@
     <w:tbl>
       <w:tblPr>
         <w:tblStyle w:val="13"/>
-        <w:tblW w:w="4727" w:type="pct"/>
+        <w:tblW w:w="4729" w:type="pct"/>
         <w:tblInd w:w="0" w:type="dxa"/>
         <w:tblBorders>
           <w:top w:val="none" w:color="auto" w:sz="0" w:space="0"/>
@@ -25720,10 +26046,10 @@
       <w:tblGrid>
         <w:gridCol w:w="567"/>
         <w:gridCol w:w="885"/>
-        <w:gridCol w:w="1046"/>
-        <w:gridCol w:w="1715"/>
+        <w:gridCol w:w="1047"/>
+        <w:gridCol w:w="1716"/>
         <w:gridCol w:w="1063"/>
-        <w:gridCol w:w="2732"/>
+        <w:gridCol w:w="2734"/>
       </w:tblGrid>
       <w:tr>
         <w:tblPrEx>
@@ -25735,7 +26061,6 @@
             <w:insideH w:val="none" w:color="auto" w:sz="0" w:space="0"/>
             <w:insideV w:val="none" w:color="auto" w:sz="0" w:space="0"/>
           </w:tblBorders>
-          <w:shd w:val="clear" w:color="auto" w:fill="FFFFFF"/>
           <w:tblCellMar>
             <w:top w:w="15" w:type="dxa"/>
             <w:left w:w="15" w:type="dxa"/>
@@ -27091,7 +27416,7 @@
                 <w:szCs w:val="18"/>
                 <w:lang w:val="en-US" w:eastAsia="zh-CN"/>
               </w:rPr>
-              <w:t>生成前可以蓄力，释放强力版</w:t>
+              <w:t>附加一段蓄力，释放强力版</w:t>
             </w:r>
           </w:p>
         </w:tc>
@@ -27106,6 +27431,7 @@
             <w:insideH w:val="none" w:color="auto" w:sz="0" w:space="0"/>
             <w:insideV w:val="none" w:color="auto" w:sz="0" w:space="0"/>
           </w:tblBorders>
+          <w:shd w:val="clear" w:color="auto" w:fill="FFFFFF"/>
           <w:tblCellMar>
             <w:top w:w="15" w:type="dxa"/>
             <w:left w:w="15" w:type="dxa"/>
@@ -27448,6 +27774,7 @@
             <w:insideH w:val="none" w:color="auto" w:sz="0" w:space="0"/>
             <w:insideV w:val="none" w:color="auto" w:sz="0" w:space="0"/>
           </w:tblBorders>
+          <w:shd w:val="clear" w:color="auto" w:fill="FFFFFF"/>
           <w:tblCellMar>
             <w:top w:w="15" w:type="dxa"/>
             <w:left w:w="15" w:type="dxa"/>
@@ -27790,6 +28117,7 @@
             <w:insideH w:val="none" w:color="auto" w:sz="0" w:space="0"/>
             <w:insideV w:val="none" w:color="auto" w:sz="0" w:space="0"/>
           </w:tblBorders>
+          <w:shd w:val="clear" w:color="auto" w:fill="FFFFFF"/>
           <w:tblCellMar>
             <w:top w:w="15" w:type="dxa"/>
             <w:left w:w="15" w:type="dxa"/>
@@ -28009,7 +28337,7 @@
                 <w:szCs w:val="18"/>
                 <w:lang w:val="en-US" w:eastAsia="zh-CN"/>
               </w:rPr>
-              <w:t>连续三次时缓突刺</w:t>
+              <w:t>连续三次突刺</w:t>
             </w:r>
           </w:p>
         </w:tc>
@@ -28472,6 +28800,7 @@
             <w:insideH w:val="none" w:color="auto" w:sz="0" w:space="0"/>
             <w:insideV w:val="none" w:color="auto" w:sz="0" w:space="0"/>
           </w:tblBorders>
+          <w:shd w:val="clear" w:color="auto" w:fill="FFFFFF"/>
           <w:tblCellMar>
             <w:top w:w="15" w:type="dxa"/>
             <w:left w:w="15" w:type="dxa"/>
@@ -28995,7 +29324,7 @@
           <w:shd w:val="clear" w:fill="FFFFFF"/>
         </w:rPr>
       </w:pPr>
-      <w:bookmarkStart w:id="40" w:name="_Toc20158"/>
+      <w:bookmarkStart w:id="40" w:name="_Toc14982"/>
       <w:r>
         <w:rPr>
           <w:rFonts w:hint="default" w:ascii="Times New Roman" w:hAnsi="Times New Roman" w:eastAsia="宋体" w:cs="Times New Roman"/>
@@ -29046,7 +29375,7 @@
           <w:shd w:val="clear" w:fill="FFFFFF"/>
         </w:rPr>
       </w:pPr>
-      <w:bookmarkStart w:id="41" w:name="_Toc3900"/>
+      <w:bookmarkStart w:id="41" w:name="_Toc3220"/>
       <w:r>
         <w:rPr>
           <w:rFonts w:hint="default" w:ascii="Times New Roman" w:hAnsi="Times New Roman" w:eastAsia="宋体" w:cs="Times New Roman"/>
@@ -29494,6 +29823,7 @@
             <w:insideH w:val="none" w:color="auto" w:sz="0" w:space="0"/>
             <w:insideV w:val="none" w:color="auto" w:sz="0" w:space="0"/>
           </w:tblBorders>
+          <w:shd w:val="clear" w:color="auto" w:fill="FFFFFF"/>
           <w:tblCellMar>
             <w:top w:w="15" w:type="dxa"/>
             <w:left w:w="15" w:type="dxa"/>
@@ -29855,7 +30185,6 @@
             <w:insideH w:val="none" w:color="auto" w:sz="0" w:space="0"/>
             <w:insideV w:val="none" w:color="auto" w:sz="0" w:space="0"/>
           </w:tblBorders>
-          <w:shd w:val="clear" w:color="auto" w:fill="FFFFFF"/>
           <w:tblCellMar>
             <w:top w:w="15" w:type="dxa"/>
             <w:left w:w="15" w:type="dxa"/>
@@ -30217,6 +30546,7 @@
             <w:insideH w:val="none" w:color="auto" w:sz="0" w:space="0"/>
             <w:insideV w:val="none" w:color="auto" w:sz="0" w:space="0"/>
           </w:tblBorders>
+          <w:shd w:val="clear" w:color="auto" w:fill="FFFFFF"/>
           <w:tblCellMar>
             <w:top w:w="15" w:type="dxa"/>
             <w:left w:w="15" w:type="dxa"/>
@@ -30397,6 +30727,7 @@
             <w:insideH w:val="none" w:color="auto" w:sz="0" w:space="0"/>
             <w:insideV w:val="none" w:color="auto" w:sz="0" w:space="0"/>
           </w:tblBorders>
+          <w:shd w:val="clear" w:color="auto" w:fill="FFFFFF"/>
           <w:tblCellMar>
             <w:top w:w="15" w:type="dxa"/>
             <w:left w:w="15" w:type="dxa"/>
@@ -30758,6 +31089,7 @@
             <w:insideH w:val="none" w:color="auto" w:sz="0" w:space="0"/>
             <w:insideV w:val="none" w:color="auto" w:sz="0" w:space="0"/>
           </w:tblBorders>
+          <w:shd w:val="clear" w:color="auto" w:fill="FFFFFF"/>
           <w:tblCellMar>
             <w:top w:w="15" w:type="dxa"/>
             <w:left w:w="15" w:type="dxa"/>
@@ -30938,6 +31270,7 @@
             <w:insideH w:val="none" w:color="auto" w:sz="0" w:space="0"/>
             <w:insideV w:val="none" w:color="auto" w:sz="0" w:space="0"/>
           </w:tblBorders>
+          <w:shd w:val="clear" w:color="auto" w:fill="FFFFFF"/>
           <w:tblCellMar>
             <w:top w:w="15" w:type="dxa"/>
             <w:left w:w="15" w:type="dxa"/>
@@ -31299,6 +31632,7 @@
             <w:insideH w:val="none" w:color="auto" w:sz="0" w:space="0"/>
             <w:insideV w:val="none" w:color="auto" w:sz="0" w:space="0"/>
           </w:tblBorders>
+          <w:shd w:val="clear" w:color="auto" w:fill="FFFFFF"/>
           <w:tblCellMar>
             <w:top w:w="15" w:type="dxa"/>
             <w:left w:w="15" w:type="dxa"/>
@@ -31479,6 +31813,7 @@
             <w:insideH w:val="none" w:color="auto" w:sz="0" w:space="0"/>
             <w:insideV w:val="none" w:color="auto" w:sz="0" w:space="0"/>
           </w:tblBorders>
+          <w:shd w:val="clear" w:color="auto" w:fill="FFFFFF"/>
           <w:tblCellMar>
             <w:top w:w="15" w:type="dxa"/>
             <w:left w:w="15" w:type="dxa"/>
@@ -31717,7 +32052,7 @@
           <w:szCs w:val="28"/>
         </w:rPr>
       </w:pPr>
-      <w:bookmarkStart w:id="42" w:name="_Toc32194"/>
+      <w:bookmarkStart w:id="42" w:name="_Toc28992"/>
       <w:r>
         <w:rPr>
           <w:rFonts w:hint="default" w:ascii="Times New Roman" w:hAnsi="Times New Roman" w:eastAsia="宋体" w:cs="Times New Roman"/>
@@ -31800,7 +32135,6 @@
             <w:insideH w:val="none" w:color="auto" w:sz="0" w:space="0"/>
             <w:insideV w:val="none" w:color="auto" w:sz="0" w:space="0"/>
           </w:tblBorders>
-          <w:shd w:val="clear" w:color="auto" w:fill="FFFFFF"/>
           <w:tblCellMar>
             <w:top w:w="15" w:type="dxa"/>
             <w:left w:w="15" w:type="dxa"/>
@@ -31984,7 +32318,6 @@
             <w:insideH w:val="none" w:color="auto" w:sz="0" w:space="0"/>
             <w:insideV w:val="none" w:color="auto" w:sz="0" w:space="0"/>
           </w:tblBorders>
-          <w:shd w:val="clear" w:color="auto" w:fill="FFFFFF"/>
           <w:tblCellMar>
             <w:top w:w="15" w:type="dxa"/>
             <w:left w:w="15" w:type="dxa"/>
@@ -32165,7 +32498,6 @@
             <w:insideH w:val="none" w:color="auto" w:sz="0" w:space="0"/>
             <w:insideV w:val="none" w:color="auto" w:sz="0" w:space="0"/>
           </w:tblBorders>
-          <w:shd w:val="clear" w:color="auto" w:fill="FFFFFF"/>
           <w:tblCellMar>
             <w:top w:w="15" w:type="dxa"/>
             <w:left w:w="15" w:type="dxa"/>
@@ -32708,7 +33040,6 @@
             <w:insideH w:val="none" w:color="auto" w:sz="0" w:space="0"/>
             <w:insideV w:val="none" w:color="auto" w:sz="0" w:space="0"/>
           </w:tblBorders>
-          <w:shd w:val="clear" w:color="auto" w:fill="FFFFFF"/>
           <w:tblCellMar>
             <w:top w:w="15" w:type="dxa"/>
             <w:left w:w="15" w:type="dxa"/>
@@ -33141,7 +33472,7 @@
           <w:shd w:val="clear" w:fill="FFFFFF"/>
         </w:rPr>
       </w:pPr>
-      <w:bookmarkStart w:id="43" w:name="_Toc20770"/>
+      <w:bookmarkStart w:id="43" w:name="_Toc27496"/>
       <w:r>
         <w:rPr>
           <w:rFonts w:hint="default" w:ascii="Times New Roman" w:hAnsi="Times New Roman" w:eastAsia="宋体" w:cs="Times New Roman"/>
@@ -33191,7 +33522,7 @@
           <w:szCs w:val="28"/>
         </w:rPr>
       </w:pPr>
-      <w:bookmarkStart w:id="44" w:name="_Toc11608"/>
+      <w:bookmarkStart w:id="44" w:name="_Toc6746"/>
       <w:r>
         <w:rPr>
           <w:rFonts w:hint="default" w:ascii="Times New Roman" w:hAnsi="Times New Roman" w:eastAsia="宋体" w:cs="Times New Roman"/>
@@ -33546,6 +33877,7 @@
             <w:insideH w:val="none" w:color="auto" w:sz="0" w:space="0"/>
             <w:insideV w:val="none" w:color="auto" w:sz="0" w:space="0"/>
           </w:tblBorders>
+          <w:shd w:val="clear" w:color="auto" w:fill="FFFFFF"/>
           <w:tblCellMar>
             <w:top w:w="15" w:type="dxa"/>
             <w:left w:w="15" w:type="dxa"/>
@@ -33950,6 +34282,7 @@
             <w:insideH w:val="none" w:color="auto" w:sz="0" w:space="0"/>
             <w:insideV w:val="none" w:color="auto" w:sz="0" w:space="0"/>
           </w:tblBorders>
+          <w:shd w:val="clear" w:color="auto" w:fill="FFFFFF"/>
           <w:tblCellMar>
             <w:top w:w="15" w:type="dxa"/>
             <w:left w:w="15" w:type="dxa"/>
@@ -34084,6 +34417,7 @@
             <w:insideH w:val="none" w:color="auto" w:sz="0" w:space="0"/>
             <w:insideV w:val="none" w:color="auto" w:sz="0" w:space="0"/>
           </w:tblBorders>
+          <w:shd w:val="clear" w:color="auto" w:fill="FFFFFF"/>
           <w:tblCellMar>
             <w:top w:w="15" w:type="dxa"/>
             <w:left w:w="15" w:type="dxa"/>
@@ -34218,6 +34552,7 @@
             <w:insideH w:val="none" w:color="auto" w:sz="0" w:space="0"/>
             <w:insideV w:val="none" w:color="auto" w:sz="0" w:space="0"/>
           </w:tblBorders>
+          <w:shd w:val="clear" w:color="auto" w:fill="FFFFFF"/>
           <w:tblCellMar>
             <w:top w:w="15" w:type="dxa"/>
             <w:left w:w="15" w:type="dxa"/>
@@ -35027,6 +35362,7 @@
             <w:insideH w:val="none" w:color="auto" w:sz="0" w:space="0"/>
             <w:insideV w:val="none" w:color="auto" w:sz="0" w:space="0"/>
           </w:tblBorders>
+          <w:shd w:val="clear" w:color="auto" w:fill="FFFFFF"/>
           <w:tblCellMar>
             <w:top w:w="15" w:type="dxa"/>
             <w:left w:w="15" w:type="dxa"/>
@@ -35210,7 +35546,7 @@
           <w:szCs w:val="28"/>
         </w:rPr>
       </w:pPr>
-      <w:bookmarkStart w:id="45" w:name="_Toc15396"/>
+      <w:bookmarkStart w:id="45" w:name="_Toc13174"/>
       <w:r>
         <w:rPr>
           <w:rFonts w:hint="default" w:ascii="Times New Roman" w:hAnsi="Times New Roman" w:eastAsia="宋体" w:cs="Times New Roman"/>
@@ -35305,7 +35641,7 @@
           <w:lang w:val="en-US"/>
         </w:rPr>
       </w:pPr>
-      <w:bookmarkStart w:id="46" w:name="_Toc29230"/>
+      <w:bookmarkStart w:id="46" w:name="_Toc15291"/>
       <w:r>
         <w:rPr>
           <w:rFonts w:hint="eastAsia" w:ascii="Times New Roman" w:hAnsi="Times New Roman" w:cs="Times New Roman"/>
@@ -35525,7 +35861,7 @@
           <w:lang w:val="en-US" w:eastAsia="zh-CN"/>
         </w:rPr>
       </w:pPr>
-      <w:bookmarkStart w:id="47" w:name="_Toc694"/>
+      <w:bookmarkStart w:id="47" w:name="_Toc6100"/>
       <w:r>
         <w:rPr>
           <w:rFonts w:hint="eastAsia" w:ascii="Times New Roman" w:hAnsi="Times New Roman" w:cs="Times New Roman"/>
@@ -35733,7 +36069,7 @@
           <w:lang w:val="en-US" w:eastAsia="zh-CN"/>
         </w:rPr>
       </w:pPr>
-      <w:bookmarkStart w:id="48" w:name="_Toc27480"/>
+      <w:bookmarkStart w:id="48" w:name="_Toc5570"/>
       <w:r>
         <w:rPr>
           <w:rFonts w:hint="eastAsia" w:ascii="Times New Roman" w:hAnsi="Times New Roman" w:cs="Times New Roman"/>
@@ -35939,7 +36275,7 @@
           <w:lang w:val="en-US"/>
         </w:rPr>
       </w:pPr>
-      <w:bookmarkStart w:id="49" w:name="_Toc3121"/>
+      <w:bookmarkStart w:id="49" w:name="_Toc21116"/>
       <w:r>
         <w:rPr>
           <w:rFonts w:hint="default" w:ascii="Times New Roman" w:hAnsi="Times New Roman" w:eastAsia="宋体" w:cs="Times New Roman"/>
@@ -36068,7 +36404,7 @@
           <w:lang w:val="en-US"/>
         </w:rPr>
       </w:pPr>
-      <w:bookmarkStart w:id="50" w:name="_Toc23838"/>
+      <w:bookmarkStart w:id="50" w:name="_Toc28979"/>
       <w:r>
         <w:rPr>
           <w:rFonts w:hint="default" w:ascii="Times New Roman" w:hAnsi="Times New Roman" w:eastAsia="宋体" w:cs="Times New Roman"/>
@@ -36193,7 +36529,7 @@
           <w:lang w:val="en-US"/>
         </w:rPr>
       </w:pPr>
-      <w:bookmarkStart w:id="51" w:name="_Toc17629"/>
+      <w:bookmarkStart w:id="51" w:name="_Toc27916"/>
       <w:r>
         <w:rPr>
           <w:rFonts w:hint="default" w:ascii="Times New Roman" w:hAnsi="Times New Roman" w:eastAsia="宋体" w:cs="Times New Roman"/>
@@ -36313,7 +36649,7 @@
           <w:lang w:val="en-US"/>
         </w:rPr>
       </w:pPr>
-      <w:bookmarkStart w:id="52" w:name="_Toc24379"/>
+      <w:bookmarkStart w:id="52" w:name="_Toc11638"/>
       <w:r>
         <w:rPr>
           <w:rFonts w:hint="default" w:ascii="Times New Roman" w:hAnsi="Times New Roman" w:eastAsia="宋体" w:cs="Times New Roman"/>
@@ -36426,6 +36762,598 @@
           <w:lang w:val="en-US" w:eastAsia="zh-CN"/>
         </w:rPr>
       </w:pPr>
+    </w:p>
+    <w:p>
+      <w:pPr>
+        <w:pStyle w:val="3"/>
+        <w:keepNext w:val="0"/>
+        <w:keepLines w:val="0"/>
+        <w:pageBreakBefore w:val="0"/>
+        <w:widowControl/>
+        <w:suppressLineNumbers w:val="0"/>
+        <w:shd w:val="clear" w:fill="FFFFFF"/>
+        <w:kinsoku/>
+        <w:wordWrap w:val="0"/>
+        <w:overflowPunct/>
+        <w:topLinePunct w:val="0"/>
+        <w:autoSpaceDE/>
+        <w:autoSpaceDN/>
+        <w:bidi w:val="0"/>
+        <w:adjustRightInd/>
+        <w:snapToGrid/>
+        <w:spacing w:before="0" w:beforeAutospacing="0" w:after="0" w:afterAutospacing="0" w:line="240" w:lineRule="auto"/>
+        <w:ind w:left="0" w:right="0" w:firstLine="0"/>
+        <w:textAlignment w:val="auto"/>
+        <w:outlineLvl w:val="1"/>
+        <w:rPr>
+          <w:rFonts w:hint="eastAsia" w:ascii="Times New Roman" w:hAnsi="Times New Roman" w:eastAsia="宋体" w:cs="Times New Roman"/>
+          <w:b/>
+          <w:bCs/>
+          <w:caps w:val="0"/>
+          <w:color w:val="0F1115"/>
+          <w:spacing w:val="0"/>
+          <w:sz w:val="28"/>
+          <w:szCs w:val="28"/>
+          <w:lang w:val="en-US" w:eastAsia="zh-CN"/>
+        </w:rPr>
+      </w:pPr>
+      <w:bookmarkStart w:id="53" w:name="_Toc23688"/>
+      <w:r>
+        <w:rPr>
+          <w:rFonts w:hint="default" w:ascii="Times New Roman" w:hAnsi="Times New Roman" w:eastAsia="宋体" w:cs="Times New Roman"/>
+          <w:b/>
+          <w:bCs/>
+          <w:caps w:val="0"/>
+          <w:color w:val="0F1115"/>
+          <w:spacing w:val="0"/>
+          <w:sz w:val="28"/>
+          <w:szCs w:val="28"/>
+          <w:shd w:val="clear" w:fill="FFFFFF"/>
+        </w:rPr>
+        <w:t>8.</w:t>
+      </w:r>
+      <w:r>
+        <w:rPr>
+          <w:rFonts w:hint="eastAsia" w:ascii="Times New Roman" w:hAnsi="Times New Roman" w:cs="Times New Roman"/>
+          <w:b/>
+          <w:bCs/>
+          <w:caps w:val="0"/>
+          <w:color w:val="0F1115"/>
+          <w:spacing w:val="0"/>
+          <w:sz w:val="28"/>
+          <w:szCs w:val="28"/>
+          <w:shd w:val="clear" w:fill="FFFFFF"/>
+          <w:lang w:val="en-US" w:eastAsia="zh-CN"/>
+        </w:rPr>
+        <w:t>3</w:t>
+      </w:r>
+      <w:r>
+        <w:rPr>
+          <w:rFonts w:hint="default" w:ascii="Times New Roman" w:hAnsi="Times New Roman" w:eastAsia="宋体" w:cs="Times New Roman"/>
+          <w:b/>
+          <w:bCs/>
+          <w:caps w:val="0"/>
+          <w:color w:val="0F1115"/>
+          <w:spacing w:val="0"/>
+          <w:sz w:val="28"/>
+          <w:szCs w:val="28"/>
+          <w:shd w:val="clear" w:fill="FFFFFF"/>
+          <w:lang w:val="en-US" w:eastAsia="zh-CN"/>
+        </w:rPr>
+        <w:t>.</w:t>
+      </w:r>
+      <w:r>
+        <w:rPr>
+          <w:rFonts w:hint="default" w:ascii="Times New Roman" w:hAnsi="Times New Roman" w:eastAsia="宋体" w:cs="Times New Roman"/>
+          <w:b/>
+          <w:bCs/>
+          <w:caps w:val="0"/>
+          <w:color w:val="0F1115"/>
+          <w:spacing w:val="0"/>
+          <w:sz w:val="28"/>
+          <w:szCs w:val="28"/>
+          <w:shd w:val="clear" w:fill="FFFFFF"/>
+        </w:rPr>
+        <w:t>问题修复</w:t>
+      </w:r>
+      <w:r>
+        <w:rPr>
+          <w:rFonts w:hint="eastAsia" w:ascii="Times New Roman" w:hAnsi="Times New Roman" w:cs="Times New Roman"/>
+          <w:b/>
+          <w:bCs/>
+          <w:caps w:val="0"/>
+          <w:color w:val="0F1115"/>
+          <w:spacing w:val="0"/>
+          <w:sz w:val="28"/>
+          <w:szCs w:val="28"/>
+          <w:shd w:val="clear" w:fill="FFFFFF"/>
+          <w:lang w:val="en-US" w:eastAsia="zh-CN"/>
+        </w:rPr>
+        <w:t>记录</w:t>
+      </w:r>
+      <w:bookmarkEnd w:id="53"/>
+    </w:p>
+    <w:p>
+      <w:pPr>
+        <w:pStyle w:val="4"/>
+        <w:keepNext w:val="0"/>
+        <w:keepLines w:val="0"/>
+        <w:pageBreakBefore w:val="0"/>
+        <w:widowControl/>
+        <w:suppressLineNumbers w:val="0"/>
+        <w:shd w:val="clear" w:fill="FFFFFF"/>
+        <w:kinsoku/>
+        <w:wordWrap w:val="0"/>
+        <w:overflowPunct/>
+        <w:topLinePunct w:val="0"/>
+        <w:autoSpaceDE/>
+        <w:autoSpaceDN/>
+        <w:bidi w:val="0"/>
+        <w:adjustRightInd/>
+        <w:snapToGrid/>
+        <w:spacing w:before="0" w:beforeAutospacing="0" w:after="0" w:afterAutospacing="0" w:line="240" w:lineRule="auto"/>
+        <w:ind w:left="0" w:right="0" w:firstLine="0"/>
+        <w:textAlignment w:val="auto"/>
+        <w:outlineLvl w:val="2"/>
+        <w:rPr>
+          <w:rFonts w:hint="default" w:ascii="Times New Roman" w:hAnsi="Times New Roman" w:eastAsia="宋体" w:cs="Times New Roman"/>
+          <w:b w:val="0"/>
+          <w:bCs w:val="0"/>
+          <w:caps w:val="0"/>
+          <w:color w:val="0F1115"/>
+          <w:spacing w:val="0"/>
+          <w:sz w:val="24"/>
+          <w:szCs w:val="24"/>
+          <w:lang w:val="en-US"/>
+        </w:rPr>
+      </w:pPr>
+      <w:bookmarkStart w:id="54" w:name="_Toc6611"/>
+      <w:r>
+        <w:rPr>
+          <w:rFonts w:hint="eastAsia" w:ascii="Times New Roman" w:hAnsi="Times New Roman" w:cs="Times New Roman"/>
+          <w:b/>
+          <w:bCs/>
+          <w:caps w:val="0"/>
+          <w:color w:val="0F1115"/>
+          <w:spacing w:val="0"/>
+          <w:sz w:val="24"/>
+          <w:szCs w:val="24"/>
+          <w:shd w:val="clear" w:fill="FFFFFF"/>
+          <w:lang w:val="en-US" w:eastAsia="zh-CN"/>
+        </w:rPr>
+        <w:t>8</w:t>
+      </w:r>
+      <w:r>
+        <w:rPr>
+          <w:rFonts w:hint="default" w:ascii="Times New Roman" w:hAnsi="Times New Roman" w:eastAsia="宋体" w:cs="Times New Roman"/>
+          <w:b/>
+          <w:bCs/>
+          <w:caps w:val="0"/>
+          <w:color w:val="0F1115"/>
+          <w:spacing w:val="0"/>
+          <w:sz w:val="24"/>
+          <w:szCs w:val="24"/>
+          <w:shd w:val="clear" w:fill="FFFFFF"/>
+        </w:rPr>
+        <w:t>.</w:t>
+      </w:r>
+      <w:r>
+        <w:rPr>
+          <w:rFonts w:hint="eastAsia" w:ascii="Times New Roman" w:hAnsi="Times New Roman" w:cs="Times New Roman"/>
+          <w:b/>
+          <w:bCs/>
+          <w:caps w:val="0"/>
+          <w:color w:val="0F1115"/>
+          <w:spacing w:val="0"/>
+          <w:sz w:val="24"/>
+          <w:szCs w:val="24"/>
+          <w:shd w:val="clear" w:fill="FFFFFF"/>
+          <w:lang w:val="en-US" w:eastAsia="zh-CN"/>
+        </w:rPr>
+        <w:t>3</w:t>
+      </w:r>
+      <w:r>
+        <w:rPr>
+          <w:rFonts w:hint="default" w:ascii="Times New Roman" w:hAnsi="Times New Roman" w:eastAsia="宋体" w:cs="Times New Roman"/>
+          <w:b/>
+          <w:bCs/>
+          <w:caps w:val="0"/>
+          <w:color w:val="0F1115"/>
+          <w:spacing w:val="0"/>
+          <w:sz w:val="24"/>
+          <w:szCs w:val="24"/>
+          <w:shd w:val="clear" w:fill="FFFFFF"/>
+        </w:rPr>
+        <w:t>.</w:t>
+      </w:r>
+      <w:r>
+        <w:rPr>
+          <w:rFonts w:hint="eastAsia" w:ascii="Times New Roman" w:hAnsi="Times New Roman" w:cs="Times New Roman"/>
+          <w:b/>
+          <w:bCs/>
+          <w:caps w:val="0"/>
+          <w:color w:val="0F1115"/>
+          <w:spacing w:val="0"/>
+          <w:sz w:val="24"/>
+          <w:szCs w:val="24"/>
+          <w:shd w:val="clear" w:fill="FFFFFF"/>
+          <w:lang w:val="en-US" w:eastAsia="zh-CN"/>
+        </w:rPr>
+        <w:t>1</w:t>
+      </w:r>
+      <w:r>
+        <w:rPr>
+          <w:rFonts w:hint="default" w:ascii="Times New Roman" w:hAnsi="Times New Roman" w:eastAsia="宋体" w:cs="Times New Roman"/>
+          <w:b/>
+          <w:bCs/>
+          <w:caps w:val="0"/>
+          <w:color w:val="0F1115"/>
+          <w:spacing w:val="0"/>
+          <w:sz w:val="24"/>
+          <w:szCs w:val="24"/>
+          <w:shd w:val="clear" w:fill="FFFFFF"/>
+          <w:lang w:val="en-US" w:eastAsia="zh-CN"/>
+        </w:rPr>
+        <w:t>.</w:t>
+      </w:r>
+      <w:r>
+        <w:rPr>
+          <w:rFonts w:hint="eastAsia" w:ascii="Times New Roman" w:hAnsi="Times New Roman" w:cs="Times New Roman"/>
+          <w:b/>
+          <w:bCs/>
+          <w:caps w:val="0"/>
+          <w:color w:val="0F1115"/>
+          <w:spacing w:val="0"/>
+          <w:sz w:val="24"/>
+          <w:szCs w:val="24"/>
+          <w:shd w:val="clear" w:fill="FFFFFF"/>
+          <w:lang w:val="en-US" w:eastAsia="zh-CN"/>
+        </w:rPr>
+        <w:t>AbilityTask 激活与清理问题</w:t>
+      </w:r>
+      <w:bookmarkEnd w:id="54"/>
+    </w:p>
+    <w:p>
+      <w:pPr>
+        <w:keepNext w:val="0"/>
+        <w:keepLines w:val="0"/>
+        <w:pageBreakBefore w:val="0"/>
+        <w:widowControl/>
+        <w:suppressLineNumbers w:val="0"/>
+        <w:shd w:val="clear" w:fill="FFFFFF"/>
+        <w:kinsoku/>
+        <w:wordWrap w:val="0"/>
+        <w:overflowPunct/>
+        <w:topLinePunct w:val="0"/>
+        <w:autoSpaceDE/>
+        <w:autoSpaceDN/>
+        <w:bidi w:val="0"/>
+        <w:adjustRightInd/>
+        <w:snapToGrid/>
+        <w:spacing w:before="0" w:beforeAutospacing="0" w:after="0" w:afterAutospacing="0" w:line="240" w:lineRule="auto"/>
+        <w:ind w:left="0" w:right="0" w:firstLine="420" w:firstLineChars="0"/>
+        <w:textAlignment w:val="auto"/>
+        <w:outlineLvl w:val="9"/>
+        <w:rPr>
+          <w:rFonts w:hint="default" w:ascii="Times New Roman" w:hAnsi="Times New Roman" w:eastAsia="宋体" w:cs="Times New Roman"/>
+          <w:b w:val="0"/>
+          <w:bCs w:val="0"/>
+          <w:caps w:val="0"/>
+          <w:color w:val="0F1115"/>
+          <w:spacing w:val="0"/>
+          <w:sz w:val="24"/>
+          <w:szCs w:val="24"/>
+        </w:rPr>
+      </w:pPr>
+      <w:r>
+        <w:rPr>
+          <w:rFonts w:hint="default" w:ascii="Times New Roman" w:hAnsi="Times New Roman" w:eastAsia="宋体" w:cs="Times New Roman"/>
+          <w:b w:val="0"/>
+          <w:bCs w:val="0"/>
+          <w:caps w:val="0"/>
+          <w:color w:val="0F1115"/>
+          <w:spacing w:val="0"/>
+          <w:sz w:val="24"/>
+          <w:szCs w:val="24"/>
+        </w:rPr>
+        <w:t>在开发过程中，C++ 中创建的 AbilityTask 在技能结束后没有被正确清理，导致内存残留和意外回调触发。该问题主要由 AbilityTask 的激活方式引起，具体描述如下：</w:t>
+      </w:r>
+    </w:p>
+    <w:p>
+      <w:pPr>
+        <w:keepNext w:val="0"/>
+        <w:keepLines w:val="0"/>
+        <w:pageBreakBefore w:val="0"/>
+        <w:widowControl/>
+        <w:suppressLineNumbers w:val="0"/>
+        <w:shd w:val="clear" w:fill="FFFFFF"/>
+        <w:kinsoku/>
+        <w:wordWrap w:val="0"/>
+        <w:overflowPunct/>
+        <w:topLinePunct w:val="0"/>
+        <w:autoSpaceDE/>
+        <w:autoSpaceDN/>
+        <w:bidi w:val="0"/>
+        <w:adjustRightInd/>
+        <w:snapToGrid/>
+        <w:spacing w:before="0" w:beforeAutospacing="0" w:after="0" w:afterAutospacing="0" w:line="240" w:lineRule="auto"/>
+        <w:ind w:left="0" w:right="0" w:firstLine="420" w:firstLineChars="0"/>
+        <w:textAlignment w:val="auto"/>
+        <w:outlineLvl w:val="9"/>
+        <w:rPr>
+          <w:rFonts w:hint="default" w:ascii="Times New Roman" w:hAnsi="Times New Roman" w:eastAsia="宋体" w:cs="Times New Roman"/>
+          <w:b w:val="0"/>
+          <w:bCs w:val="0"/>
+          <w:caps w:val="0"/>
+          <w:color w:val="0F1115"/>
+          <w:spacing w:val="0"/>
+          <w:sz w:val="24"/>
+          <w:szCs w:val="24"/>
+        </w:rPr>
+      </w:pPr>
+      <w:r>
+        <w:rPr>
+          <w:rFonts w:hint="default" w:ascii="Times New Roman" w:hAnsi="Times New Roman" w:eastAsia="宋体" w:cs="Times New Roman"/>
+          <w:b w:val="0"/>
+          <w:bCs w:val="0"/>
+          <w:caps w:val="0"/>
+          <w:color w:val="0F1115"/>
+          <w:spacing w:val="0"/>
+          <w:sz w:val="24"/>
+          <w:szCs w:val="24"/>
+        </w:rPr>
+        <w:t>UGameplayAbility 通过 ActiveTasks 数组管理所有关联的 AbilityTask。当技能结束时，EndAbility 会遍历该数组并清理所有任务。AbilityTask 的正确激活流程分为两步：先将自身注册到 ActiveTasks 数组，再执行内部逻辑。在 C++ 中，ReadyForActivation() 函数封装了这一完整流程，而 Activate() 仅执行内部逻辑，不负责注册。开发初期，在 CreateWaitGameplayEventTask 和 CreatePlayMontageAndWaitTask 等工厂函数中直接调用了 Task-&gt;Activate()，而非 ReadyForActivation()。这导致创建的 AbilityTask 虽然内部逻辑正常运行，但未被添加到 ActiveTasks 数组中。当技能结束时，EndAbility 遍历 ActiveTasks 数组找不到该任务，跳过了清理步骤，造成任务残留。正确做法是统一使用 ReadyForActivation() 激活所有 AbilityTask。修正后的写法如下：创建 Task 后先判断有效性，再调用 ReadyForActivation()，将注册和激活合并为一步完成。修正后，EndAbility 能够正常清理所有任务，不再需要额外的 ManagedTasks 数组或手动清理逻辑。在开发的其他模块中，凡是涉及 C++ 创建 AbilityTask 的地方，统一遵循此规范。</w:t>
+      </w:r>
+    </w:p>
+    <w:p>
+      <w:pPr>
+        <w:keepNext w:val="0"/>
+        <w:keepLines w:val="0"/>
+        <w:pageBreakBefore w:val="0"/>
+        <w:widowControl/>
+        <w:suppressLineNumbers w:val="0"/>
+        <w:shd w:val="clear" w:fill="FFFFFF"/>
+        <w:kinsoku/>
+        <w:wordWrap w:val="0"/>
+        <w:overflowPunct/>
+        <w:topLinePunct w:val="0"/>
+        <w:autoSpaceDE/>
+        <w:autoSpaceDN/>
+        <w:bidi w:val="0"/>
+        <w:adjustRightInd/>
+        <w:snapToGrid/>
+        <w:spacing w:before="0" w:beforeAutospacing="0" w:after="0" w:afterAutospacing="0" w:line="240" w:lineRule="auto"/>
+        <w:ind w:left="0" w:right="0" w:firstLine="420" w:firstLineChars="0"/>
+        <w:textAlignment w:val="auto"/>
+        <w:outlineLvl w:val="9"/>
+        <w:rPr>
+          <w:rFonts w:hint="default" w:ascii="Times New Roman" w:hAnsi="Times New Roman" w:eastAsia="宋体" w:cs="Times New Roman"/>
+          <w:b w:val="0"/>
+          <w:bCs w:val="0"/>
+          <w:caps w:val="0"/>
+          <w:color w:val="0F1115"/>
+          <w:spacing w:val="0"/>
+          <w:sz w:val="24"/>
+          <w:szCs w:val="24"/>
+        </w:rPr>
+      </w:pPr>
+    </w:p>
+    <w:p>
+      <w:pPr>
+        <w:pStyle w:val="4"/>
+        <w:keepNext w:val="0"/>
+        <w:keepLines w:val="0"/>
+        <w:pageBreakBefore w:val="0"/>
+        <w:widowControl/>
+        <w:suppressLineNumbers w:val="0"/>
+        <w:shd w:val="clear" w:fill="FFFFFF"/>
+        <w:kinsoku/>
+        <w:wordWrap w:val="0"/>
+        <w:overflowPunct/>
+        <w:topLinePunct w:val="0"/>
+        <w:autoSpaceDE/>
+        <w:autoSpaceDN/>
+        <w:bidi w:val="0"/>
+        <w:adjustRightInd/>
+        <w:snapToGrid/>
+        <w:spacing w:before="0" w:beforeAutospacing="0" w:after="0" w:afterAutospacing="0" w:line="240" w:lineRule="auto"/>
+        <w:ind w:left="0" w:right="0" w:firstLine="0"/>
+        <w:textAlignment w:val="auto"/>
+        <w:outlineLvl w:val="2"/>
+        <w:rPr>
+          <w:rFonts w:hint="default" w:ascii="Times New Roman" w:hAnsi="Times New Roman" w:eastAsia="宋体" w:cs="Times New Roman"/>
+          <w:b/>
+          <w:bCs/>
+          <w:caps w:val="0"/>
+          <w:color w:val="0F1115"/>
+          <w:spacing w:val="0"/>
+          <w:sz w:val="24"/>
+          <w:szCs w:val="24"/>
+          <w:shd w:val="clear" w:fill="FFFFFF"/>
+          <w:lang w:val="en-US" w:eastAsia="zh-CN"/>
+        </w:rPr>
+      </w:pPr>
+      <w:bookmarkStart w:id="55" w:name="_Toc28706"/>
+      <w:r>
+        <w:rPr>
+          <w:rFonts w:hint="eastAsia" w:ascii="Times New Roman" w:hAnsi="Times New Roman" w:cs="Times New Roman"/>
+          <w:b/>
+          <w:bCs/>
+          <w:caps w:val="0"/>
+          <w:color w:val="0F1115"/>
+          <w:spacing w:val="0"/>
+          <w:sz w:val="24"/>
+          <w:szCs w:val="24"/>
+          <w:shd w:val="clear" w:fill="FFFFFF"/>
+          <w:lang w:val="en-US" w:eastAsia="zh-CN"/>
+        </w:rPr>
+        <w:t>8</w:t>
+      </w:r>
+      <w:r>
+        <w:rPr>
+          <w:rFonts w:hint="default" w:ascii="Times New Roman" w:hAnsi="Times New Roman" w:eastAsia="宋体" w:cs="Times New Roman"/>
+          <w:b/>
+          <w:bCs/>
+          <w:caps w:val="0"/>
+          <w:color w:val="0F1115"/>
+          <w:spacing w:val="0"/>
+          <w:sz w:val="24"/>
+          <w:szCs w:val="24"/>
+          <w:shd w:val="clear" w:fill="FFFFFF"/>
+        </w:rPr>
+        <w:t>.</w:t>
+      </w:r>
+      <w:r>
+        <w:rPr>
+          <w:rFonts w:hint="eastAsia" w:ascii="Times New Roman" w:hAnsi="Times New Roman" w:cs="Times New Roman"/>
+          <w:b/>
+          <w:bCs/>
+          <w:caps w:val="0"/>
+          <w:color w:val="0F1115"/>
+          <w:spacing w:val="0"/>
+          <w:sz w:val="24"/>
+          <w:szCs w:val="24"/>
+          <w:shd w:val="clear" w:fill="FFFFFF"/>
+          <w:lang w:val="en-US" w:eastAsia="zh-CN"/>
+        </w:rPr>
+        <w:t>3</w:t>
+      </w:r>
+      <w:r>
+        <w:rPr>
+          <w:rFonts w:hint="default" w:ascii="Times New Roman" w:hAnsi="Times New Roman" w:eastAsia="宋体" w:cs="Times New Roman"/>
+          <w:b/>
+          <w:bCs/>
+          <w:caps w:val="0"/>
+          <w:color w:val="0F1115"/>
+          <w:spacing w:val="0"/>
+          <w:sz w:val="24"/>
+          <w:szCs w:val="24"/>
+          <w:shd w:val="clear" w:fill="FFFFFF"/>
+        </w:rPr>
+        <w:t>.</w:t>
+      </w:r>
+      <w:r>
+        <w:rPr>
+          <w:rFonts w:hint="eastAsia" w:ascii="Times New Roman" w:hAnsi="Times New Roman" w:cs="Times New Roman"/>
+          <w:b/>
+          <w:bCs/>
+          <w:caps w:val="0"/>
+          <w:color w:val="0F1115"/>
+          <w:spacing w:val="0"/>
+          <w:sz w:val="24"/>
+          <w:szCs w:val="24"/>
+          <w:shd w:val="clear" w:fill="FFFFFF"/>
+          <w:lang w:val="en-US" w:eastAsia="zh-CN"/>
+        </w:rPr>
+        <w:t>2</w:t>
+      </w:r>
+      <w:r>
+        <w:rPr>
+          <w:rFonts w:hint="default" w:ascii="Times New Roman" w:hAnsi="Times New Roman" w:eastAsia="宋体" w:cs="Times New Roman"/>
+          <w:b/>
+          <w:bCs/>
+          <w:caps w:val="0"/>
+          <w:color w:val="0F1115"/>
+          <w:spacing w:val="0"/>
+          <w:sz w:val="24"/>
+          <w:szCs w:val="24"/>
+          <w:shd w:val="clear" w:fill="FFFFFF"/>
+          <w:lang w:val="en-US" w:eastAsia="zh-CN"/>
+        </w:rPr>
+        <w:t>.第一次播放蓄力蒙太奇无动画</w:t>
+      </w:r>
+      <w:bookmarkEnd w:id="55"/>
+    </w:p>
+    <w:p>
+      <w:pPr>
+        <w:keepNext w:val="0"/>
+        <w:keepLines w:val="0"/>
+        <w:pageBreakBefore w:val="0"/>
+        <w:widowControl/>
+        <w:suppressLineNumbers w:val="0"/>
+        <w:shd w:val="clear" w:fill="FFFFFF"/>
+        <w:kinsoku/>
+        <w:wordWrap w:val="0"/>
+        <w:overflowPunct/>
+        <w:topLinePunct w:val="0"/>
+        <w:autoSpaceDE/>
+        <w:autoSpaceDN/>
+        <w:bidi w:val="0"/>
+        <w:adjustRightInd/>
+        <w:snapToGrid/>
+        <w:spacing w:before="0" w:beforeAutospacing="0" w:after="0" w:afterAutospacing="0" w:line="240" w:lineRule="auto"/>
+        <w:ind w:left="0" w:right="0" w:firstLine="420" w:firstLineChars="0"/>
+        <w:textAlignment w:val="auto"/>
+        <w:outlineLvl w:val="9"/>
+        <w:rPr>
+          <w:rFonts w:hint="default" w:ascii="Times New Roman" w:hAnsi="Times New Roman" w:eastAsia="宋体" w:cs="Times New Roman"/>
+          <w:b w:val="0"/>
+          <w:bCs w:val="0"/>
+          <w:caps w:val="0"/>
+          <w:color w:val="0F1115"/>
+          <w:spacing w:val="0"/>
+          <w:sz w:val="24"/>
+          <w:szCs w:val="24"/>
+          <w:lang w:val="en-US"/>
+        </w:rPr>
+      </w:pPr>
+      <w:r>
+        <w:rPr>
+          <w:rFonts w:hint="default" w:ascii="Times New Roman" w:hAnsi="Times New Roman" w:eastAsia="宋体" w:cs="Times New Roman"/>
+          <w:b w:val="0"/>
+          <w:bCs w:val="0"/>
+          <w:caps w:val="0"/>
+          <w:color w:val="0F1115"/>
+          <w:spacing w:val="0"/>
+          <w:sz w:val="24"/>
+          <w:szCs w:val="24"/>
+          <w:lang w:val="en-US"/>
+        </w:rPr>
+        <w:t>在实现蓄力系统时，首次触发蓄力时角色无任何动画表现，蒙太奇未被播放，第二次及之后触发则正常播放。该问题仅在打包后的独立游戏中出现，开发环境中不易复现。</w:t>
+      </w:r>
+    </w:p>
+    <w:p>
+      <w:pPr>
+        <w:keepNext w:val="0"/>
+        <w:keepLines w:val="0"/>
+        <w:pageBreakBefore w:val="0"/>
+        <w:widowControl/>
+        <w:suppressLineNumbers w:val="0"/>
+        <w:shd w:val="clear" w:fill="FFFFFF"/>
+        <w:kinsoku/>
+        <w:wordWrap w:val="0"/>
+        <w:overflowPunct/>
+        <w:topLinePunct w:val="0"/>
+        <w:autoSpaceDE/>
+        <w:autoSpaceDN/>
+        <w:bidi w:val="0"/>
+        <w:adjustRightInd/>
+        <w:snapToGrid/>
+        <w:spacing w:before="0" w:beforeAutospacing="0" w:after="0" w:afterAutospacing="0" w:line="240" w:lineRule="auto"/>
+        <w:ind w:left="0" w:right="0" w:firstLine="420" w:firstLineChars="0"/>
+        <w:textAlignment w:val="auto"/>
+        <w:outlineLvl w:val="9"/>
+        <w:rPr>
+          <w:rFonts w:hint="eastAsia" w:ascii="Times New Roman" w:hAnsi="Times New Roman" w:eastAsia="宋体" w:cs="Times New Roman"/>
+          <w:sz w:val="24"/>
+          <w:szCs w:val="24"/>
+          <w:lang w:val="en-US" w:eastAsia="zh-CN"/>
+        </w:rPr>
+      </w:pPr>
+      <w:r>
+        <w:rPr>
+          <w:rFonts w:hint="default" w:ascii="Times New Roman" w:hAnsi="Times New Roman" w:eastAsia="宋体" w:cs="Times New Roman"/>
+          <w:b w:val="0"/>
+          <w:bCs w:val="0"/>
+          <w:caps w:val="0"/>
+          <w:color w:val="0F1115"/>
+          <w:spacing w:val="0"/>
+          <w:sz w:val="24"/>
+          <w:szCs w:val="24"/>
+          <w:lang w:val="en-US"/>
+        </w:rPr>
+        <w:t>问题根源在于 AbilityTask_PlayMontageAndWait 的内部行为。该任务通过 Montage_Play 播放蒙太奇，但任务的 Activate() 执行并非同步完成，中间存在帧间隔。首次调用时，蒙太奇资源可能尚未完全流送至内存，AbilityTask 激活过程中的异步注册机制与此冲突，导致 Montage_Play 被跳过或返回 0.0f。由于 AbilityTask 不会在失败后自动重试，第一次播放就此失败，动画不显示。后续调用时资源已在内存中，播放正常。解决方案是将蓄力蒙太奇的播放与 AbilityTask 解耦，不再通过 CreatePlayMontageAndWaitTask 播放蓄力动画。蓄力过程由 UGlyphInventoryComponent 独立管理，通过 AnimInstance-&gt;Montage_Play() 直接在动画实例上同步播放蒙太奇，不依赖 AbilityTask 的异步激活流程。UGlyphInventoryComponent 封装了 PlayChargeMontage 和 StopChargeMontage 函数，分别负责蓄力蒙太奇的播放和停止。这些函数获取角色身上的 UAnimInstance 引用，直接调用 Montage_Play 和 Montage_Stop，播放时机由 TickComponent 中以绝对时间差驱动的蓄力逻辑精确控制。此方式绕过了 AbilityTask 的异步注册机制，消除了首次播放时的资源加载时序问题，使蓄力动画能够在第一次触发时即正确播放并循环。</w:t>
+      </w:r>
     </w:p>
     <w:sectPr>
       <w:footerReference r:id="rId3" w:type="default"/>

</xml_diff>